<commit_message>
feat: enhance AI agent security courseware
</commit_message>
<xml_diff>
--- a/courseweare/Lesson Plan - TGS-2025060473 - AI Security for Autonomous AI Agents.docx
+++ b/courseweare/Lesson Plan - TGS-2025060473 - AI Security for Autonomous AI Agents.docx
@@ -179,7 +179,7 @@
           <w:color w:val="1F6FEB"/>
           <w:sz w:val="24"/>
         </w:rPr>
-        <w:t>Version 2.0</w:t>
+        <w:t>Version 2.1</w:t>
       </w:r>
     </w:p>
     <w:p>
@@ -389,6 +389,64 @@
                 <w:sz w:val="19"/>
               </w:rPr>
               <w:t>Course revised and retitled to AI Security for Autonomous AI Agents. Content rebuilt around AI security for generative AI and autonomous agents (OWASP LLM Top 10 2026, OWASP ASI Top 10 2026, NIST AI RMF, MITRE ATLAS, IMDA Model AI Governance for Agentic AI, PDPA/PDPC). Five real-world case-study activities added. Assessment restructured: Written Assessment (one question per K) and Case Study (one question per LO). Accredited TSC K/A statements unchanged.</w:t>
+            </w:r>
+          </w:p>
+        </w:tc>
+        <w:tc>
+          <w:tcPr>
+            <w:tcW w:type="dxa" w:w="2160"/>
+          </w:tcPr>
+          <w:p>
+            <w:r/>
+            <w:r>
+              <w:rPr>
+                <w:sz w:val="19"/>
+              </w:rPr>
+              <w:t>Dr Alfred Ang</w:t>
+            </w:r>
+          </w:p>
+        </w:tc>
+      </w:tr>
+      <w:tr>
+        <w:tc>
+          <w:tcPr>
+            <w:tcW w:type="dxa" w:w="2160"/>
+          </w:tcPr>
+          <w:p>
+            <w:r/>
+            <w:r>
+              <w:rPr>
+                <w:sz w:val="19"/>
+              </w:rPr>
+              <w:t>2.1</w:t>
+            </w:r>
+          </w:p>
+        </w:tc>
+        <w:tc>
+          <w:tcPr>
+            <w:tcW w:type="dxa" w:w="2160"/>
+          </w:tcPr>
+          <w:p>
+            <w:r/>
+            <w:r>
+              <w:rPr>
+                <w:sz w:val="19"/>
+              </w:rPr>
+              <w:t>20 August 2026</w:t>
+            </w:r>
+          </w:p>
+        </w:tc>
+        <w:tc>
+          <w:tcPr>
+            <w:tcW w:type="dxa" w:w="2160"/>
+          </w:tcPr>
+          <w:p>
+            <w:r/>
+            <w:r>
+              <w:rPr>
+                <w:sz w:val="19"/>
+              </w:rPr>
+              <w:t>Added realistic prompt-injection practice, PDPA and organisational implementation checklists, deterministic human approval, malicious skill/plugin supply-chain controls, Responsible AI/shared responsibility and enhanced scenario visuals. Slide mappings regenerated; accredited TSC K/A statements unchanged.</w:t>
             </w:r>
           </w:p>
         </w:tc>
@@ -2115,7 +2173,7 @@
                 <w:b w:val="0"/>
                 <w:sz w:val="19"/>
               </w:rPr>
-              <w:t>LU2 T2: Prompt injection in depth — direct, indirect and cross-modal; why prompt-based defences fail (K4)</w:t>
+              <w:t>LU2 T2: Prompt injection in depth — direct, indirect, cross-modal and context-file practice; why prompt-based defences fail (K4)</w:t>
             </w:r>
           </w:p>
         </w:tc>
@@ -2815,7 +2873,7 @@
                 <w:b w:val="0"/>
                 <w:sz w:val="19"/>
               </w:rPr>
-              <w:t>LU3 T1 (cont.): Defence in depth and the four-layer control stack (K5)</w:t>
+              <w:t>LU3 T1 (cont.): Defence in depth, malicious skill/plugin supply chains and the control stack (K5)</w:t>
             </w:r>
           </w:p>
         </w:tc>
@@ -2921,7 +2979,7 @@
                 <w:b w:val="0"/>
                 <w:sz w:val="19"/>
               </w:rPr>
-              <w:t>LU3 T2: Ethical implications and societal impact — PDPA, PDPC GenAI guidelines and the IMDA Model AI Governance Framework for Agentic AI (A2)</w:t>
+              <w:t>LU3 T2: Organisational implementation — guardrails, deterministic human approval, Responsible AI/shared responsibility, PDPA/PDPC and IMDA agentic governance (A2)</w:t>
             </w:r>
           </w:p>
         </w:tc>

</xml_diff>

<commit_message>
feat: publish evidence-grounded v3 courseware
</commit_message>
<xml_diff>
--- a/courseweare/Lesson Plan - TGS-2025060473 - AI Security for Autonomous AI Agents.docx
+++ b/courseweare/Lesson Plan - TGS-2025060473 - AI Security for Autonomous AI Agents.docx
@@ -179,7 +179,7 @@
           <w:color w:val="1F6FEB"/>
           <w:sz w:val="24"/>
         </w:rPr>
-        <w:t>Version 2.1</w:t>
+        <w:t>Version 3.0</w:t>
       </w:r>
     </w:p>
     <w:p>
@@ -388,7 +388,7 @@
               <w:rPr>
                 <w:sz w:val="19"/>
               </w:rPr>
-              <w:t>Course revised and retitled to AI Security for Autonomous AI Agents. Content rebuilt around AI security for generative AI and autonomous agents (OWASP LLM Top 10 2026, OWASP ASI Top 10 2026, NIST AI RMF, MITRE ATLAS, IMDA Model AI Governance for Agentic AI, PDPA/PDPC). Five real-world case-study activities added. Assessment restructured: Written Assessment (one question per K) and Case Study (one question per LO). Accredited TSC K/A statements unchanged.</w:t>
+              <w:t>Retitled and rebuilt for generative-AI and autonomous-agent security; five activities and revised assessments added. TSC K/A text unchanged.</w:t>
             </w:r>
           </w:p>
         </w:tc>
@@ -432,6 +432,64 @@
               <w:rPr>
                 <w:sz w:val="19"/>
               </w:rPr>
+              <w:t>18 August 2026</w:t>
+            </w:r>
+          </w:p>
+        </w:tc>
+        <w:tc>
+          <w:tcPr>
+            <w:tcW w:type="dxa" w:w="2160"/>
+          </w:tcPr>
+          <w:p>
+            <w:r/>
+            <w:r>
+              <w:rPr>
+                <w:sz w:val="19"/>
+              </w:rPr>
+              <w:t>Added prompt-injection practice, PDPA and organisational checklists, human approval, skill/plugin controls and enhanced visuals. TSC K/A text unchanged.</w:t>
+            </w:r>
+          </w:p>
+        </w:tc>
+        <w:tc>
+          <w:tcPr>
+            <w:tcW w:type="dxa" w:w="2160"/>
+          </w:tcPr>
+          <w:p>
+            <w:r/>
+            <w:r>
+              <w:rPr>
+                <w:sz w:val="19"/>
+              </w:rPr>
+              <w:t>Dr Alfred Ang</w:t>
+            </w:r>
+          </w:p>
+        </w:tc>
+      </w:tr>
+      <w:tr>
+        <w:tc>
+          <w:tcPr>
+            <w:tcW w:type="dxa" w:w="2160"/>
+          </w:tcPr>
+          <w:p>
+            <w:r/>
+            <w:r>
+              <w:rPr>
+                <w:sz w:val="19"/>
+              </w:rPr>
+              <w:t>3.0</w:t>
+            </w:r>
+          </w:p>
+        </w:tc>
+        <w:tc>
+          <w:tcPr>
+            <w:tcW w:type="dxa" w:w="2160"/>
+          </w:tcPr>
+          <w:p>
+            <w:r/>
+            <w:r>
+              <w:rPr>
+                <w:sz w:val="19"/>
+              </w:rPr>
               <w:t>20 August 2026</w:t>
             </w:r>
           </w:p>
@@ -446,7 +504,7 @@
               <w:rPr>
                 <w:sz w:val="19"/>
               </w:rPr>
-              <w:t>Added realistic prompt-injection practice, PDPA and organisational implementation checklists, deterministic human approval, malicious skill/plugin supply-chain controls, Responsible AI/shared responsibility and enhanced scenario visuals. Slide mappings regenerated; accredited TSC K/A statements unchanged.</w:t>
+              <w:t>Rebuilt as a 207-slide evidence-grounded progression from AI history to product boundaries, cases, controls and governance. Activities reordered; unverified claims removed. TSC K/A text unchanged.</w:t>
             </w:r>
           </w:p>
         </w:tc>
@@ -485,22 +543,299 @@
       </w:pPr>
       <w:r>
         <w:rPr>
-          <w:b/>
-          <w:color w:val="111827"/>
-          <w:sz w:val="24"/>
+          <w:rFonts w:ascii="Arial" w:hAnsi="Arial"/>
+          <w:b w:val="0"/>
+          <w:color w:val="555B66"/>
+          <w:sz w:val="19"/>
         </w:rPr>
-        <w:t>TABLE OF CONTENTS</w:t>
+        <w:t>Generated contents for the fixed v3.0 pagination.</w:t>
       </w:r>
     </w:p>
-    <w:p>
-      <w:r>
-        <w:fldChar w:fldCharType="begin"/>
-        <w:instrText xml:space="preserve">TOC \o "1-3" \h \z \u</w:instrText>
-        <w:fldChar w:fldCharType="separate"/>
-        <w:t>Right-click and choose “Update Field”, or press F9, to build the table of contents.</w:t>
-        <w:fldChar w:fldCharType="end"/>
-      </w:r>
-    </w:p>
+    <w:tbl>
+      <w:tblPr>
+        <w:tblStyle w:val="TableGrid"/>
+        <w:tblW w:type="auto" w:w="0"/>
+        <w:tblLook w:firstColumn="1" w:firstRow="1" w:lastColumn="0" w:lastRow="0" w:noHBand="0" w:noVBand="1" w:val="04A0"/>
+      </w:tblPr>
+      <w:tblGrid>
+        <w:gridCol w:w="4320"/>
+        <w:gridCol w:w="4320"/>
+      </w:tblGrid>
+      <w:tr>
+        <w:trPr>
+          <w:cantSplit/>
+        </w:trPr>
+        <w:tc>
+          <w:tcPr>
+            <w:tcW w:type="dxa" w:w="8928"/>
+            <w:shd w:val="clear" w:color="auto" w:fill="1F6FEB"/>
+          </w:tcPr>
+          <w:p>
+            <w:pPr>
+              <w:keepNext/>
+              <w:keepLines/>
+            </w:pPr>
+            <w:r/>
+            <w:r>
+              <w:rPr>
+                <w:rFonts w:ascii="Arial" w:hAnsi="Arial"/>
+                <w:b/>
+                <w:color w:val="FFFFFF"/>
+                <w:sz w:val="20"/>
+              </w:rPr>
+              <w:t>Section</w:t>
+            </w:r>
+          </w:p>
+        </w:tc>
+        <w:tc>
+          <w:tcPr>
+            <w:tcW w:type="dxa" w:w="1368"/>
+            <w:shd w:val="clear" w:color="auto" w:fill="1F6FEB"/>
+          </w:tcPr>
+          <w:p>
+            <w:pPr>
+              <w:keepNext/>
+              <w:keepLines/>
+            </w:pPr>
+            <w:r/>
+            <w:r>
+              <w:rPr>
+                <w:rFonts w:ascii="Arial" w:hAnsi="Arial"/>
+                <w:b/>
+                <w:color w:val="FFFFFF"/>
+                <w:sz w:val="20"/>
+              </w:rPr>
+              <w:t>Page</w:t>
+            </w:r>
+          </w:p>
+        </w:tc>
+      </w:tr>
+      <w:tr>
+        <w:trPr>
+          <w:cantSplit/>
+        </w:trPr>
+        <w:tc>
+          <w:tcPr>
+            <w:tcW w:type="dxa" w:w="8928"/>
+          </w:tcPr>
+          <w:p>
+            <w:pPr>
+              <w:keepNext/>
+              <w:keepLines/>
+            </w:pPr>
+            <w:r/>
+            <w:r>
+              <w:rPr>
+                <w:rFonts w:ascii="Arial" w:hAnsi="Arial"/>
+                <w:b/>
+                <w:sz w:val="19"/>
+              </w:rPr>
+              <w:t>1. Course Overview</w:t>
+            </w:r>
+          </w:p>
+        </w:tc>
+        <w:tc>
+          <w:tcPr>
+            <w:tcW w:type="dxa" w:w="1368"/>
+          </w:tcPr>
+          <w:p>
+            <w:pPr>
+              <w:keepNext/>
+              <w:keepLines/>
+            </w:pPr>
+            <w:r/>
+            <w:r>
+              <w:rPr>
+                <w:rFonts w:ascii="Arial" w:hAnsi="Arial"/>
+                <w:b w:val="0"/>
+                <w:sz w:val="19"/>
+              </w:rPr>
+              <w:t>4</w:t>
+            </w:r>
+          </w:p>
+        </w:tc>
+      </w:tr>
+      <w:tr>
+        <w:trPr>
+          <w:cantSplit/>
+        </w:trPr>
+        <w:tc>
+          <w:tcPr>
+            <w:tcW w:type="dxa" w:w="8928"/>
+          </w:tcPr>
+          <w:p>
+            <w:pPr>
+              <w:keepNext/>
+              <w:keepLines/>
+            </w:pPr>
+            <w:r/>
+            <w:r>
+              <w:rPr>
+                <w:rFonts w:ascii="Arial" w:hAnsi="Arial"/>
+                <w:b/>
+                <w:sz w:val="19"/>
+              </w:rPr>
+              <w:t>2. Daily Schedule</w:t>
+            </w:r>
+          </w:p>
+        </w:tc>
+        <w:tc>
+          <w:tcPr>
+            <w:tcW w:type="dxa" w:w="1368"/>
+          </w:tcPr>
+          <w:p>
+            <w:pPr>
+              <w:keepNext/>
+              <w:keepLines/>
+            </w:pPr>
+            <w:r/>
+            <w:r>
+              <w:rPr>
+                <w:rFonts w:ascii="Arial" w:hAnsi="Arial"/>
+                <w:b w:val="0"/>
+                <w:sz w:val="19"/>
+              </w:rPr>
+              <w:t>6</w:t>
+            </w:r>
+          </w:p>
+        </w:tc>
+      </w:tr>
+      <w:tr>
+        <w:trPr>
+          <w:cantSplit/>
+        </w:trPr>
+        <w:tc>
+          <w:tcPr>
+            <w:tcW w:type="dxa" w:w="8928"/>
+          </w:tcPr>
+          <w:p>
+            <w:pPr>
+              <w:keepNext/>
+              <w:keepLines/>
+            </w:pPr>
+            <w:r/>
+            <w:r>
+              <w:rPr>
+                <w:rFonts w:ascii="Arial" w:hAnsi="Arial"/>
+                <w:b/>
+                <w:sz w:val="19"/>
+              </w:rPr>
+              <w:t>3. Activities</w:t>
+            </w:r>
+          </w:p>
+        </w:tc>
+        <w:tc>
+          <w:tcPr>
+            <w:tcW w:type="dxa" w:w="1368"/>
+          </w:tcPr>
+          <w:p>
+            <w:pPr>
+              <w:keepNext/>
+              <w:keepLines/>
+            </w:pPr>
+            <w:r/>
+            <w:r>
+              <w:rPr>
+                <w:rFonts w:ascii="Arial" w:hAnsi="Arial"/>
+                <w:b w:val="0"/>
+                <w:sz w:val="19"/>
+              </w:rPr>
+              <w:t>8</w:t>
+            </w:r>
+          </w:p>
+        </w:tc>
+      </w:tr>
+      <w:tr>
+        <w:trPr>
+          <w:cantSplit/>
+        </w:trPr>
+        <w:tc>
+          <w:tcPr>
+            <w:tcW w:type="dxa" w:w="8928"/>
+          </w:tcPr>
+          <w:p>
+            <w:pPr>
+              <w:keepNext/>
+              <w:keepLines/>
+            </w:pPr>
+            <w:r/>
+            <w:r>
+              <w:rPr>
+                <w:rFonts w:ascii="Arial" w:hAnsi="Arial"/>
+                <w:b/>
+                <w:sz w:val="19"/>
+              </w:rPr>
+              <w:t>4. Tools and Resources</w:t>
+            </w:r>
+          </w:p>
+        </w:tc>
+        <w:tc>
+          <w:tcPr>
+            <w:tcW w:type="dxa" w:w="1368"/>
+          </w:tcPr>
+          <w:p>
+            <w:pPr>
+              <w:keepNext/>
+              <w:keepLines/>
+            </w:pPr>
+            <w:r/>
+            <w:r>
+              <w:rPr>
+                <w:rFonts w:ascii="Arial" w:hAnsi="Arial"/>
+                <w:b w:val="0"/>
+                <w:sz w:val="19"/>
+              </w:rPr>
+              <w:t>8</w:t>
+            </w:r>
+          </w:p>
+        </w:tc>
+      </w:tr>
+      <w:tr>
+        <w:trPr>
+          <w:cantSplit/>
+        </w:trPr>
+        <w:tc>
+          <w:tcPr>
+            <w:tcW w:type="dxa" w:w="8928"/>
+          </w:tcPr>
+          <w:p>
+            <w:pPr>
+              <w:keepNext w:val="0"/>
+              <w:keepLines/>
+            </w:pPr>
+            <w:r/>
+            <w:r>
+              <w:rPr>
+                <w:rFonts w:ascii="Arial" w:hAnsi="Arial"/>
+                <w:b/>
+                <w:sz w:val="19"/>
+              </w:rPr>
+              <w:t>5. Assessment</w:t>
+            </w:r>
+          </w:p>
+        </w:tc>
+        <w:tc>
+          <w:tcPr>
+            <w:tcW w:type="dxa" w:w="1368"/>
+          </w:tcPr>
+          <w:p>
+            <w:pPr>
+              <w:keepNext w:val="0"/>
+              <w:keepLines/>
+            </w:pPr>
+            <w:r/>
+            <w:r>
+              <w:rPr>
+                <w:rFonts w:ascii="Arial" w:hAnsi="Arial"/>
+                <w:b w:val="0"/>
+                <w:sz w:val="19"/>
+              </w:rPr>
+              <w:t>9</w:t>
+            </w:r>
+          </w:p>
+        </w:tc>
+      </w:tr>
+    </w:tbl>
     <w:p>
       <w:r>
         <w:br w:type="page"/>
@@ -525,7 +860,7 @@
           <w:color w:val="111827"/>
           <w:sz w:val="22"/>
         </w:rPr>
-        <w:t>AI Security for Autonomous AI Agents is a 2 Days · 16 Hours WSQ course that equips learners to identify, analyse and mitigate the security risks introduced by generative AI systems and by autonomous AI agents. The course is delivered through real-world case studies drawn from 2026 incidents and is grounded in the current security and governance frameworks, including the OWASP Top 10 for LLM Applications (2026), the OWASP Top 10 for Agentic Applications (2026), the NIST AI Risk Management Framework, MITRE ATLAS, the IMDA Model AI Governance Framework for Agentic AI, and Singapore's PDPA together with the PDPC guidelines on personal data in generative AI.</w:t>
+        <w:t>AI Security for Autonomous AI Agents is a 2 Days · 16 Hours WSQ course that equips learners to identify, analyse and mitigate the security risks introduced by generative AI systems and by autonomous AI agents. The course uses documented cases and clearly labelled realistic simulations, grounded in current security and governance frameworks, including the OWASP Top 10 for LLM Applications (2026), the OWASP Top 10 for Agentic Applications (2026), the NIST AI Risk Management Framework, MITRE ATLAS, the IMDA Model AI Governance Framework for Agentic AI, and Singapore's PDPA and current PDPC guidance. Proposed consultation material is not presented as final law or guidance.</w:t>
       </w:r>
     </w:p>
     <w:p>
@@ -561,12 +896,19 @@
         <w:gridCol w:w="4320"/>
       </w:tblGrid>
       <w:tr>
+        <w:trPr>
+          <w:cantSplit/>
+        </w:trPr>
         <w:tc>
           <w:tcPr>
             <w:tcW w:type="dxa" w:w="2736"/>
             <w:shd w:val="clear" w:color="auto" w:fill="1F6FEB"/>
           </w:tcPr>
           <w:p>
+            <w:pPr>
+              <w:keepNext/>
+              <w:keepLines/>
+            </w:pPr>
             <w:r/>
             <w:r>
               <w:rPr>
@@ -585,6 +927,10 @@
             <w:shd w:val="clear" w:color="auto" w:fill="1F6FEB"/>
           </w:tcPr>
           <w:p>
+            <w:pPr>
+              <w:keepNext/>
+              <w:keepLines/>
+            </w:pPr>
             <w:r/>
             <w:r>
               <w:rPr>
@@ -599,11 +945,18 @@
         </w:tc>
       </w:tr>
       <w:tr>
+        <w:trPr>
+          <w:cantSplit/>
+        </w:trPr>
         <w:tc>
           <w:tcPr>
             <w:tcW w:type="dxa" w:w="2736"/>
           </w:tcPr>
           <w:p>
+            <w:pPr>
+              <w:keepNext/>
+              <w:keepLines/>
+            </w:pPr>
             <w:r/>
             <w:r>
               <w:rPr>
@@ -620,6 +973,10 @@
             <w:tcW w:type="dxa" w:w="7560"/>
           </w:tcPr>
           <w:p>
+            <w:pPr>
+              <w:keepNext/>
+              <w:keepLines/>
+            </w:pPr>
             <w:r/>
             <w:r>
               <w:rPr>
@@ -633,11 +990,18 @@
         </w:tc>
       </w:tr>
       <w:tr>
+        <w:trPr>
+          <w:cantSplit/>
+        </w:trPr>
         <w:tc>
           <w:tcPr>
             <w:tcW w:type="dxa" w:w="2736"/>
           </w:tcPr>
           <w:p>
+            <w:pPr>
+              <w:keepNext/>
+              <w:keepLines/>
+            </w:pPr>
             <w:r/>
             <w:r>
               <w:rPr>
@@ -654,6 +1018,10 @@
             <w:tcW w:type="dxa" w:w="7560"/>
           </w:tcPr>
           <w:p>
+            <w:pPr>
+              <w:keepNext/>
+              <w:keepLines/>
+            </w:pPr>
             <w:r/>
             <w:r>
               <w:rPr>
@@ -667,11 +1035,18 @@
         </w:tc>
       </w:tr>
       <w:tr>
+        <w:trPr>
+          <w:cantSplit/>
+        </w:trPr>
         <w:tc>
           <w:tcPr>
             <w:tcW w:type="dxa" w:w="2736"/>
           </w:tcPr>
           <w:p>
+            <w:pPr>
+              <w:keepNext/>
+              <w:keepLines/>
+            </w:pPr>
             <w:r/>
             <w:r>
               <w:rPr>
@@ -688,6 +1063,10 @@
             <w:tcW w:type="dxa" w:w="7560"/>
           </w:tcPr>
           <w:p>
+            <w:pPr>
+              <w:keepNext/>
+              <w:keepLines/>
+            </w:pPr>
             <w:r/>
             <w:r>
               <w:rPr>
@@ -701,11 +1080,18 @@
         </w:tc>
       </w:tr>
       <w:tr>
+        <w:trPr>
+          <w:cantSplit/>
+        </w:trPr>
         <w:tc>
           <w:tcPr>
             <w:tcW w:type="dxa" w:w="2736"/>
           </w:tcPr>
           <w:p>
+            <w:pPr>
+              <w:keepNext/>
+              <w:keepLines/>
+            </w:pPr>
             <w:r/>
             <w:r>
               <w:rPr>
@@ -722,6 +1108,10 @@
             <w:tcW w:type="dxa" w:w="7560"/>
           </w:tcPr>
           <w:p>
+            <w:pPr>
+              <w:keepNext/>
+              <w:keepLines/>
+            </w:pPr>
             <w:r/>
             <w:r>
               <w:rPr>
@@ -735,11 +1125,18 @@
         </w:tc>
       </w:tr>
       <w:tr>
+        <w:trPr>
+          <w:cantSplit/>
+        </w:trPr>
         <w:tc>
           <w:tcPr>
             <w:tcW w:type="dxa" w:w="2736"/>
           </w:tcPr>
           <w:p>
+            <w:pPr>
+              <w:keepNext/>
+              <w:keepLines/>
+            </w:pPr>
             <w:r/>
             <w:r>
               <w:rPr>
@@ -756,6 +1153,10 @@
             <w:tcW w:type="dxa" w:w="7560"/>
           </w:tcPr>
           <w:p>
+            <w:pPr>
+              <w:keepNext/>
+              <w:keepLines/>
+            </w:pPr>
             <w:r/>
             <w:r>
               <w:rPr>
@@ -769,11 +1170,18 @@
         </w:tc>
       </w:tr>
       <w:tr>
+        <w:trPr>
+          <w:cantSplit/>
+        </w:trPr>
         <w:tc>
           <w:tcPr>
             <w:tcW w:type="dxa" w:w="2736"/>
           </w:tcPr>
           <w:p>
+            <w:pPr>
+              <w:keepNext w:val="0"/>
+              <w:keepLines/>
+            </w:pPr>
             <w:r/>
             <w:r>
               <w:rPr>
@@ -790,6 +1198,10 @@
             <w:tcW w:type="dxa" w:w="7560"/>
           </w:tcPr>
           <w:p>
+            <w:pPr>
+              <w:keepNext w:val="0"/>
+              <w:keepLines/>
+            </w:pPr>
             <w:r/>
             <w:r>
               <w:rPr>
@@ -849,12 +1261,19 @@
         <w:gridCol w:w="4320"/>
       </w:tblGrid>
       <w:tr>
+        <w:trPr>
+          <w:cantSplit/>
+        </w:trPr>
         <w:tc>
           <w:tcPr>
             <w:tcW w:type="dxa" w:w="1008"/>
             <w:shd w:val="clear" w:color="auto" w:fill="1F6FEB"/>
           </w:tcPr>
           <w:p>
+            <w:pPr>
+              <w:keepNext/>
+              <w:keepLines/>
+            </w:pPr>
             <w:r/>
             <w:r>
               <w:rPr>
@@ -873,6 +1292,10 @@
             <w:shd w:val="clear" w:color="auto" w:fill="1F6FEB"/>
           </w:tcPr>
           <w:p>
+            <w:pPr>
+              <w:keepNext/>
+              <w:keepLines/>
+            </w:pPr>
             <w:r/>
             <w:r>
               <w:rPr>
@@ -887,11 +1310,18 @@
         </w:tc>
       </w:tr>
       <w:tr>
+        <w:trPr>
+          <w:cantSplit/>
+        </w:trPr>
         <w:tc>
           <w:tcPr>
             <w:tcW w:type="dxa" w:w="1008"/>
           </w:tcPr>
           <w:p>
+            <w:pPr>
+              <w:keepNext/>
+              <w:keepLines/>
+            </w:pPr>
             <w:r/>
             <w:r>
               <w:rPr>
@@ -908,6 +1338,10 @@
             <w:tcW w:type="dxa" w:w="9288"/>
           </w:tcPr>
           <w:p>
+            <w:pPr>
+              <w:keepNext/>
+              <w:keepLines/>
+            </w:pPr>
             <w:r/>
             <w:r>
               <w:rPr>
@@ -921,11 +1355,18 @@
         </w:tc>
       </w:tr>
       <w:tr>
+        <w:trPr>
+          <w:cantSplit/>
+        </w:trPr>
         <w:tc>
           <w:tcPr>
             <w:tcW w:type="dxa" w:w="1008"/>
           </w:tcPr>
           <w:p>
+            <w:pPr>
+              <w:keepNext/>
+              <w:keepLines/>
+            </w:pPr>
             <w:r/>
             <w:r>
               <w:rPr>
@@ -942,6 +1383,10 @@
             <w:tcW w:type="dxa" w:w="9288"/>
           </w:tcPr>
           <w:p>
+            <w:pPr>
+              <w:keepNext/>
+              <w:keepLines/>
+            </w:pPr>
             <w:r/>
             <w:r>
               <w:rPr>
@@ -955,11 +1400,18 @@
         </w:tc>
       </w:tr>
       <w:tr>
+        <w:trPr>
+          <w:cantSplit/>
+        </w:trPr>
         <w:tc>
           <w:tcPr>
             <w:tcW w:type="dxa" w:w="1008"/>
           </w:tcPr>
           <w:p>
+            <w:pPr>
+              <w:keepNext w:val="0"/>
+              <w:keepLines/>
+            </w:pPr>
             <w:r/>
             <w:r>
               <w:rPr>
@@ -976,6 +1428,10 @@
             <w:tcW w:type="dxa" w:w="9288"/>
           </w:tcPr>
           <w:p>
+            <w:pPr>
+              <w:keepNext w:val="0"/>
+              <w:keepLines/>
+            </w:pPr>
             <w:r/>
             <w:r>
               <w:rPr>
@@ -1008,12 +1464,19 @@
         <w:gridCol w:w="4320"/>
       </w:tblGrid>
       <w:tr>
+        <w:trPr>
+          <w:cantSplit/>
+        </w:trPr>
         <w:tc>
           <w:tcPr>
             <w:tcW w:type="dxa" w:w="1008"/>
             <w:shd w:val="clear" w:color="auto" w:fill="1F6FEB"/>
           </w:tcPr>
           <w:p>
+            <w:pPr>
+              <w:keepNext/>
+              <w:keepLines/>
+            </w:pPr>
             <w:r/>
             <w:r>
               <w:rPr>
@@ -1032,6 +1495,10 @@
             <w:shd w:val="clear" w:color="auto" w:fill="1F6FEB"/>
           </w:tcPr>
           <w:p>
+            <w:pPr>
+              <w:keepNext/>
+              <w:keepLines/>
+            </w:pPr>
             <w:r/>
             <w:r>
               <w:rPr>
@@ -1046,11 +1513,18 @@
         </w:tc>
       </w:tr>
       <w:tr>
+        <w:trPr>
+          <w:cantSplit/>
+        </w:trPr>
         <w:tc>
           <w:tcPr>
             <w:tcW w:type="dxa" w:w="1008"/>
           </w:tcPr>
           <w:p>
+            <w:pPr>
+              <w:keepNext/>
+              <w:keepLines/>
+            </w:pPr>
             <w:r/>
             <w:r>
               <w:rPr>
@@ -1067,6 +1541,10 @@
             <w:tcW w:type="dxa" w:w="9288"/>
           </w:tcPr>
           <w:p>
+            <w:pPr>
+              <w:keepNext/>
+              <w:keepLines/>
+            </w:pPr>
             <w:r/>
             <w:r>
               <w:rPr>
@@ -1080,11 +1558,18 @@
         </w:tc>
       </w:tr>
       <w:tr>
+        <w:trPr>
+          <w:cantSplit/>
+        </w:trPr>
         <w:tc>
           <w:tcPr>
             <w:tcW w:type="dxa" w:w="1008"/>
           </w:tcPr>
           <w:p>
+            <w:pPr>
+              <w:keepNext/>
+              <w:keepLines/>
+            </w:pPr>
             <w:r/>
             <w:r>
               <w:rPr>
@@ -1101,6 +1586,10 @@
             <w:tcW w:type="dxa" w:w="9288"/>
           </w:tcPr>
           <w:p>
+            <w:pPr>
+              <w:keepNext/>
+              <w:keepLines/>
+            </w:pPr>
             <w:r/>
             <w:r>
               <w:rPr>
@@ -1114,11 +1603,18 @@
         </w:tc>
       </w:tr>
       <w:tr>
+        <w:trPr>
+          <w:cantSplit/>
+        </w:trPr>
         <w:tc>
           <w:tcPr>
             <w:tcW w:type="dxa" w:w="1008"/>
           </w:tcPr>
           <w:p>
+            <w:pPr>
+              <w:keepNext/>
+              <w:keepLines/>
+            </w:pPr>
             <w:r/>
             <w:r>
               <w:rPr>
@@ -1135,6 +1631,10 @@
             <w:tcW w:type="dxa" w:w="9288"/>
           </w:tcPr>
           <w:p>
+            <w:pPr>
+              <w:keepNext/>
+              <w:keepLines/>
+            </w:pPr>
             <w:r/>
             <w:r>
               <w:rPr>
@@ -1148,11 +1648,18 @@
         </w:tc>
       </w:tr>
       <w:tr>
+        <w:trPr>
+          <w:cantSplit/>
+        </w:trPr>
         <w:tc>
           <w:tcPr>
             <w:tcW w:type="dxa" w:w="1008"/>
           </w:tcPr>
           <w:p>
+            <w:pPr>
+              <w:keepNext/>
+              <w:keepLines/>
+            </w:pPr>
             <w:r/>
             <w:r>
               <w:rPr>
@@ -1169,6 +1676,10 @@
             <w:tcW w:type="dxa" w:w="9288"/>
           </w:tcPr>
           <w:p>
+            <w:pPr>
+              <w:keepNext/>
+              <w:keepLines/>
+            </w:pPr>
             <w:r/>
             <w:r>
               <w:rPr>
@@ -1182,11 +1693,18 @@
         </w:tc>
       </w:tr>
       <w:tr>
+        <w:trPr>
+          <w:cantSplit/>
+        </w:trPr>
         <w:tc>
           <w:tcPr>
             <w:tcW w:type="dxa" w:w="1008"/>
           </w:tcPr>
           <w:p>
+            <w:pPr>
+              <w:keepNext w:val="0"/>
+              <w:keepLines/>
+            </w:pPr>
             <w:r/>
             <w:r>
               <w:rPr>
@@ -1203,6 +1721,10 @@
             <w:tcW w:type="dxa" w:w="9288"/>
           </w:tcPr>
           <w:p>
+            <w:pPr>
+              <w:keepNext w:val="0"/>
+              <w:keepLines/>
+            </w:pPr>
             <w:r/>
             <w:r>
               <w:rPr>
@@ -1235,12 +1757,19 @@
         <w:gridCol w:w="4320"/>
       </w:tblGrid>
       <w:tr>
+        <w:trPr>
+          <w:cantSplit/>
+        </w:trPr>
         <w:tc>
           <w:tcPr>
             <w:tcW w:type="dxa" w:w="1008"/>
             <w:shd w:val="clear" w:color="auto" w:fill="1F6FEB"/>
           </w:tcPr>
           <w:p>
+            <w:pPr>
+              <w:keepNext/>
+              <w:keepLines/>
+            </w:pPr>
             <w:r/>
             <w:r>
               <w:rPr>
@@ -1259,6 +1788,10 @@
             <w:shd w:val="clear" w:color="auto" w:fill="1F6FEB"/>
           </w:tcPr>
           <w:p>
+            <w:pPr>
+              <w:keepNext/>
+              <w:keepLines/>
+            </w:pPr>
             <w:r/>
             <w:r>
               <w:rPr>
@@ -1273,11 +1806,18 @@
         </w:tc>
       </w:tr>
       <w:tr>
+        <w:trPr>
+          <w:cantSplit/>
+        </w:trPr>
         <w:tc>
           <w:tcPr>
             <w:tcW w:type="dxa" w:w="1008"/>
           </w:tcPr>
           <w:p>
+            <w:pPr>
+              <w:keepNext/>
+              <w:keepLines/>
+            </w:pPr>
             <w:r/>
             <w:r>
               <w:rPr>
@@ -1294,6 +1834,10 @@
             <w:tcW w:type="dxa" w:w="9288"/>
           </w:tcPr>
           <w:p>
+            <w:pPr>
+              <w:keepNext/>
+              <w:keepLines/>
+            </w:pPr>
             <w:r/>
             <w:r>
               <w:rPr>
@@ -1307,11 +1851,18 @@
         </w:tc>
       </w:tr>
       <w:tr>
+        <w:trPr>
+          <w:cantSplit/>
+        </w:trPr>
         <w:tc>
           <w:tcPr>
             <w:tcW w:type="dxa" w:w="1008"/>
           </w:tcPr>
           <w:p>
+            <w:pPr>
+              <w:keepNext/>
+              <w:keepLines/>
+            </w:pPr>
             <w:r/>
             <w:r>
               <w:rPr>
@@ -1328,6 +1879,10 @@
             <w:tcW w:type="dxa" w:w="9288"/>
           </w:tcPr>
           <w:p>
+            <w:pPr>
+              <w:keepNext/>
+              <w:keepLines/>
+            </w:pPr>
             <w:r/>
             <w:r>
               <w:rPr>
@@ -1341,11 +1896,18 @@
         </w:tc>
       </w:tr>
       <w:tr>
+        <w:trPr>
+          <w:cantSplit/>
+        </w:trPr>
         <w:tc>
           <w:tcPr>
             <w:tcW w:type="dxa" w:w="1008"/>
           </w:tcPr>
           <w:p>
+            <w:pPr>
+              <w:keepNext/>
+              <w:keepLines/>
+            </w:pPr>
             <w:r/>
             <w:r>
               <w:rPr>
@@ -1362,6 +1924,10 @@
             <w:tcW w:type="dxa" w:w="9288"/>
           </w:tcPr>
           <w:p>
+            <w:pPr>
+              <w:keepNext/>
+              <w:keepLines/>
+            </w:pPr>
             <w:r/>
             <w:r>
               <w:rPr>
@@ -1375,11 +1941,18 @@
         </w:tc>
       </w:tr>
       <w:tr>
+        <w:trPr>
+          <w:cantSplit/>
+        </w:trPr>
         <w:tc>
           <w:tcPr>
             <w:tcW w:type="dxa" w:w="1008"/>
           </w:tcPr>
           <w:p>
+            <w:pPr>
+              <w:keepNext/>
+              <w:keepLines/>
+            </w:pPr>
             <w:r/>
             <w:r>
               <w:rPr>
@@ -1396,6 +1969,10 @@
             <w:tcW w:type="dxa" w:w="9288"/>
           </w:tcPr>
           <w:p>
+            <w:pPr>
+              <w:keepNext/>
+              <w:keepLines/>
+            </w:pPr>
             <w:r/>
             <w:r>
               <w:rPr>
@@ -1409,11 +1986,18 @@
         </w:tc>
       </w:tr>
       <w:tr>
+        <w:trPr>
+          <w:cantSplit/>
+        </w:trPr>
         <w:tc>
           <w:tcPr>
             <w:tcW w:type="dxa" w:w="1008"/>
           </w:tcPr>
           <w:p>
+            <w:pPr>
+              <w:keepNext w:val="0"/>
+              <w:keepLines/>
+            </w:pPr>
             <w:r/>
             <w:r>
               <w:rPr>
@@ -1430,6 +2014,10 @@
             <w:tcW w:type="dxa" w:w="9288"/>
           </w:tcPr>
           <w:p>
+            <w:pPr>
+              <w:keepNext w:val="0"/>
+              <w:keepLines/>
+            </w:pPr>
             <w:r/>
             <w:r>
               <w:rPr>
@@ -1489,7 +2077,7 @@
           <w:color w:val="555B66"/>
           <w:sz w:val="19"/>
         </w:rPr>
-        <w:t>Slides 1–30 of the trainer deck.</w:t>
+        <w:t>Slides 1–98 of the trainer deck.</w:t>
       </w:r>
     </w:p>
     <w:tbl>
@@ -1504,12 +2092,18 @@
         <w:gridCol w:w="2880"/>
       </w:tblGrid>
       <w:tr>
+        <w:trPr>
+          <w:cantSplit/>
+        </w:trPr>
         <w:tc>
           <w:tcPr>
             <w:tcW w:type="dxa" w:w="1656"/>
             <w:shd w:val="clear" w:color="auto" w:fill="1F6FEB"/>
           </w:tcPr>
           <w:p>
+            <w:pPr>
+              <w:keepLines/>
+            </w:pPr>
             <w:r/>
             <w:r>
               <w:rPr>
@@ -1528,6 +2122,9 @@
             <w:shd w:val="clear" w:color="auto" w:fill="1F6FEB"/>
           </w:tcPr>
           <w:p>
+            <w:pPr>
+              <w:keepLines/>
+            </w:pPr>
             <w:r/>
             <w:r>
               <w:rPr>
@@ -1546,6 +2143,9 @@
             <w:shd w:val="clear" w:color="auto" w:fill="1F6FEB"/>
           </w:tcPr>
           <w:p>
+            <w:pPr>
+              <w:keepLines/>
+            </w:pPr>
             <w:r/>
             <w:r>
               <w:rPr>
@@ -1560,12 +2160,18 @@
         </w:tc>
       </w:tr>
       <w:tr>
+        <w:trPr>
+          <w:cantSplit/>
+        </w:trPr>
         <w:tc>
           <w:tcPr>
             <w:tcW w:type="dxa" w:w="1656"/>
             <w:shd w:val="clear" w:color="auto" w:fill="F2F4F7"/>
           </w:tcPr>
           <w:p>
+            <w:pPr>
+              <w:keepLines/>
+            </w:pPr>
             <w:r/>
             <w:r>
               <w:rPr>
@@ -1573,7 +2179,7 @@
                 <w:b w:val="0"/>
                 <w:sz w:val="19"/>
               </w:rPr>
-              <w:t>9:30 – 9:45</w:t>
+              <w:t>9:30 – 9:50</w:t>
             </w:r>
           </w:p>
         </w:tc>
@@ -1583,6 +2189,9 @@
             <w:shd w:val="clear" w:color="auto" w:fill="F2F4F7"/>
           </w:tcPr>
           <w:p>
+            <w:pPr>
+              <w:keepLines/>
+            </w:pPr>
             <w:r/>
             <w:r>
               <w:rPr>
@@ -1590,7 +2199,7 @@
                 <w:b w:val="0"/>
                 <w:sz w:val="19"/>
               </w:rPr>
-              <w:t>Welcome, digital attendance (AM), introductions and ground rules</w:t>
+              <w:t>Welcome, digital attendance, introductions, learning outcomes and safe-lab boundaries</w:t>
             </w:r>
           </w:p>
         </w:tc>
@@ -1600,6 +2209,9 @@
             <w:shd w:val="clear" w:color="auto" w:fill="F2F4F7"/>
           </w:tcPr>
           <w:p>
+            <w:pPr>
+              <w:keepLines/>
+            </w:pPr>
             <w:r/>
             <w:r>
               <w:rPr>
@@ -1607,18 +2219,24 @@
                 <w:b w:val="0"/>
                 <w:sz w:val="19"/>
               </w:rPr>
-              <w:t>15 min</w:t>
+              <w:t>20 min</w:t>
             </w:r>
           </w:p>
         </w:tc>
       </w:tr>
       <w:tr>
+        <w:trPr>
+          <w:cantSplit/>
+        </w:trPr>
         <w:tc>
           <w:tcPr>
             <w:tcW w:type="dxa" w:w="1656"/>
-            <w:shd w:val="clear" w:color="auto" w:fill="F2F4F7"/>
+            <w:shd w:val="clear" w:color="auto" w:fill="E8F0FE"/>
           </w:tcPr>
           <w:p>
+            <w:pPr>
+              <w:keepLines/>
+            </w:pPr>
             <w:r/>
             <w:r>
               <w:rPr>
@@ -1626,60 +2244,7 @@
                 <w:b w:val="0"/>
                 <w:sz w:val="19"/>
               </w:rPr>
-              <w:t>9:45 – 10:00</w:t>
-            </w:r>
-          </w:p>
-        </w:tc>
-        <w:tc>
-          <w:tcPr>
-            <w:tcW w:type="dxa" w:w="7416"/>
-            <w:shd w:val="clear" w:color="auto" w:fill="F2F4F7"/>
-          </w:tcPr>
-          <w:p>
-            <w:r/>
-            <w:r>
-              <w:rPr>
-                <w:rFonts w:ascii="Arial" w:hAnsi="Arial"/>
-                <w:b w:val="0"/>
-                <w:sz w:val="19"/>
-              </w:rPr>
-              <w:t>Course overview, learning outcomes and assessment briefing</w:t>
-            </w:r>
-          </w:p>
-        </w:tc>
-        <w:tc>
-          <w:tcPr>
-            <w:tcW w:type="dxa" w:w="1224"/>
-            <w:shd w:val="clear" w:color="auto" w:fill="F2F4F7"/>
-          </w:tcPr>
-          <w:p>
-            <w:r/>
-            <w:r>
-              <w:rPr>
-                <w:rFonts w:ascii="Arial" w:hAnsi="Arial"/>
-                <w:b w:val="0"/>
-                <w:sz w:val="19"/>
-              </w:rPr>
-              <w:t>15 min</w:t>
-            </w:r>
-          </w:p>
-        </w:tc>
-      </w:tr>
-      <w:tr>
-        <w:tc>
-          <w:tcPr>
-            <w:tcW w:type="dxa" w:w="1656"/>
-            <w:shd w:val="clear" w:color="auto" w:fill="E8F0FE"/>
-          </w:tcPr>
-          <w:p>
-            <w:r/>
-            <w:r>
-              <w:rPr>
-                <w:rFonts w:ascii="Arial" w:hAnsi="Arial"/>
-                <w:b w:val="0"/>
-                <w:sz w:val="19"/>
-              </w:rPr>
-              <w:t>10:00 – 10:45</w:t>
+              <w:t>9:50 – 10:35</w:t>
             </w:r>
           </w:p>
         </w:tc>
@@ -1689,6 +2254,9 @@
             <w:shd w:val="clear" w:color="auto" w:fill="E8F0FE"/>
           </w:tcPr>
           <w:p>
+            <w:pPr>
+              <w:keepLines/>
+            </w:pPr>
             <w:r/>
             <w:r>
               <w:rPr>
@@ -1696,7 +2264,7 @@
                 <w:b w:val="0"/>
                 <w:sz w:val="19"/>
               </w:rPr>
-              <w:t>LU1 T1: The AI security threat landscape — why generative AI breaks classical security assumptions (K2)</w:t>
+              <w:t>AI history: symbolic systems, machine learning, deep learning, transformers and instruction following (K2)</w:t>
             </w:r>
           </w:p>
         </w:tc>
@@ -1706,6 +2274,9 @@
             <w:shd w:val="clear" w:color="auto" w:fill="E8F0FE"/>
           </w:tcPr>
           <w:p>
+            <w:pPr>
+              <w:keepLines/>
+            </w:pPr>
             <w:r/>
             <w:r>
               <w:rPr>
@@ -1719,12 +2290,18 @@
         </w:tc>
       </w:tr>
       <w:tr>
+        <w:trPr>
+          <w:cantSplit/>
+        </w:trPr>
         <w:tc>
           <w:tcPr>
             <w:tcW w:type="dxa" w:w="1656"/>
             <w:shd w:val="clear" w:color="auto" w:fill="FDF3E3"/>
           </w:tcPr>
           <w:p>
+            <w:pPr>
+              <w:keepLines/>
+            </w:pPr>
             <w:r/>
             <w:r>
               <w:rPr>
@@ -1732,7 +2309,7 @@
                 <w:b w:val="0"/>
                 <w:sz w:val="19"/>
               </w:rPr>
-              <w:t>10:45 – 11:00</w:t>
+              <w:t>10:35 – 10:50</w:t>
             </w:r>
           </w:p>
         </w:tc>
@@ -1742,6 +2319,9 @@
             <w:shd w:val="clear" w:color="auto" w:fill="FDF3E3"/>
           </w:tcPr>
           <w:p>
+            <w:pPr>
+              <w:keepLines/>
+            </w:pPr>
             <w:r/>
             <w:r>
               <w:rPr>
@@ -1759,6 +2339,9 @@
             <w:shd w:val="clear" w:color="auto" w:fill="FDF3E3"/>
           </w:tcPr>
           <w:p>
+            <w:pPr>
+              <w:keepLines/>
+            </w:pPr>
             <w:r/>
             <w:r>
               <w:rPr>
@@ -1772,12 +2355,18 @@
         </w:tc>
       </w:tr>
       <w:tr>
+        <w:trPr>
+          <w:cantSplit/>
+        </w:trPr>
         <w:tc>
           <w:tcPr>
             <w:tcW w:type="dxa" w:w="1656"/>
             <w:shd w:val="clear" w:color="auto" w:fill="E8F0FE"/>
           </w:tcPr>
           <w:p>
+            <w:pPr>
+              <w:keepLines/>
+            </w:pPr>
             <w:r/>
             <w:r>
               <w:rPr>
@@ -1785,7 +2374,7 @@
                 <w:b w:val="0"/>
                 <w:sz w:val="19"/>
               </w:rPr>
-              <w:t>11:00 – 11:45</w:t>
+              <w:t>10:50 – 11:35</w:t>
             </w:r>
           </w:p>
         </w:tc>
@@ -1795,6 +2384,9 @@
             <w:shd w:val="clear" w:color="auto" w:fill="E8F0FE"/>
           </w:tcPr>
           <w:p>
+            <w:pPr>
+              <w:keepLines/>
+            </w:pPr>
             <w:r/>
             <w:r>
               <w:rPr>
@@ -1802,7 +2394,7 @@
                 <w:b w:val="0"/>
                 <w:sz w:val="19"/>
               </w:rPr>
-              <w:t>LU1 T1 (cont.): The context window has no trust boundary; prompt injection as an architectural property (K2)</w:t>
+              <w:t>Generative AI, agentic behaviour and deployed AI agents as overlapping operating layers (K2, K3)</w:t>
             </w:r>
           </w:p>
         </w:tc>
@@ -1812,6 +2404,9 @@
             <w:shd w:val="clear" w:color="auto" w:fill="E8F0FE"/>
           </w:tcPr>
           <w:p>
+            <w:pPr>
+              <w:keepLines/>
+            </w:pPr>
             <w:r/>
             <w:r>
               <w:rPr>
@@ -1825,12 +2420,18 @@
         </w:tc>
       </w:tr>
       <w:tr>
+        <w:trPr>
+          <w:cantSplit/>
+        </w:trPr>
         <w:tc>
           <w:tcPr>
             <w:tcW w:type="dxa" w:w="1656"/>
             <w:shd w:val="clear" w:color="auto" w:fill="E8F0FE"/>
           </w:tcPr>
           <w:p>
+            <w:pPr>
+              <w:keepLines/>
+            </w:pPr>
             <w:r/>
             <w:r>
               <w:rPr>
@@ -1838,7 +2439,7 @@
                 <w:b w:val="0"/>
                 <w:sz w:val="19"/>
               </w:rPr>
-              <w:t>11:45 – 12:30</w:t>
+              <w:t>11:35 – 12:30</w:t>
             </w:r>
           </w:p>
         </w:tc>
@@ -1848,6 +2449,9 @@
             <w:shd w:val="clear" w:color="auto" w:fill="E8F0FE"/>
           </w:tcPr>
           <w:p>
+            <w:pPr>
+              <w:keepLines/>
+            </w:pPr>
             <w:r/>
             <w:r>
               <w:rPr>
@@ -1855,7 +2459,7 @@
                 <w:b w:val="0"/>
                 <w:sz w:val="19"/>
               </w:rPr>
-              <w:t>LU1 T2: Generative vs discriminative models — the guardrail classifier pattern and its limits (K3)</w:t>
+              <w:t>Strengths, weaknesses and examples: OpenClaw, Hermes, Claude Code, Codex, ChatGPT Work, DeepSeek model/harness and evidence gates</w:t>
             </w:r>
           </w:p>
         </w:tc>
@@ -1865,6 +2469,9 @@
             <w:shd w:val="clear" w:color="auto" w:fill="E8F0FE"/>
           </w:tcPr>
           <w:p>
+            <w:pPr>
+              <w:keepLines/>
+            </w:pPr>
             <w:r/>
             <w:r>
               <w:rPr>
@@ -1872,18 +2479,24 @@
                 <w:b w:val="0"/>
                 <w:sz w:val="19"/>
               </w:rPr>
-              <w:t>45 min</w:t>
+              <w:t>55 min</w:t>
             </w:r>
           </w:p>
         </w:tc>
       </w:tr>
       <w:tr>
+        <w:trPr>
+          <w:cantSplit/>
+        </w:trPr>
         <w:tc>
           <w:tcPr>
             <w:tcW w:type="dxa" w:w="1656"/>
             <w:shd w:val="clear" w:color="auto" w:fill="FDF3E3"/>
           </w:tcPr>
           <w:p>
+            <w:pPr>
+              <w:keepLines/>
+            </w:pPr>
             <w:r/>
             <w:r>
               <w:rPr>
@@ -1901,6 +2514,9 @@
             <w:shd w:val="clear" w:color="auto" w:fill="FDF3E3"/>
           </w:tcPr>
           <w:p>
+            <w:pPr>
+              <w:keepLines/>
+            </w:pPr>
             <w:r/>
             <w:r>
               <w:rPr>
@@ -1918,6 +2534,9 @@
             <w:shd w:val="clear" w:color="auto" w:fill="FDF3E3"/>
           </w:tcPr>
           <w:p>
+            <w:pPr>
+              <w:keepLines/>
+            </w:pPr>
             <w:r/>
             <w:r>
               <w:rPr>
@@ -1931,12 +2550,18 @@
         </w:tc>
       </w:tr>
       <w:tr>
+        <w:trPr>
+          <w:cantSplit/>
+        </w:trPr>
         <w:tc>
           <w:tcPr>
             <w:tcW w:type="dxa" w:w="1656"/>
             <w:shd w:val="clear" w:color="auto" w:fill="E8F0FE"/>
           </w:tcPr>
           <w:p>
+            <w:pPr>
+              <w:keepLines/>
+            </w:pPr>
             <w:r/>
             <w:r>
               <w:rPr>
@@ -1954,6 +2579,9 @@
             <w:shd w:val="clear" w:color="auto" w:fill="E8F0FE"/>
           </w:tcPr>
           <w:p>
+            <w:pPr>
+              <w:keepLines/>
+            </w:pPr>
             <w:r/>
             <w:r>
               <w:rPr>
@@ -1961,7 +2589,7 @@
                 <w:b w:val="0"/>
                 <w:sz w:val="19"/>
               </w:rPr>
-              <w:t>LU1 T3: Application modes as attack surfaces — summarisation, inference, reasoning, transformation, augmentation (A4)</w:t>
+              <w:t>Capability, data, token, code-execution, skill/plugin/MCP, network and approval matrices</w:t>
             </w:r>
           </w:p>
         </w:tc>
@@ -1971,6 +2599,9 @@
             <w:shd w:val="clear" w:color="auto" w:fill="E8F0FE"/>
           </w:tcPr>
           <w:p>
+            <w:pPr>
+              <w:keepLines/>
+            </w:pPr>
             <w:r/>
             <w:r>
               <w:rPr>
@@ -1984,12 +2615,18 @@
         </w:tc>
       </w:tr>
       <w:tr>
+        <w:trPr>
+          <w:cantSplit/>
+        </w:trPr>
         <w:tc>
           <w:tcPr>
             <w:tcW w:type="dxa" w:w="1656"/>
-            <w:shd w:val="clear" w:color="auto" w:fill="E6F7F1"/>
+            <w:shd w:val="clear" w:color="auto" w:fill="E8F0FE"/>
           </w:tcPr>
           <w:p>
+            <w:pPr>
+              <w:keepLines/>
+            </w:pPr>
             <w:r/>
             <w:r>
               <w:rPr>
@@ -2004,9 +2641,77 @@
         <w:tc>
           <w:tcPr>
             <w:tcW w:type="dxa" w:w="7416"/>
+            <w:shd w:val="clear" w:color="auto" w:fill="E8F0FE"/>
+          </w:tcPr>
+          <w:p>
+            <w:pPr>
+              <w:keepLines/>
+            </w:pPr>
+            <w:r/>
+            <w:r>
+              <w:rPr>
+                <w:rFonts w:ascii="Arial" w:hAnsi="Arial"/>
+                <w:b w:val="0"/>
+                <w:sz w:val="19"/>
+              </w:rPr>
+              <w:t>Threat modelling: assets, actors, trust boundaries, authority paths and abuse cases (K1, K5)</w:t>
+            </w:r>
+          </w:p>
+        </w:tc>
+        <w:tc>
+          <w:tcPr>
+            <w:tcW w:type="dxa" w:w="1224"/>
+            <w:shd w:val="clear" w:color="auto" w:fill="E8F0FE"/>
+          </w:tcPr>
+          <w:p>
+            <w:pPr>
+              <w:keepLines/>
+            </w:pPr>
+            <w:r/>
+            <w:r>
+              <w:rPr>
+                <w:rFonts w:ascii="Arial" w:hAnsi="Arial"/>
+                <w:b w:val="0"/>
+                <w:sz w:val="19"/>
+              </w:rPr>
+              <w:t>45 min</w:t>
+            </w:r>
+          </w:p>
+        </w:tc>
+      </w:tr>
+      <w:tr>
+        <w:trPr>
+          <w:cantSplit/>
+        </w:trPr>
+        <w:tc>
+          <w:tcPr>
+            <w:tcW w:type="dxa" w:w="1656"/>
             <w:shd w:val="clear" w:color="auto" w:fill="E6F7F1"/>
           </w:tcPr>
           <w:p>
+            <w:pPr>
+              <w:keepLines/>
+            </w:pPr>
+            <w:r/>
+            <w:r>
+              <w:rPr>
+                <w:rFonts w:ascii="Arial" w:hAnsi="Arial"/>
+                <w:b w:val="0"/>
+                <w:sz w:val="19"/>
+              </w:rPr>
+              <w:t>3:00 – 3:45</w:t>
+            </w:r>
+          </w:p>
+        </w:tc>
+        <w:tc>
+          <w:tcPr>
+            <w:tcW w:type="dxa" w:w="7416"/>
+            <w:shd w:val="clear" w:color="auto" w:fill="E6F7F1"/>
+          </w:tcPr>
+          <w:p>
+            <w:pPr>
+              <w:keepLines/>
+            </w:pPr>
             <w:r/>
             <w:r>
               <w:rPr>
@@ -2024,6 +2729,9 @@
             <w:shd w:val="clear" w:color="auto" w:fill="E6F7F1"/>
           </w:tcPr>
           <w:p>
+            <w:pPr>
+              <w:keepLines/>
+            </w:pPr>
             <w:r/>
             <w:r>
               <w:rPr>
@@ -2037,65 +2745,18 @@
         </w:tc>
       </w:tr>
       <w:tr>
-        <w:tc>
-          <w:tcPr>
-            <w:tcW w:type="dxa" w:w="1656"/>
-            <w:shd w:val="clear" w:color="auto" w:fill="E8F0FE"/>
-          </w:tcPr>
-          <w:p>
-            <w:r/>
-            <w:r>
-              <w:rPr>
-                <w:rFonts w:ascii="Arial" w:hAnsi="Arial"/>
-                <w:b w:val="0"/>
-                <w:sz w:val="19"/>
-              </w:rPr>
-              <w:t>3:00 – 3:45</w:t>
-            </w:r>
-          </w:p>
-        </w:tc>
-        <w:tc>
-          <w:tcPr>
-            <w:tcW w:type="dxa" w:w="7416"/>
-            <w:shd w:val="clear" w:color="auto" w:fill="E8F0FE"/>
-          </w:tcPr>
-          <w:p>
-            <w:r/>
-            <w:r>
-              <w:rPr>
-                <w:rFonts w:ascii="Arial" w:hAnsi="Arial"/>
-                <w:b w:val="0"/>
-                <w:sz w:val="19"/>
-              </w:rPr>
-              <w:t>LU2 T1: Data quality, preprocessing and the model pipeline — poisoning across training, RAG, memory and artifacts (K1)</w:t>
-            </w:r>
-          </w:p>
-        </w:tc>
-        <w:tc>
-          <w:tcPr>
-            <w:tcW w:type="dxa" w:w="1224"/>
-            <w:shd w:val="clear" w:color="auto" w:fill="E8F0FE"/>
-          </w:tcPr>
-          <w:p>
-            <w:r/>
-            <w:r>
-              <w:rPr>
-                <w:rFonts w:ascii="Arial" w:hAnsi="Arial"/>
-                <w:b w:val="0"/>
-                <w:sz w:val="19"/>
-              </w:rPr>
-              <w:t>45 min</w:t>
-            </w:r>
-          </w:p>
-        </w:tc>
-      </w:tr>
-      <w:tr>
+        <w:trPr>
+          <w:cantSplit/>
+        </w:trPr>
         <w:tc>
           <w:tcPr>
             <w:tcW w:type="dxa" w:w="1656"/>
             <w:shd w:val="clear" w:color="auto" w:fill="FDF3E3"/>
           </w:tcPr>
           <w:p>
+            <w:pPr>
+              <w:keepLines/>
+            </w:pPr>
             <w:r/>
             <w:r>
               <w:rPr>
@@ -2113,6 +2774,9 @@
             <w:shd w:val="clear" w:color="auto" w:fill="FDF3E3"/>
           </w:tcPr>
           <w:p>
+            <w:pPr>
+              <w:keepLines/>
+            </w:pPr>
             <w:r/>
             <w:r>
               <w:rPr>
@@ -2130,6 +2794,9 @@
             <w:shd w:val="clear" w:color="auto" w:fill="FDF3E3"/>
           </w:tcPr>
           <w:p>
+            <w:pPr>
+              <w:keepLines/>
+            </w:pPr>
             <w:r/>
             <w:r>
               <w:rPr>
@@ -2143,12 +2810,18 @@
         </w:tc>
       </w:tr>
       <w:tr>
+        <w:trPr>
+          <w:cantSplit/>
+        </w:trPr>
         <w:tc>
           <w:tcPr>
             <w:tcW w:type="dxa" w:w="1656"/>
             <w:shd w:val="clear" w:color="auto" w:fill="E8F0FE"/>
           </w:tcPr>
           <w:p>
+            <w:pPr>
+              <w:keepLines/>
+            </w:pPr>
             <w:r/>
             <w:r>
               <w:rPr>
@@ -2166,6 +2839,9 @@
             <w:shd w:val="clear" w:color="auto" w:fill="E8F0FE"/>
           </w:tcPr>
           <w:p>
+            <w:pPr>
+              <w:keepLines/>
+            </w:pPr>
             <w:r/>
             <w:r>
               <w:rPr>
@@ -2173,7 +2849,7 @@
                 <w:b w:val="0"/>
                 <w:sz w:val="19"/>
               </w:rPr>
-              <w:t>LU2 T2: Prompt injection in depth — direct, indirect, cross-modal and context-file practice; why prompt-based defences fail (K4)</w:t>
+              <w:t>Attack surfaces by operating layer: content, state, identity, tools, runtime and network</w:t>
             </w:r>
           </w:p>
         </w:tc>
@@ -2183,6 +2859,9 @@
             <w:shd w:val="clear" w:color="auto" w:fill="E8F0FE"/>
           </w:tcPr>
           <w:p>
+            <w:pPr>
+              <w:keepLines/>
+            </w:pPr>
             <w:r/>
             <w:r>
               <w:rPr>
@@ -2196,12 +2875,18 @@
         </w:tc>
       </w:tr>
       <w:tr>
+        <w:trPr>
+          <w:cantSplit/>
+        </w:trPr>
         <w:tc>
           <w:tcPr>
             <w:tcW w:type="dxa" w:w="1656"/>
-            <w:shd w:val="clear" w:color="auto" w:fill="E6F7F1"/>
+            <w:shd w:val="clear" w:color="auto" w:fill="E8F0FE"/>
           </w:tcPr>
           <w:p>
+            <w:pPr>
+              <w:keepLines/>
+            </w:pPr>
             <w:r/>
             <w:r>
               <w:rPr>
@@ -2209,16 +2894,19 @@
                 <w:b w:val="0"/>
                 <w:sz w:val="19"/>
               </w:rPr>
-              <w:t>4:45 – 5:45</w:t>
+              <w:t>4:45 – 5:30</w:t>
             </w:r>
           </w:p>
         </w:tc>
         <w:tc>
           <w:tcPr>
             <w:tcW w:type="dxa" w:w="7416"/>
-            <w:shd w:val="clear" w:color="auto" w:fill="E6F7F1"/>
+            <w:shd w:val="clear" w:color="auto" w:fill="E8F0FE"/>
           </w:tcPr>
           <w:p>
+            <w:pPr>
+              <w:keepLines/>
+            </w:pPr>
             <w:r/>
             <w:r>
               <w:rPr>
@@ -2226,16 +2914,19 @@
                 <w:b w:val="0"/>
                 <w:sz w:val="19"/>
               </w:rPr>
-              <w:t>Activity 2: Prompt Injection and the PDPA-Reportable Leak (K4, K1)</w:t>
+              <w:t>Complete attack chains, source-to-sink reasoning and evidence classification</w:t>
             </w:r>
           </w:p>
         </w:tc>
         <w:tc>
           <w:tcPr>
             <w:tcW w:type="dxa" w:w="1224"/>
-            <w:shd w:val="clear" w:color="auto" w:fill="E6F7F1"/>
+            <w:shd w:val="clear" w:color="auto" w:fill="E8F0FE"/>
           </w:tcPr>
           <w:p>
+            <w:pPr>
+              <w:keepLines/>
+            </w:pPr>
             <w:r/>
             <w:r>
               <w:rPr>
@@ -2243,18 +2934,24 @@
                 <w:b w:val="0"/>
                 <w:sz w:val="19"/>
               </w:rPr>
-              <w:t>60 min</w:t>
+              <w:t>45 min</w:t>
             </w:r>
           </w:p>
         </w:tc>
       </w:tr>
       <w:tr>
+        <w:trPr>
+          <w:cantSplit/>
+        </w:trPr>
         <w:tc>
           <w:tcPr>
             <w:tcW w:type="dxa" w:w="1656"/>
-            <w:shd w:val="clear" w:color="auto" w:fill="E6F7F1"/>
+            <w:shd w:val="clear" w:color="auto" w:fill="E8F0FE"/>
           </w:tcPr>
           <w:p>
+            <w:pPr>
+              <w:keepLines/>
+            </w:pPr>
             <w:r/>
             <w:r>
               <w:rPr>
@@ -2262,16 +2959,19 @@
                 <w:b w:val="0"/>
                 <w:sz w:val="19"/>
               </w:rPr>
-              <w:t>5:45 – 6:15</w:t>
+              <w:t>5:30 – 6:15</w:t>
             </w:r>
           </w:p>
         </w:tc>
         <w:tc>
           <w:tcPr>
             <w:tcW w:type="dxa" w:w="7416"/>
-            <w:shd w:val="clear" w:color="auto" w:fill="E6F7F1"/>
+            <w:shd w:val="clear" w:color="auto" w:fill="E8F0FE"/>
           </w:tcPr>
           <w:p>
+            <w:pPr>
+              <w:keepLines/>
+            </w:pPr>
             <w:r/>
             <w:r>
               <w:rPr>
@@ -2279,16 +2979,19 @@
                 <w:b w:val="0"/>
                 <w:sz w:val="19"/>
               </w:rPr>
-              <w:t>Activity 2 debrief — notification decision and prioritised controls</w:t>
+              <w:t>Integrated risk matrix and preview of structural controls, approvals and evidence</w:t>
             </w:r>
           </w:p>
         </w:tc>
         <w:tc>
           <w:tcPr>
             <w:tcW w:type="dxa" w:w="1224"/>
-            <w:shd w:val="clear" w:color="auto" w:fill="E6F7F1"/>
+            <w:shd w:val="clear" w:color="auto" w:fill="E8F0FE"/>
           </w:tcPr>
           <w:p>
+            <w:pPr>
+              <w:keepLines/>
+            </w:pPr>
             <w:r/>
             <w:r>
               <w:rPr>
@@ -2296,18 +2999,24 @@
                 <w:b w:val="0"/>
                 <w:sz w:val="19"/>
               </w:rPr>
-              <w:t>30 min</w:t>
+              <w:t>45 min</w:t>
             </w:r>
           </w:p>
         </w:tc>
       </w:tr>
       <w:tr>
+        <w:trPr>
+          <w:cantSplit/>
+        </w:trPr>
         <w:tc>
           <w:tcPr>
             <w:tcW w:type="dxa" w:w="1656"/>
             <w:shd w:val="clear" w:color="auto" w:fill="F2F4F7"/>
           </w:tcPr>
           <w:p>
+            <w:pPr>
+              <w:keepLines/>
+            </w:pPr>
             <w:r/>
             <w:r>
               <w:rPr>
@@ -2325,6 +3034,9 @@
             <w:shd w:val="clear" w:color="auto" w:fill="F2F4F7"/>
           </w:tcPr>
           <w:p>
+            <w:pPr>
+              <w:keepLines/>
+            </w:pPr>
             <w:r/>
             <w:r>
               <w:rPr>
@@ -2342,6 +3054,9 @@
             <w:shd w:val="clear" w:color="auto" w:fill="F2F4F7"/>
           </w:tcPr>
           <w:p>
+            <w:pPr>
+              <w:keepLines/>
+            </w:pPr>
             <w:r/>
             <w:r>
               <w:rPr>
@@ -2383,6 +3098,11 @@
       </w:r>
     </w:p>
     <w:p>
+      <w:r>
+        <w:br w:type="page"/>
+      </w:r>
+    </w:p>
+    <w:p>
       <w:pPr>
         <w:pStyle w:val="Heading2"/>
       </w:pPr>
@@ -2401,7 +3121,7 @@
           <w:color w:val="555B66"/>
           <w:sz w:val="19"/>
         </w:rPr>
-        <w:t>Slides 31–64 of the trainer deck.</w:t>
+        <w:t>Slides 99–207 of the trainer deck.</w:t>
       </w:r>
     </w:p>
     <w:tbl>
@@ -2416,12 +3136,18 @@
         <w:gridCol w:w="2880"/>
       </w:tblGrid>
       <w:tr>
+        <w:trPr>
+          <w:cantSplit/>
+        </w:trPr>
         <w:tc>
           <w:tcPr>
             <w:tcW w:type="dxa" w:w="1656"/>
             <w:shd w:val="clear" w:color="auto" w:fill="1F6FEB"/>
           </w:tcPr>
           <w:p>
+            <w:pPr>
+              <w:keepLines/>
+            </w:pPr>
             <w:r/>
             <w:r>
               <w:rPr>
@@ -2440,6 +3166,9 @@
             <w:shd w:val="clear" w:color="auto" w:fill="1F6FEB"/>
           </w:tcPr>
           <w:p>
+            <w:pPr>
+              <w:keepLines/>
+            </w:pPr>
             <w:r/>
             <w:r>
               <w:rPr>
@@ -2458,6 +3187,9 @@
             <w:shd w:val="clear" w:color="auto" w:fill="1F6FEB"/>
           </w:tcPr>
           <w:p>
+            <w:pPr>
+              <w:keepLines/>
+            </w:pPr>
             <w:r/>
             <w:r>
               <w:rPr>
@@ -2472,12 +3204,18 @@
         </w:tc>
       </w:tr>
       <w:tr>
+        <w:trPr>
+          <w:cantSplit/>
+        </w:trPr>
         <w:tc>
           <w:tcPr>
             <w:tcW w:type="dxa" w:w="1656"/>
             <w:shd w:val="clear" w:color="auto" w:fill="F2F4F7"/>
           </w:tcPr>
           <w:p>
+            <w:pPr>
+              <w:keepLines/>
+            </w:pPr>
             <w:r/>
             <w:r>
               <w:rPr>
@@ -2495,6 +3233,9 @@
             <w:shd w:val="clear" w:color="auto" w:fill="F2F4F7"/>
           </w:tcPr>
           <w:p>
+            <w:pPr>
+              <w:keepLines/>
+            </w:pPr>
             <w:r/>
             <w:r>
               <w:rPr>
@@ -2512,6 +3253,9 @@
             <w:shd w:val="clear" w:color="auto" w:fill="F2F4F7"/>
           </w:tcPr>
           <w:p>
+            <w:pPr>
+              <w:keepLines/>
+            </w:pPr>
             <w:r/>
             <w:r>
               <w:rPr>
@@ -2525,12 +3269,18 @@
         </w:tc>
       </w:tr>
       <w:tr>
+        <w:trPr>
+          <w:cantSplit/>
+        </w:trPr>
         <w:tc>
           <w:tcPr>
             <w:tcW w:type="dxa" w:w="1656"/>
             <w:shd w:val="clear" w:color="auto" w:fill="E8F0FE"/>
           </w:tcPr>
           <w:p>
+            <w:pPr>
+              <w:keepLines/>
+            </w:pPr>
             <w:r/>
             <w:r>
               <w:rPr>
@@ -2538,7 +3288,7 @@
                 <w:b w:val="0"/>
                 <w:sz w:val="19"/>
               </w:rPr>
-              <w:t>9:40 – 10:25</w:t>
+              <w:t>9:40 – 10:00</w:t>
             </w:r>
           </w:p>
         </w:tc>
@@ -2548,6 +3298,9 @@
             <w:shd w:val="clear" w:color="auto" w:fill="E8F0FE"/>
           </w:tcPr>
           <w:p>
+            <w:pPr>
+              <w:keepLines/>
+            </w:pPr>
             <w:r/>
             <w:r>
               <w:rPr>
@@ -2555,7 +3308,7 @@
                 <w:b w:val="0"/>
                 <w:sz w:val="19"/>
               </w:rPr>
-              <w:t>LU2 T3: Security frameworks for generative AI and agents — OWASP LLM Top 10 2026, OWASP ASI Top 10 2026, NIST AI RMF, MITRE ATLAS, IMDA and the PDPA (A3)</w:t>
+              <w:t>Prompt injection, jailbreaks, injection carriers and structural control principles (K4)</w:t>
             </w:r>
           </w:p>
         </w:tc>
@@ -2565,6 +3318,9 @@
             <w:shd w:val="clear" w:color="auto" w:fill="E8F0FE"/>
           </w:tcPr>
           <w:p>
+            <w:pPr>
+              <w:keepLines/>
+            </w:pPr>
             <w:r/>
             <w:r>
               <w:rPr>
@@ -2572,18 +3328,24 @@
                 <w:b w:val="0"/>
                 <w:sz w:val="19"/>
               </w:rPr>
-              <w:t>45 min</w:t>
+              <w:t>20 min</w:t>
             </w:r>
           </w:p>
         </w:tc>
       </w:tr>
       <w:tr>
+        <w:trPr>
+          <w:cantSplit/>
+        </w:trPr>
         <w:tc>
           <w:tcPr>
             <w:tcW w:type="dxa" w:w="1656"/>
-            <w:shd w:val="clear" w:color="auto" w:fill="E8F0FE"/>
+            <w:shd w:val="clear" w:color="auto" w:fill="E6F7F1"/>
           </w:tcPr>
           <w:p>
+            <w:pPr>
+              <w:keepLines/>
+            </w:pPr>
             <w:r/>
             <w:r>
               <w:rPr>
@@ -2591,16 +3353,19 @@
                 <w:b w:val="0"/>
                 <w:sz w:val="19"/>
               </w:rPr>
-              <w:t>10:25 – 11:00</w:t>
+              <w:t>10:00 – 11:00</w:t>
             </w:r>
           </w:p>
         </w:tc>
         <w:tc>
           <w:tcPr>
             <w:tcW w:type="dxa" w:w="7416"/>
-            <w:shd w:val="clear" w:color="auto" w:fill="E8F0FE"/>
+            <w:shd w:val="clear" w:color="auto" w:fill="E6F7F1"/>
           </w:tcPr>
           <w:p>
+            <w:pPr>
+              <w:keepLines/>
+            </w:pPr>
             <w:r/>
             <w:r>
               <w:rPr>
@@ -2608,16 +3373,19 @@
                 <w:b w:val="0"/>
                 <w:sz w:val="19"/>
               </w:rPr>
-              <w:t>LU2 T4: Measuring whether a guardrail works — attack success rate, refusal rate, false-positive rate across prompt variants (A5)</w:t>
+              <w:t>Activity 2: Prompt Injection and the PDPA Breach Decision (K4, K1)</w:t>
             </w:r>
           </w:p>
         </w:tc>
         <w:tc>
           <w:tcPr>
             <w:tcW w:type="dxa" w:w="1224"/>
-            <w:shd w:val="clear" w:color="auto" w:fill="E8F0FE"/>
+            <w:shd w:val="clear" w:color="auto" w:fill="E6F7F1"/>
           </w:tcPr>
           <w:p>
+            <w:pPr>
+              <w:keepLines/>
+            </w:pPr>
             <w:r/>
             <w:r>
               <w:rPr>
@@ -2625,18 +3393,24 @@
                 <w:b w:val="0"/>
                 <w:sz w:val="19"/>
               </w:rPr>
-              <w:t>35 min</w:t>
+              <w:t>60 min</w:t>
             </w:r>
           </w:p>
         </w:tc>
       </w:tr>
       <w:tr>
+        <w:trPr>
+          <w:cantSplit/>
+        </w:trPr>
         <w:tc>
           <w:tcPr>
             <w:tcW w:type="dxa" w:w="1656"/>
             <w:shd w:val="clear" w:color="auto" w:fill="FDF3E3"/>
           </w:tcPr>
           <w:p>
+            <w:pPr>
+              <w:keepLines/>
+            </w:pPr>
             <w:r/>
             <w:r>
               <w:rPr>
@@ -2654,6 +3428,9 @@
             <w:shd w:val="clear" w:color="auto" w:fill="FDF3E3"/>
           </w:tcPr>
           <w:p>
+            <w:pPr>
+              <w:keepLines/>
+            </w:pPr>
             <w:r/>
             <w:r>
               <w:rPr>
@@ -2671,6 +3448,9 @@
             <w:shd w:val="clear" w:color="auto" w:fill="FDF3E3"/>
           </w:tcPr>
           <w:p>
+            <w:pPr>
+              <w:keepLines/>
+            </w:pPr>
             <w:r/>
             <w:r>
               <w:rPr>
@@ -2684,12 +3464,18 @@
         </w:tc>
       </w:tr>
       <w:tr>
+        <w:trPr>
+          <w:cantSplit/>
+        </w:trPr>
         <w:tc>
           <w:tcPr>
             <w:tcW w:type="dxa" w:w="1656"/>
-            <w:shd w:val="clear" w:color="auto" w:fill="E6F7F1"/>
+            <w:shd w:val="clear" w:color="auto" w:fill="E8F0FE"/>
           </w:tcPr>
           <w:p>
+            <w:pPr>
+              <w:keepLines/>
+            </w:pPr>
             <w:r/>
             <w:r>
               <w:rPr>
@@ -2697,7 +3483,137 @@
                 <w:b w:val="0"/>
                 <w:sz w:val="19"/>
               </w:rPr>
-              <w:t>11:15 – 12:15</w:t>
+              <w:t>11:15 – 11:40</w:t>
+            </w:r>
+          </w:p>
+        </w:tc>
+        <w:tc>
+          <w:tcPr>
+            <w:tcW w:type="dxa" w:w="7416"/>
+            <w:shd w:val="clear" w:color="auto" w:fill="E8F0FE"/>
+          </w:tcPr>
+          <w:p>
+            <w:pPr>
+              <w:keepLines/>
+            </w:pPr>
+            <w:r/>
+            <w:r>
+              <w:rPr>
+                <w:rFonts w:ascii="Arial" w:hAnsi="Arial"/>
+                <w:b w:val="0"/>
+                <w:sz w:val="19"/>
+              </w:rPr>
+              <w:t>Personal data, secrets, tokens, retention, transfers and the PDPA breach decision</w:t>
+            </w:r>
+          </w:p>
+        </w:tc>
+        <w:tc>
+          <w:tcPr>
+            <w:tcW w:type="dxa" w:w="1224"/>
+            <w:shd w:val="clear" w:color="auto" w:fill="E8F0FE"/>
+          </w:tcPr>
+          <w:p>
+            <w:pPr>
+              <w:keepLines/>
+            </w:pPr>
+            <w:r/>
+            <w:r>
+              <w:rPr>
+                <w:rFonts w:ascii="Arial" w:hAnsi="Arial"/>
+                <w:b w:val="0"/>
+                <w:sz w:val="19"/>
+              </w:rPr>
+              <w:t>25 min</w:t>
+            </w:r>
+          </w:p>
+        </w:tc>
+      </w:tr>
+      <w:tr>
+        <w:trPr>
+          <w:cantSplit/>
+        </w:trPr>
+        <w:tc>
+          <w:tcPr>
+            <w:tcW w:type="dxa" w:w="1656"/>
+            <w:shd w:val="clear" w:color="auto" w:fill="E8F0FE"/>
+          </w:tcPr>
+          <w:p>
+            <w:pPr>
+              <w:keepLines/>
+            </w:pPr>
+            <w:r/>
+            <w:r>
+              <w:rPr>
+                <w:rFonts w:ascii="Arial" w:hAnsi="Arial"/>
+                <w:b w:val="0"/>
+                <w:sz w:val="19"/>
+              </w:rPr>
+              <w:t>11:40 – 12:00</w:t>
+            </w:r>
+          </w:p>
+        </w:tc>
+        <w:tc>
+          <w:tcPr>
+            <w:tcW w:type="dxa" w:w="7416"/>
+            <w:shd w:val="clear" w:color="auto" w:fill="E8F0FE"/>
+          </w:tcPr>
+          <w:p>
+            <w:pPr>
+              <w:keepLines/>
+            </w:pPr>
+            <w:r/>
+            <w:r>
+              <w:rPr>
+                <w:rFonts w:ascii="Arial" w:hAnsi="Arial"/>
+                <w:b w:val="0"/>
+                <w:sz w:val="19"/>
+              </w:rPr>
+              <w:t>Framework stack followed by detailed agentic-threat and documented-case instruction (A3, K5)</w:t>
+            </w:r>
+          </w:p>
+        </w:tc>
+        <w:tc>
+          <w:tcPr>
+            <w:tcW w:type="dxa" w:w="1224"/>
+            <w:shd w:val="clear" w:color="auto" w:fill="E8F0FE"/>
+          </w:tcPr>
+          <w:p>
+            <w:pPr>
+              <w:keepLines/>
+            </w:pPr>
+            <w:r/>
+            <w:r>
+              <w:rPr>
+                <w:rFonts w:ascii="Arial" w:hAnsi="Arial"/>
+                <w:b w:val="0"/>
+                <w:sz w:val="19"/>
+              </w:rPr>
+              <w:t>20 min</w:t>
+            </w:r>
+          </w:p>
+        </w:tc>
+      </w:tr>
+      <w:tr>
+        <w:trPr>
+          <w:cantSplit/>
+        </w:trPr>
+        <w:tc>
+          <w:tcPr>
+            <w:tcW w:type="dxa" w:w="1656"/>
+            <w:shd w:val="clear" w:color="auto" w:fill="E6F7F1"/>
+          </w:tcPr>
+          <w:p>
+            <w:pPr>
+              <w:keepLines/>
+            </w:pPr>
+            <w:r/>
+            <w:r>
+              <w:rPr>
+                <w:rFonts w:ascii="Arial" w:hAnsi="Arial"/>
+                <w:b w:val="0"/>
+                <w:sz w:val="19"/>
+              </w:rPr>
+              <w:t>12:00 – 1:00</w:t>
             </w:r>
           </w:p>
         </w:tc>
@@ -2707,6 +3623,9 @@
             <w:shd w:val="clear" w:color="auto" w:fill="E6F7F1"/>
           </w:tcPr>
           <w:p>
+            <w:pPr>
+              <w:keepLines/>
+            </w:pPr>
             <w:r/>
             <w:r>
               <w:rPr>
@@ -2724,6 +3643,9 @@
             <w:shd w:val="clear" w:color="auto" w:fill="E6F7F1"/>
           </w:tcPr>
           <w:p>
+            <w:pPr>
+              <w:keepLines/>
+            </w:pPr>
             <w:r/>
             <w:r>
               <w:rPr>
@@ -2737,12 +3659,18 @@
         </w:tc>
       </w:tr>
       <w:tr>
+        <w:trPr>
+          <w:cantSplit/>
+        </w:trPr>
         <w:tc>
           <w:tcPr>
             <w:tcW w:type="dxa" w:w="1656"/>
-            <w:shd w:val="clear" w:color="auto" w:fill="E8F0FE"/>
+            <w:shd w:val="clear" w:color="auto" w:fill="FDF3E3"/>
           </w:tcPr>
           <w:p>
+            <w:pPr>
+              <w:keepLines/>
+            </w:pPr>
             <w:r/>
             <w:r>
               <w:rPr>
@@ -2750,60 +3678,7 @@
                 <w:b w:val="0"/>
                 <w:sz w:val="19"/>
               </w:rPr>
-              <w:t>12:15 – 12:45</w:t>
-            </w:r>
-          </w:p>
-        </w:tc>
-        <w:tc>
-          <w:tcPr>
-            <w:tcW w:type="dxa" w:w="7416"/>
-            <w:shd w:val="clear" w:color="auto" w:fill="E8F0FE"/>
-          </w:tcPr>
-          <w:p>
-            <w:r/>
-            <w:r>
-              <w:rPr>
-                <w:rFonts w:ascii="Arial" w:hAnsi="Arial"/>
-                <w:b w:val="0"/>
-                <w:sz w:val="19"/>
-              </w:rPr>
-              <w:t>LU3 T1: Agent anatomy — model, loop, tools, memory, identity. Excessive agency, uncontrolled and destructive execution (K5)</w:t>
-            </w:r>
-          </w:p>
-        </w:tc>
-        <w:tc>
-          <w:tcPr>
-            <w:tcW w:type="dxa" w:w="1224"/>
-            <w:shd w:val="clear" w:color="auto" w:fill="E8F0FE"/>
-          </w:tcPr>
-          <w:p>
-            <w:r/>
-            <w:r>
-              <w:rPr>
-                <w:rFonts w:ascii="Arial" w:hAnsi="Arial"/>
-                <w:b w:val="0"/>
-                <w:sz w:val="19"/>
-              </w:rPr>
-              <w:t>30 min</w:t>
-            </w:r>
-          </w:p>
-        </w:tc>
-      </w:tr>
-      <w:tr>
-        <w:tc>
-          <w:tcPr>
-            <w:tcW w:type="dxa" w:w="1656"/>
-            <w:shd w:val="clear" w:color="auto" w:fill="FDF3E3"/>
-          </w:tcPr>
-          <w:p>
-            <w:r/>
-            <w:r>
-              <w:rPr>
-                <w:rFonts w:ascii="Arial" w:hAnsi="Arial"/>
-                <w:b w:val="0"/>
-                <w:sz w:val="19"/>
-              </w:rPr>
-              <w:t>12:45 – 1:45</w:t>
+              <w:t>1:00 – 2:00</w:t>
             </w:r>
           </w:p>
         </w:tc>
@@ -2813,6 +3688,9 @@
             <w:shd w:val="clear" w:color="auto" w:fill="FDF3E3"/>
           </w:tcPr>
           <w:p>
+            <w:pPr>
+              <w:keepLines/>
+            </w:pPr>
             <w:r/>
             <w:r>
               <w:rPr>
@@ -2830,6 +3708,9 @@
             <w:shd w:val="clear" w:color="auto" w:fill="FDF3E3"/>
           </w:tcPr>
           <w:p>
+            <w:pPr>
+              <w:keepLines/>
+            </w:pPr>
             <w:r/>
             <w:r>
               <w:rPr>
@@ -2843,12 +3724,18 @@
         </w:tc>
       </w:tr>
       <w:tr>
+        <w:trPr>
+          <w:cantSplit/>
+        </w:trPr>
         <w:tc>
           <w:tcPr>
             <w:tcW w:type="dxa" w:w="1656"/>
             <w:shd w:val="clear" w:color="auto" w:fill="E8F0FE"/>
           </w:tcPr>
           <w:p>
+            <w:pPr>
+              <w:keepLines/>
+            </w:pPr>
             <w:r/>
             <w:r>
               <w:rPr>
@@ -2856,7 +3743,7 @@
                 <w:b w:val="0"/>
                 <w:sz w:val="19"/>
               </w:rPr>
-              <w:t>1:45 – 2:00</w:t>
+              <w:t>2:00 – 2:30</w:t>
             </w:r>
           </w:p>
         </w:tc>
@@ -2866,6 +3753,9 @@
             <w:shd w:val="clear" w:color="auto" w:fill="E8F0FE"/>
           </w:tcPr>
           <w:p>
+            <w:pPr>
+              <w:keepLines/>
+            </w:pPr>
             <w:r/>
             <w:r>
               <w:rPr>
@@ -2873,7 +3763,7 @@
                 <w:b w:val="0"/>
                 <w:sz w:val="19"/>
               </w:rPr>
-              <w:t>LU3 T1 (cont.): Defence in depth, malicious skill/plugin supply chains and the control stack (K5)</w:t>
+              <w:t>Activity 3 debrief and evidence bridge into the documented incident review</w:t>
             </w:r>
           </w:p>
         </w:tc>
@@ -2883,6 +3773,9 @@
             <w:shd w:val="clear" w:color="auto" w:fill="E8F0FE"/>
           </w:tcPr>
           <w:p>
+            <w:pPr>
+              <w:keepLines/>
+            </w:pPr>
             <w:r/>
             <w:r>
               <w:rPr>
@@ -2890,18 +3783,24 @@
                 <w:b w:val="0"/>
                 <w:sz w:val="19"/>
               </w:rPr>
-              <w:t>15 min</w:t>
+              <w:t>30 min</w:t>
             </w:r>
           </w:p>
         </w:tc>
       </w:tr>
       <w:tr>
+        <w:trPr>
+          <w:cantSplit/>
+        </w:trPr>
         <w:tc>
           <w:tcPr>
             <w:tcW w:type="dxa" w:w="1656"/>
             <w:shd w:val="clear" w:color="auto" w:fill="E6F7F1"/>
           </w:tcPr>
           <w:p>
+            <w:pPr>
+              <w:keepLines/>
+            </w:pPr>
             <w:r/>
             <w:r>
               <w:rPr>
@@ -2909,7 +3808,7 @@
                 <w:b w:val="0"/>
                 <w:sz w:val="19"/>
               </w:rPr>
-              <w:t>2:00 – 3:00</w:t>
+              <w:t>2:30 – 3:30</w:t>
             </w:r>
           </w:p>
         </w:tc>
@@ -2919,6 +3818,9 @@
             <w:shd w:val="clear" w:color="auto" w:fill="E6F7F1"/>
           </w:tcPr>
           <w:p>
+            <w:pPr>
+              <w:keepLines/>
+            </w:pPr>
             <w:r/>
             <w:r>
               <w:rPr>
@@ -2926,7 +3828,7 @@
                 <w:b w:val="0"/>
                 <w:sz w:val="19"/>
               </w:rPr>
-              <w:t>Activity 4: Rogue Agent Post-Incident Review — the real 2026 incidents (K5)</w:t>
+              <w:t>Activity 4: Evidence-Based Rogue Agent Incident Review (K5)</w:t>
             </w:r>
           </w:p>
         </w:tc>
@@ -2936,6 +3838,9 @@
             <w:shd w:val="clear" w:color="auto" w:fill="E6F7F1"/>
           </w:tcPr>
           <w:p>
+            <w:pPr>
+              <w:keepLines/>
+            </w:pPr>
             <w:r/>
             <w:r>
               <w:rPr>
@@ -2949,65 +3854,18 @@
         </w:tc>
       </w:tr>
       <w:tr>
-        <w:tc>
-          <w:tcPr>
-            <w:tcW w:type="dxa" w:w="1656"/>
-            <w:shd w:val="clear" w:color="auto" w:fill="E8F0FE"/>
-          </w:tcPr>
-          <w:p>
-            <w:r/>
-            <w:r>
-              <w:rPr>
-                <w:rFonts w:ascii="Arial" w:hAnsi="Arial"/>
-                <w:b w:val="0"/>
-                <w:sz w:val="19"/>
-              </w:rPr>
-              <w:t>3:00 – 3:30</w:t>
-            </w:r>
-          </w:p>
-        </w:tc>
-        <w:tc>
-          <w:tcPr>
-            <w:tcW w:type="dxa" w:w="7416"/>
-            <w:shd w:val="clear" w:color="auto" w:fill="E8F0FE"/>
-          </w:tcPr>
-          <w:p>
-            <w:r/>
-            <w:r>
-              <w:rPr>
-                <w:rFonts w:ascii="Arial" w:hAnsi="Arial"/>
-                <w:b w:val="0"/>
-                <w:sz w:val="19"/>
-              </w:rPr>
-              <w:t>LU3 T2: Organisational implementation — guardrails, deterministic human approval, Responsible AI/shared responsibility, PDPA/PDPC and IMDA agentic governance (A2)</w:t>
-            </w:r>
-          </w:p>
-        </w:tc>
-        <w:tc>
-          <w:tcPr>
-            <w:tcW w:type="dxa" w:w="1224"/>
-            <w:shd w:val="clear" w:color="auto" w:fill="E8F0FE"/>
-          </w:tcPr>
-          <w:p>
-            <w:r/>
-            <w:r>
-              <w:rPr>
-                <w:rFonts w:ascii="Arial" w:hAnsi="Arial"/>
-                <w:b w:val="0"/>
-                <w:sz w:val="19"/>
-              </w:rPr>
-              <w:t>30 min</w:t>
-            </w:r>
-          </w:p>
-        </w:tc>
-      </w:tr>
-      <w:tr>
+        <w:trPr>
+          <w:cantSplit/>
+        </w:trPr>
         <w:tc>
           <w:tcPr>
             <w:tcW w:type="dxa" w:w="1656"/>
             <w:shd w:val="clear" w:color="auto" w:fill="FDF3E3"/>
           </w:tcPr>
           <w:p>
+            <w:pPr>
+              <w:keepLines/>
+            </w:pPr>
             <w:r/>
             <w:r>
               <w:rPr>
@@ -3025,6 +3883,9 @@
             <w:shd w:val="clear" w:color="auto" w:fill="FDF3E3"/>
           </w:tcPr>
           <w:p>
+            <w:pPr>
+              <w:keepLines/>
+            </w:pPr>
             <w:r/>
             <w:r>
               <w:rPr>
@@ -3042,6 +3903,9 @@
             <w:shd w:val="clear" w:color="auto" w:fill="FDF3E3"/>
           </w:tcPr>
           <w:p>
+            <w:pPr>
+              <w:keepLines/>
+            </w:pPr>
             <w:r/>
             <w:r>
               <w:rPr>
@@ -3055,12 +3919,18 @@
         </w:tc>
       </w:tr>
       <w:tr>
+        <w:trPr>
+          <w:cantSplit/>
+        </w:trPr>
         <w:tc>
           <w:tcPr>
             <w:tcW w:type="dxa" w:w="1656"/>
             <w:shd w:val="clear" w:color="auto" w:fill="E8F0FE"/>
           </w:tcPr>
           <w:p>
+            <w:pPr>
+              <w:keepLines/>
+            </w:pPr>
             <w:r/>
             <w:r>
               <w:rPr>
@@ -3068,7 +3938,7 @@
                 <w:b w:val="0"/>
                 <w:sz w:val="19"/>
               </w:rPr>
-              <w:t>3:45 – 4:05</w:t>
+              <w:t>3:45 – 4:10</w:t>
             </w:r>
           </w:p>
         </w:tc>
@@ -3078,6 +3948,9 @@
             <w:shd w:val="clear" w:color="auto" w:fill="E8F0FE"/>
           </w:tcPr>
           <w:p>
+            <w:pPr>
+              <w:keepLines/>
+            </w:pPr>
             <w:r/>
             <w:r>
               <w:rPr>
@@ -3085,7 +3958,7 @@
                 <w:b w:val="0"/>
                 <w:sz w:val="19"/>
               </w:rPr>
-              <w:t>LU3 T3: Limitations and bias — misinformation as a security risk, aggregate accuracy and disparate impact (A1)</w:t>
+              <w:t>Organisational controls: guardrails, HITL, sandbox, egress, monitoring, deployment and incident gates (A1, A2)</w:t>
             </w:r>
           </w:p>
         </w:tc>
@@ -3095,59 +3968,9 @@
             <w:shd w:val="clear" w:color="auto" w:fill="E8F0FE"/>
           </w:tcPr>
           <w:p>
-            <w:r/>
-            <w:r>
-              <w:rPr>
-                <w:rFonts w:ascii="Arial" w:hAnsi="Arial"/>
-                <w:b w:val="0"/>
-                <w:sz w:val="19"/>
-              </w:rPr>
-              <w:t>20 min</w:t>
-            </w:r>
-          </w:p>
-        </w:tc>
-      </w:tr>
-      <w:tr>
-        <w:tc>
-          <w:tcPr>
-            <w:tcW w:type="dxa" w:w="1656"/>
-            <w:shd w:val="clear" w:color="auto" w:fill="E6F7F1"/>
-          </w:tcPr>
-          <w:p>
-            <w:r/>
-            <w:r>
-              <w:rPr>
-                <w:rFonts w:ascii="Arial" w:hAnsi="Arial"/>
-                <w:b w:val="0"/>
-                <w:sz w:val="19"/>
-              </w:rPr>
-              <w:t>4:05 – 4:30</w:t>
-            </w:r>
-          </w:p>
-        </w:tc>
-        <w:tc>
-          <w:tcPr>
-            <w:tcW w:type="dxa" w:w="7416"/>
-            <w:shd w:val="clear" w:color="auto" w:fill="E6F7F1"/>
-          </w:tcPr>
-          <w:p>
-            <w:r/>
-            <w:r>
-              <w:rPr>
-                <w:rFonts w:ascii="Arial" w:hAnsi="Arial"/>
-                <w:b w:val="0"/>
-                <w:sz w:val="19"/>
-              </w:rPr>
-              <w:t>Activity 5: Agent Governance and the Deployment Gate — capstone (A1, A2)</w:t>
-            </w:r>
-          </w:p>
-        </w:tc>
-        <w:tc>
-          <w:tcPr>
-            <w:tcW w:type="dxa" w:w="1224"/>
-            <w:shd w:val="clear" w:color="auto" w:fill="E6F7F1"/>
-          </w:tcPr>
-          <w:p>
+            <w:pPr>
+              <w:keepLines/>
+            </w:pPr>
             <w:r/>
             <w:r>
               <w:rPr>
@@ -3161,12 +3984,18 @@
         </w:tc>
       </w:tr>
       <w:tr>
+        <w:trPr>
+          <w:cantSplit/>
+        </w:trPr>
         <w:tc>
           <w:tcPr>
             <w:tcW w:type="dxa" w:w="1656"/>
-            <w:shd w:val="clear" w:color="auto" w:fill="F2F4F7"/>
+            <w:shd w:val="clear" w:color="auto" w:fill="E6F7F1"/>
           </w:tcPr>
           <w:p>
+            <w:pPr>
+              <w:keepLines/>
+            </w:pPr>
             <w:r/>
             <w:r>
               <w:rPr>
@@ -3174,7 +4003,72 @@
                 <w:b w:val="0"/>
                 <w:sz w:val="19"/>
               </w:rPr>
-              <w:t>4:30 – 4:40</w:t>
+              <w:t>4:10 – 4:35</w:t>
+            </w:r>
+          </w:p>
+        </w:tc>
+        <w:tc>
+          <w:tcPr>
+            <w:tcW w:type="dxa" w:w="7416"/>
+            <w:shd w:val="clear" w:color="auto" w:fill="E6F7F1"/>
+          </w:tcPr>
+          <w:p>
+            <w:pPr>
+              <w:keepLines/>
+            </w:pPr>
+            <w:r/>
+            <w:r>
+              <w:rPr>
+                <w:rFonts w:ascii="Arial" w:hAnsi="Arial"/>
+                <w:b w:val="0"/>
+                <w:sz w:val="19"/>
+              </w:rPr>
+              <w:t>Activity 5: Agent Governance and the Deployment Gate (A1, A2)</w:t>
+            </w:r>
+          </w:p>
+        </w:tc>
+        <w:tc>
+          <w:tcPr>
+            <w:tcW w:type="dxa" w:w="1224"/>
+            <w:shd w:val="clear" w:color="auto" w:fill="E6F7F1"/>
+          </w:tcPr>
+          <w:p>
+            <w:pPr>
+              <w:keepLines/>
+            </w:pPr>
+            <w:r/>
+            <w:r>
+              <w:rPr>
+                <w:rFonts w:ascii="Arial" w:hAnsi="Arial"/>
+                <w:b w:val="0"/>
+                <w:sz w:val="19"/>
+              </w:rPr>
+              <w:t>25 min</w:t>
+            </w:r>
+          </w:p>
+        </w:tc>
+      </w:tr>
+      <w:tr>
+        <w:trPr>
+          <w:cantSplit/>
+        </w:trPr>
+        <w:tc>
+          <w:tcPr>
+            <w:tcW w:type="dxa" w:w="1656"/>
+            <w:shd w:val="clear" w:color="auto" w:fill="F2F4F7"/>
+          </w:tcPr>
+          <w:p>
+            <w:pPr>
+              <w:keepLines/>
+            </w:pPr>
+            <w:r/>
+            <w:r>
+              <w:rPr>
+                <w:rFonts w:ascii="Arial" w:hAnsi="Arial"/>
+                <w:b w:val="0"/>
+                <w:sz w:val="19"/>
+              </w:rPr>
+              <w:t>4:35 – 4:50</w:t>
             </w:r>
           </w:p>
         </w:tc>
@@ -3184,6 +4078,9 @@
             <w:shd w:val="clear" w:color="auto" w:fill="F2F4F7"/>
           </w:tcPr>
           <w:p>
+            <w:pPr>
+              <w:keepLines/>
+            </w:pPr>
             <w:r/>
             <w:r>
               <w:rPr>
@@ -3191,7 +4088,7 @@
                 <w:b w:val="0"/>
                 <w:sz w:val="19"/>
               </w:rPr>
-              <w:t>Course synthesis, Q&amp;A and briefing for assessment</w:t>
+              <w:t>Course synthesis, assessment briefing and PM digital attendance</w:t>
             </w:r>
           </w:p>
         </w:tc>
@@ -3201,6 +4098,9 @@
             <w:shd w:val="clear" w:color="auto" w:fill="F2F4F7"/>
           </w:tcPr>
           <w:p>
+            <w:pPr>
+              <w:keepLines/>
+            </w:pPr>
             <w:r/>
             <w:r>
               <w:rPr>
@@ -3208,18 +4108,24 @@
                 <w:b w:val="0"/>
                 <w:sz w:val="19"/>
               </w:rPr>
-              <w:t>10 min</w:t>
+              <w:t>15 min</w:t>
             </w:r>
           </w:p>
         </w:tc>
       </w:tr>
       <w:tr>
+        <w:trPr>
+          <w:cantSplit/>
+        </w:trPr>
         <w:tc>
           <w:tcPr>
             <w:tcW w:type="dxa" w:w="1656"/>
             <w:shd w:val="clear" w:color="auto" w:fill="FDECEC"/>
           </w:tcPr>
           <w:p>
+            <w:pPr>
+              <w:keepLines/>
+            </w:pPr>
             <w:r/>
             <w:r>
               <w:rPr>
@@ -3227,7 +4133,7 @@
                 <w:b w:val="0"/>
                 <w:sz w:val="19"/>
               </w:rPr>
-              <w:t>4:40 – 5:40</w:t>
+              <w:t>4:50 – 5:50</w:t>
             </w:r>
           </w:p>
         </w:tc>
@@ -3237,6 +4143,9 @@
             <w:shd w:val="clear" w:color="auto" w:fill="FDECEC"/>
           </w:tcPr>
           <w:p>
+            <w:pPr>
+              <w:keepLines/>
+            </w:pPr>
             <w:r/>
             <w:r>
               <w:rPr>
@@ -3254,6 +4163,9 @@
             <w:shd w:val="clear" w:color="auto" w:fill="FDECEC"/>
           </w:tcPr>
           <w:p>
+            <w:pPr>
+              <w:keepLines/>
+            </w:pPr>
             <w:r/>
             <w:r>
               <w:rPr>
@@ -3267,12 +4179,18 @@
         </w:tc>
       </w:tr>
       <w:tr>
+        <w:trPr>
+          <w:cantSplit/>
+        </w:trPr>
         <w:tc>
           <w:tcPr>
             <w:tcW w:type="dxa" w:w="1656"/>
             <w:shd w:val="clear" w:color="auto" w:fill="FDECEC"/>
           </w:tcPr>
           <w:p>
+            <w:pPr>
+              <w:keepLines/>
+            </w:pPr>
             <w:r/>
             <w:r>
               <w:rPr>
@@ -3280,7 +4198,7 @@
                 <w:b w:val="0"/>
                 <w:sz w:val="19"/>
               </w:rPr>
-              <w:t>5:40 – 6:20</w:t>
+              <w:t>5:50 – 6:30</w:t>
             </w:r>
           </w:p>
         </w:tc>
@@ -3290,6 +4208,9 @@
             <w:shd w:val="clear" w:color="auto" w:fill="FDECEC"/>
           </w:tcPr>
           <w:p>
+            <w:pPr>
+              <w:keepLines/>
+            </w:pPr>
             <w:r/>
             <w:r>
               <w:rPr>
@@ -3297,7 +4218,7 @@
                 <w:b w:val="0"/>
                 <w:sz w:val="19"/>
               </w:rPr>
-              <w:t>Assessment 2: Case Study — 3 questions · 70 marks · 40 min</w:t>
+              <w:t>Assessment 2: Case Study — 3 questions · 70 marks · 40 min; TRAQOM close</w:t>
             </w:r>
           </w:p>
         </w:tc>
@@ -3307,6 +4228,9 @@
             <w:shd w:val="clear" w:color="auto" w:fill="FDECEC"/>
           </w:tcPr>
           <w:p>
+            <w:pPr>
+              <w:keepLines/>
+            </w:pPr>
             <w:r/>
             <w:r>
               <w:rPr>
@@ -3315,59 +4239,6 @@
                 <w:sz w:val="19"/>
               </w:rPr>
               <w:t>40 min</w:t>
-            </w:r>
-          </w:p>
-        </w:tc>
-      </w:tr>
-      <w:tr>
-        <w:tc>
-          <w:tcPr>
-            <w:tcW w:type="dxa" w:w="1656"/>
-            <w:shd w:val="clear" w:color="auto" w:fill="FDECEC"/>
-          </w:tcPr>
-          <w:p>
-            <w:r/>
-            <w:r>
-              <w:rPr>
-                <w:rFonts w:ascii="Arial" w:hAnsi="Arial"/>
-                <w:b w:val="0"/>
-                <w:sz w:val="19"/>
-              </w:rPr>
-              <w:t>6:20 – 6:30</w:t>
-            </w:r>
-          </w:p>
-        </w:tc>
-        <w:tc>
-          <w:tcPr>
-            <w:tcW w:type="dxa" w:w="7416"/>
-            <w:shd w:val="clear" w:color="auto" w:fill="FDECEC"/>
-          </w:tcPr>
-          <w:p>
-            <w:r/>
-            <w:r>
-              <w:rPr>
-                <w:rFonts w:ascii="Arial" w:hAnsi="Arial"/>
-                <w:b w:val="0"/>
-                <w:sz w:val="19"/>
-              </w:rPr>
-              <w:t>Assessment digital attendance · TRAQOM survey · course close</w:t>
-            </w:r>
-          </w:p>
-        </w:tc>
-        <w:tc>
-          <w:tcPr>
-            <w:tcW w:type="dxa" w:w="1224"/>
-            <w:shd w:val="clear" w:color="auto" w:fill="FDECEC"/>
-          </w:tcPr>
-          <w:p>
-            <w:r/>
-            <w:r>
-              <w:rPr>
-                <w:rFonts w:ascii="Arial" w:hAnsi="Arial"/>
-                <w:b w:val="0"/>
-                <w:sz w:val="19"/>
-              </w:rPr>
-              <w:t>10 min</w:t>
             </w:r>
           </w:p>
         </w:tc>
@@ -3424,7 +4295,7 @@
           <w:color w:val="111827"/>
           <w:sz w:val="22"/>
         </w:rPr>
-        <w:t>Every activity is a real-world case study. Each has its own folder under activities/ containing the scenario, the discussion questions, the trainer debrief and a printable PDF. Full step-by-step facilitation detail is in the Learner Guide.</w:t>
+        <w:t>Every activity is either a clearly labelled realistic simulation or an evidence-based documented-case review. Each has its own folder under activities/ containing learner instructions, scenarios, discussion questions, checklists and printable PDFs. Full step-by-step facilitation detail is in the Learner Guide.</w:t>
       </w:r>
     </w:p>
     <w:tbl>
@@ -3441,12 +4312,19 @@
         <w:gridCol w:w="1728"/>
       </w:tblGrid>
       <w:tr>
+        <w:trPr>
+          <w:cantSplit/>
+        </w:trPr>
         <w:tc>
           <w:tcPr>
             <w:tcW w:type="dxa" w:w="576"/>
             <w:shd w:val="clear" w:color="auto" w:fill="1F6FEB"/>
           </w:tcPr>
           <w:p>
+            <w:pPr>
+              <w:keepNext/>
+              <w:keepLines/>
+            </w:pPr>
             <w:r/>
             <w:r>
               <w:rPr>
@@ -3465,6 +4343,10 @@
             <w:shd w:val="clear" w:color="auto" w:fill="1F6FEB"/>
           </w:tcPr>
           <w:p>
+            <w:pPr>
+              <w:keepNext/>
+              <w:keepLines/>
+            </w:pPr>
             <w:r/>
             <w:r>
               <w:rPr>
@@ -3483,6 +4365,10 @@
             <w:shd w:val="clear" w:color="auto" w:fill="1F6FEB"/>
           </w:tcPr>
           <w:p>
+            <w:pPr>
+              <w:keepNext/>
+              <w:keepLines/>
+            </w:pPr>
             <w:r/>
             <w:r>
               <w:rPr>
@@ -3501,6 +4387,10 @@
             <w:shd w:val="clear" w:color="auto" w:fill="1F6FEB"/>
           </w:tcPr>
           <w:p>
+            <w:pPr>
+              <w:keepNext/>
+              <w:keepLines/>
+            </w:pPr>
             <w:r/>
             <w:r>
               <w:rPr>
@@ -3519,6 +4409,10 @@
             <w:shd w:val="clear" w:color="auto" w:fill="1F6FEB"/>
           </w:tcPr>
           <w:p>
+            <w:pPr>
+              <w:keepNext/>
+              <w:keepLines/>
+            </w:pPr>
             <w:r/>
             <w:r>
               <w:rPr>
@@ -3533,11 +4427,18 @@
         </w:tc>
       </w:tr>
       <w:tr>
+        <w:trPr>
+          <w:cantSplit/>
+        </w:trPr>
         <w:tc>
           <w:tcPr>
             <w:tcW w:type="dxa" w:w="576"/>
           </w:tcPr>
           <w:p>
+            <w:pPr>
+              <w:keepNext/>
+              <w:keepLines/>
+            </w:pPr>
             <w:r/>
             <w:r>
               <w:rPr>
@@ -3554,6 +4455,10 @@
             <w:tcW w:type="dxa" w:w="5184"/>
           </w:tcPr>
           <w:p>
+            <w:pPr>
+              <w:keepNext/>
+              <w:keepLines/>
+            </w:pPr>
             <w:r/>
             <w:r>
               <w:rPr>
@@ -3570,6 +4475,10 @@
             <w:tcW w:type="dxa" w:w="720"/>
           </w:tcPr>
           <w:p>
+            <w:pPr>
+              <w:keepNext/>
+              <w:keepLines/>
+            </w:pPr>
             <w:r/>
             <w:r>
               <w:rPr>
@@ -3586,6 +4495,10 @@
             <w:tcW w:type="dxa" w:w="1296"/>
           </w:tcPr>
           <w:p>
+            <w:pPr>
+              <w:keepNext/>
+              <w:keepLines/>
+            </w:pPr>
             <w:r/>
             <w:r>
               <w:rPr>
@@ -3602,6 +4515,10 @@
             <w:tcW w:type="dxa" w:w="2520"/>
           </w:tcPr>
           <w:p>
+            <w:pPr>
+              <w:keepNext/>
+              <w:keepLines/>
+            </w:pPr>
             <w:r/>
             <w:r>
               <w:rPr>
@@ -3615,11 +4532,18 @@
         </w:tc>
       </w:tr>
       <w:tr>
+        <w:trPr>
+          <w:cantSplit/>
+        </w:trPr>
         <w:tc>
           <w:tcPr>
             <w:tcW w:type="dxa" w:w="576"/>
           </w:tcPr>
           <w:p>
+            <w:pPr>
+              <w:keepNext/>
+              <w:keepLines/>
+            </w:pPr>
             <w:r/>
             <w:r>
               <w:rPr>
@@ -3636,6 +4560,10 @@
             <w:tcW w:type="dxa" w:w="5184"/>
           </w:tcPr>
           <w:p>
+            <w:pPr>
+              <w:keepNext/>
+              <w:keepLines/>
+            </w:pPr>
             <w:r/>
             <w:r>
               <w:rPr>
@@ -3643,7 +4571,7 @@
                 <w:b w:val="0"/>
                 <w:sz w:val="19"/>
               </w:rPr>
-              <w:t>Prompt Injection and the PDPA-Reportable Leak</w:t>
+              <w:t>Prompt Injection and the PDPA Breach Decision</w:t>
             </w:r>
           </w:p>
         </w:tc>
@@ -3652,6 +4580,10 @@
             <w:tcW w:type="dxa" w:w="720"/>
           </w:tcPr>
           <w:p>
+            <w:pPr>
+              <w:keepNext/>
+              <w:keepLines/>
+            </w:pPr>
             <w:r/>
             <w:r>
               <w:rPr>
@@ -3659,7 +4591,7 @@
                 <w:b w:val="0"/>
                 <w:sz w:val="19"/>
               </w:rPr>
-              <w:t>1</w:t>
+              <w:t>2</w:t>
             </w:r>
           </w:p>
         </w:tc>
@@ -3668,6 +4600,10 @@
             <w:tcW w:type="dxa" w:w="1296"/>
           </w:tcPr>
           <w:p>
+            <w:pPr>
+              <w:keepNext/>
+              <w:keepLines/>
+            </w:pPr>
             <w:r/>
             <w:r>
               <w:rPr>
@@ -3684,6 +4620,10 @@
             <w:tcW w:type="dxa" w:w="2520"/>
           </w:tcPr>
           <w:p>
+            <w:pPr>
+              <w:keepNext/>
+              <w:keepLines/>
+            </w:pPr>
             <w:r/>
             <w:r>
               <w:rPr>
@@ -3697,11 +4637,18 @@
         </w:tc>
       </w:tr>
       <w:tr>
+        <w:trPr>
+          <w:cantSplit/>
+        </w:trPr>
         <w:tc>
           <w:tcPr>
             <w:tcW w:type="dxa" w:w="576"/>
           </w:tcPr>
           <w:p>
+            <w:pPr>
+              <w:keepNext/>
+              <w:keepLines/>
+            </w:pPr>
             <w:r/>
             <w:r>
               <w:rPr>
@@ -3718,6 +4665,10 @@
             <w:tcW w:type="dxa" w:w="5184"/>
           </w:tcPr>
           <w:p>
+            <w:pPr>
+              <w:keepNext/>
+              <w:keepLines/>
+            </w:pPr>
             <w:r/>
             <w:r>
               <w:rPr>
@@ -3734,6 +4685,10 @@
             <w:tcW w:type="dxa" w:w="720"/>
           </w:tcPr>
           <w:p>
+            <w:pPr>
+              <w:keepNext/>
+              <w:keepLines/>
+            </w:pPr>
             <w:r/>
             <w:r>
               <w:rPr>
@@ -3750,6 +4705,10 @@
             <w:tcW w:type="dxa" w:w="1296"/>
           </w:tcPr>
           <w:p>
+            <w:pPr>
+              <w:keepNext/>
+              <w:keepLines/>
+            </w:pPr>
             <w:r/>
             <w:r>
               <w:rPr>
@@ -3766,6 +4725,10 @@
             <w:tcW w:type="dxa" w:w="2520"/>
           </w:tcPr>
           <w:p>
+            <w:pPr>
+              <w:keepNext/>
+              <w:keepLines/>
+            </w:pPr>
             <w:r/>
             <w:r>
               <w:rPr>
@@ -3779,11 +4742,18 @@
         </w:tc>
       </w:tr>
       <w:tr>
+        <w:trPr>
+          <w:cantSplit/>
+        </w:trPr>
         <w:tc>
           <w:tcPr>
             <w:tcW w:type="dxa" w:w="576"/>
           </w:tcPr>
           <w:p>
+            <w:pPr>
+              <w:keepNext/>
+              <w:keepLines/>
+            </w:pPr>
             <w:r/>
             <w:r>
               <w:rPr>
@@ -3800,6 +4770,10 @@
             <w:tcW w:type="dxa" w:w="5184"/>
           </w:tcPr>
           <w:p>
+            <w:pPr>
+              <w:keepNext/>
+              <w:keepLines/>
+            </w:pPr>
             <w:r/>
             <w:r>
               <w:rPr>
@@ -3807,7 +4781,7 @@
                 <w:b w:val="0"/>
                 <w:sz w:val="19"/>
               </w:rPr>
-              <w:t>Rogue Agent Post-Incident Review</w:t>
+              <w:t>Evidence-Based Rogue Agent Incident Review</w:t>
             </w:r>
           </w:p>
         </w:tc>
@@ -3816,6 +4790,10 @@
             <w:tcW w:type="dxa" w:w="720"/>
           </w:tcPr>
           <w:p>
+            <w:pPr>
+              <w:keepNext/>
+              <w:keepLines/>
+            </w:pPr>
             <w:r/>
             <w:r>
               <w:rPr>
@@ -3832,6 +4810,10 @@
             <w:tcW w:type="dxa" w:w="1296"/>
           </w:tcPr>
           <w:p>
+            <w:pPr>
+              <w:keepNext/>
+              <w:keepLines/>
+            </w:pPr>
             <w:r/>
             <w:r>
               <w:rPr>
@@ -3848,6 +4830,10 @@
             <w:tcW w:type="dxa" w:w="2520"/>
           </w:tcPr>
           <w:p>
+            <w:pPr>
+              <w:keepNext/>
+              <w:keepLines/>
+            </w:pPr>
             <w:r/>
             <w:r>
               <w:rPr>
@@ -3861,11 +4847,18 @@
         </w:tc>
       </w:tr>
       <w:tr>
+        <w:trPr>
+          <w:cantSplit/>
+        </w:trPr>
         <w:tc>
           <w:tcPr>
             <w:tcW w:type="dxa" w:w="576"/>
           </w:tcPr>
           <w:p>
+            <w:pPr>
+              <w:keepNext w:val="0"/>
+              <w:keepLines/>
+            </w:pPr>
             <w:r/>
             <w:r>
               <w:rPr>
@@ -3882,6 +4875,10 @@
             <w:tcW w:type="dxa" w:w="5184"/>
           </w:tcPr>
           <w:p>
+            <w:pPr>
+              <w:keepNext w:val="0"/>
+              <w:keepLines/>
+            </w:pPr>
             <w:r/>
             <w:r>
               <w:rPr>
@@ -3898,6 +4895,10 @@
             <w:tcW w:type="dxa" w:w="720"/>
           </w:tcPr>
           <w:p>
+            <w:pPr>
+              <w:keepNext w:val="0"/>
+              <w:keepLines/>
+            </w:pPr>
             <w:r/>
             <w:r>
               <w:rPr>
@@ -3914,6 +4915,10 @@
             <w:tcW w:type="dxa" w:w="1296"/>
           </w:tcPr>
           <w:p>
+            <w:pPr>
+              <w:keepNext w:val="0"/>
+              <w:keepLines/>
+            </w:pPr>
             <w:r/>
             <w:r>
               <w:rPr>
@@ -3930,6 +4935,10 @@
             <w:tcW w:type="dxa" w:w="2520"/>
           </w:tcPr>
           <w:p>
+            <w:pPr>
+              <w:keepNext w:val="0"/>
+              <w:keepLines/>
+            </w:pPr>
             <w:r/>
             <w:r>
               <w:rPr>
@@ -3962,12 +4971,19 @@
         <w:gridCol w:w="4320"/>
       </w:tblGrid>
       <w:tr>
+        <w:trPr>
+          <w:cantSplit/>
+        </w:trPr>
         <w:tc>
           <w:tcPr>
             <w:tcW w:type="dxa" w:w="3600"/>
             <w:shd w:val="clear" w:color="auto" w:fill="1F6FEB"/>
           </w:tcPr>
           <w:p>
+            <w:pPr>
+              <w:keepNext/>
+              <w:keepLines/>
+            </w:pPr>
             <w:r/>
             <w:r>
               <w:rPr>
@@ -3986,6 +5002,10 @@
             <w:shd w:val="clear" w:color="auto" w:fill="1F6FEB"/>
           </w:tcPr>
           <w:p>
+            <w:pPr>
+              <w:keepNext/>
+              <w:keepLines/>
+            </w:pPr>
             <w:r/>
             <w:r>
               <w:rPr>
@@ -4000,11 +5020,18 @@
         </w:tc>
       </w:tr>
       <w:tr>
+        <w:trPr>
+          <w:cantSplit/>
+        </w:trPr>
         <w:tc>
           <w:tcPr>
             <w:tcW w:type="dxa" w:w="3600"/>
           </w:tcPr>
           <w:p>
+            <w:pPr>
+              <w:keepNext/>
+              <w:keepLines/>
+            </w:pPr>
             <w:r/>
             <w:r>
               <w:rPr>
@@ -4021,6 +5048,10 @@
             <w:tcW w:type="dxa" w:w="6696"/>
           </w:tcPr>
           <w:p>
+            <w:pPr>
+              <w:keepNext/>
+              <w:keepLines/>
+            </w:pPr>
             <w:r/>
             <w:r>
               <w:rPr>
@@ -4034,11 +5065,18 @@
         </w:tc>
       </w:tr>
       <w:tr>
+        <w:trPr>
+          <w:cantSplit/>
+        </w:trPr>
         <w:tc>
           <w:tcPr>
             <w:tcW w:type="dxa" w:w="3600"/>
           </w:tcPr>
           <w:p>
+            <w:pPr>
+              <w:keepNext/>
+              <w:keepLines/>
+            </w:pPr>
             <w:r/>
             <w:r>
               <w:rPr>
@@ -4055,6 +5093,10 @@
             <w:tcW w:type="dxa" w:w="6696"/>
           </w:tcPr>
           <w:p>
+            <w:pPr>
+              <w:keepNext/>
+              <w:keepLines/>
+            </w:pPr>
             <w:r/>
             <w:r>
               <w:rPr>
@@ -4068,11 +5110,18 @@
         </w:tc>
       </w:tr>
       <w:tr>
+        <w:trPr>
+          <w:cantSplit/>
+        </w:trPr>
         <w:tc>
           <w:tcPr>
             <w:tcW w:type="dxa" w:w="3600"/>
           </w:tcPr>
           <w:p>
+            <w:pPr>
+              <w:keepNext/>
+              <w:keepLines/>
+            </w:pPr>
             <w:r/>
             <w:r>
               <w:rPr>
@@ -4089,6 +5138,10 @@
             <w:tcW w:type="dxa" w:w="6696"/>
           </w:tcPr>
           <w:p>
+            <w:pPr>
+              <w:keepNext/>
+              <w:keepLines/>
+            </w:pPr>
             <w:r/>
             <w:r>
               <w:rPr>
@@ -4096,17 +5149,24 @@
                 <w:b w:val="0"/>
                 <w:sz w:val="19"/>
               </w:rPr>
-              <w:t>Scenario, discussion questions and debrief per activity</w:t>
+              <w:t>Learner scenarios, discussion questions, checklists and evidence worksheets</w:t>
             </w:r>
           </w:p>
         </w:tc>
       </w:tr>
       <w:tr>
+        <w:trPr>
+          <w:cantSplit/>
+        </w:trPr>
         <w:tc>
           <w:tcPr>
             <w:tcW w:type="dxa" w:w="3600"/>
           </w:tcPr>
           <w:p>
+            <w:pPr>
+              <w:keepNext/>
+              <w:keepLines/>
+            </w:pPr>
             <w:r/>
             <w:r>
               <w:rPr>
@@ -4123,6 +5183,10 @@
             <w:tcW w:type="dxa" w:w="6696"/>
           </w:tcPr>
           <w:p>
+            <w:pPr>
+              <w:keepNext/>
+              <w:keepLines/>
+            </w:pPr>
             <w:r/>
             <w:r>
               <w:rPr>
@@ -4136,11 +5200,18 @@
         </w:tc>
       </w:tr>
       <w:tr>
+        <w:trPr>
+          <w:cantSplit/>
+        </w:trPr>
         <w:tc>
           <w:tcPr>
             <w:tcW w:type="dxa" w:w="3600"/>
           </w:tcPr>
           <w:p>
+            <w:pPr>
+              <w:keepNext/>
+              <w:keepLines/>
+            </w:pPr>
             <w:r/>
             <w:r>
               <w:rPr>
@@ -4157,6 +5228,10 @@
             <w:tcW w:type="dxa" w:w="6696"/>
           </w:tcPr>
           <w:p>
+            <w:pPr>
+              <w:keepNext/>
+              <w:keepLines/>
+            </w:pPr>
             <w:r/>
             <w:r>
               <w:rPr>
@@ -4170,11 +5245,18 @@
         </w:tc>
       </w:tr>
       <w:tr>
+        <w:trPr>
+          <w:cantSplit/>
+        </w:trPr>
         <w:tc>
           <w:tcPr>
             <w:tcW w:type="dxa" w:w="3600"/>
           </w:tcPr>
           <w:p>
+            <w:pPr>
+              <w:keepNext/>
+              <w:keepLines/>
+            </w:pPr>
             <w:r/>
             <w:r>
               <w:rPr>
@@ -4191,6 +5273,10 @@
             <w:tcW w:type="dxa" w:w="6696"/>
           </w:tcPr>
           <w:p>
+            <w:pPr>
+              <w:keepNext/>
+              <w:keepLines/>
+            </w:pPr>
             <w:r/>
             <w:r>
               <w:rPr>
@@ -4204,11 +5290,18 @@
         </w:tc>
       </w:tr>
       <w:tr>
+        <w:trPr>
+          <w:cantSplit/>
+        </w:trPr>
         <w:tc>
           <w:tcPr>
             <w:tcW w:type="dxa" w:w="3600"/>
           </w:tcPr>
           <w:p>
+            <w:pPr>
+              <w:keepNext w:val="0"/>
+              <w:keepLines/>
+            </w:pPr>
             <w:r/>
             <w:r>
               <w:rPr>
@@ -4225,6 +5318,10 @@
             <w:tcW w:type="dxa" w:w="6696"/>
           </w:tcPr>
           <w:p>
+            <w:pPr>
+              <w:keepNext w:val="0"/>
+              <w:keepLines/>
+            </w:pPr>
             <w:r/>
             <w:r>
               <w:rPr>
@@ -4238,6 +5335,11 @@
         </w:tc>
       </w:tr>
     </w:tbl>
+    <w:p>
+      <w:r>
+        <w:br w:type="page"/>
+      </w:r>
+    </w:p>
     <w:p>
       <w:pPr>
         <w:pStyle w:val="Heading1"/>
@@ -4272,12 +5374,19 @@
         <w:gridCol w:w="2880"/>
       </w:tblGrid>
       <w:tr>
+        <w:trPr>
+          <w:cantSplit/>
+        </w:trPr>
         <w:tc>
           <w:tcPr>
             <w:tcW w:type="dxa" w:w="2520"/>
             <w:shd w:val="clear" w:color="auto" w:fill="1F6FEB"/>
           </w:tcPr>
           <w:p>
+            <w:pPr>
+              <w:keepNext/>
+              <w:keepLines/>
+            </w:pPr>
             <w:r/>
             <w:r>
               <w:rPr>
@@ -4296,6 +5405,10 @@
             <w:shd w:val="clear" w:color="auto" w:fill="1F6FEB"/>
           </w:tcPr>
           <w:p>
+            <w:pPr>
+              <w:keepNext/>
+              <w:keepLines/>
+            </w:pPr>
             <w:r/>
             <w:r>
               <w:rPr>
@@ -4314,6 +5427,10 @@
             <w:shd w:val="clear" w:color="auto" w:fill="1F6FEB"/>
           </w:tcPr>
           <w:p>
+            <w:pPr>
+              <w:keepNext/>
+              <w:keepLines/>
+            </w:pPr>
             <w:r/>
             <w:r>
               <w:rPr>
@@ -4328,11 +5445,18 @@
         </w:tc>
       </w:tr>
       <w:tr>
+        <w:trPr>
+          <w:cantSplit/>
+        </w:trPr>
         <w:tc>
           <w:tcPr>
             <w:tcW w:type="dxa" w:w="2520"/>
           </w:tcPr>
           <w:p>
+            <w:pPr>
+              <w:keepNext/>
+              <w:keepLines/>
+            </w:pPr>
             <w:r/>
             <w:r>
               <w:rPr>
@@ -4349,6 +5473,10 @@
             <w:tcW w:type="dxa" w:w="1944"/>
           </w:tcPr>
           <w:p>
+            <w:pPr>
+              <w:keepNext/>
+              <w:keepLines/>
+            </w:pPr>
             <w:r/>
             <w:r>
               <w:rPr>
@@ -4365,6 +5493,10 @@
             <w:tcW w:type="dxa" w:w="5832"/>
           </w:tcPr>
           <w:p>
+            <w:pPr>
+              <w:keepNext/>
+              <w:keepLines/>
+            </w:pPr>
             <w:r/>
             <w:r>
               <w:rPr>
@@ -4378,11 +5510,18 @@
         </w:tc>
       </w:tr>
       <w:tr>
+        <w:trPr>
+          <w:cantSplit/>
+        </w:trPr>
         <w:tc>
           <w:tcPr>
             <w:tcW w:type="dxa" w:w="2520"/>
           </w:tcPr>
           <w:p>
+            <w:pPr>
+              <w:keepNext/>
+              <w:keepLines/>
+            </w:pPr>
             <w:r/>
             <w:r>
               <w:rPr>
@@ -4399,6 +5538,10 @@
             <w:tcW w:type="dxa" w:w="1944"/>
           </w:tcPr>
           <w:p>
+            <w:pPr>
+              <w:keepNext/>
+              <w:keepLines/>
+            </w:pPr>
             <w:r/>
             <w:r>
               <w:rPr>
@@ -4415,6 +5558,10 @@
             <w:tcW w:type="dxa" w:w="5832"/>
           </w:tcPr>
           <w:p>
+            <w:pPr>
+              <w:keepNext/>
+              <w:keepLines/>
+            </w:pPr>
             <w:r/>
             <w:r>
               <w:rPr>
@@ -4428,11 +5575,18 @@
         </w:tc>
       </w:tr>
       <w:tr>
+        <w:trPr>
+          <w:cantSplit/>
+        </w:trPr>
         <w:tc>
           <w:tcPr>
             <w:tcW w:type="dxa" w:w="2520"/>
           </w:tcPr>
           <w:p>
+            <w:pPr>
+              <w:keepNext/>
+              <w:keepLines/>
+            </w:pPr>
             <w:r/>
             <w:r>
               <w:rPr>
@@ -4449,6 +5603,10 @@
             <w:tcW w:type="dxa" w:w="1944"/>
           </w:tcPr>
           <w:p>
+            <w:pPr>
+              <w:keepNext/>
+              <w:keepLines/>
+            </w:pPr>
             <w:r/>
             <w:r>
               <w:rPr>
@@ -4465,6 +5623,10 @@
             <w:tcW w:type="dxa" w:w="5832"/>
           </w:tcPr>
           <w:p>
+            <w:pPr>
+              <w:keepNext/>
+              <w:keepLines/>
+            </w:pPr>
             <w:r/>
             <w:r>
               <w:rPr>
@@ -4478,11 +5640,18 @@
         </w:tc>
       </w:tr>
       <w:tr>
+        <w:trPr>
+          <w:cantSplit/>
+        </w:trPr>
         <w:tc>
           <w:tcPr>
             <w:tcW w:type="dxa" w:w="2520"/>
           </w:tcPr>
           <w:p>
+            <w:pPr>
+              <w:keepNext/>
+              <w:keepLines/>
+            </w:pPr>
             <w:r/>
             <w:r>
               <w:rPr>
@@ -4499,6 +5668,10 @@
             <w:tcW w:type="dxa" w:w="1944"/>
           </w:tcPr>
           <w:p>
+            <w:pPr>
+              <w:keepNext/>
+              <w:keepLines/>
+            </w:pPr>
             <w:r/>
             <w:r>
               <w:rPr>
@@ -4515,6 +5688,10 @@
             <w:tcW w:type="dxa" w:w="5832"/>
           </w:tcPr>
           <w:p>
+            <w:pPr>
+              <w:keepNext/>
+              <w:keepLines/>
+            </w:pPr>
             <w:r/>
             <w:r>
               <w:rPr>
@@ -4528,11 +5705,18 @@
         </w:tc>
       </w:tr>
       <w:tr>
+        <w:trPr>
+          <w:cantSplit/>
+        </w:trPr>
         <w:tc>
           <w:tcPr>
             <w:tcW w:type="dxa" w:w="2520"/>
           </w:tcPr>
           <w:p>
+            <w:pPr>
+              <w:keepNext w:val="0"/>
+              <w:keepLines/>
+            </w:pPr>
             <w:r/>
             <w:r>
               <w:rPr>
@@ -4549,6 +5733,10 @@
             <w:tcW w:type="dxa" w:w="1944"/>
           </w:tcPr>
           <w:p>
+            <w:pPr>
+              <w:keepNext w:val="0"/>
+              <w:keepLines/>
+            </w:pPr>
             <w:r/>
             <w:r>
               <w:rPr>
@@ -4565,6 +5753,10 @@
             <w:tcW w:type="dxa" w:w="5832"/>
           </w:tcPr>
           <w:p>
+            <w:pPr>
+              <w:keepNext w:val="0"/>
+              <w:keepLines/>
+            </w:pPr>
             <w:r/>
             <w:r>
               <w:rPr>

</xml_diff>

<commit_message>
feat: rebuild as 1-day GenAI/Agentic-AI/AI-Agents course (v4.0)
Overhaul TGS-2025060473 from a 2-day security course into a 1-day (8h)
course with three topics mapped to LO1/LO2/LO3:
- Topic 1: generative AI, agentic AI and AI agents (history, autoregressive
  LLM, context engineering, the agentic loop, OpenClaw/Hermes, multi-agent)
- Topic 2: prompt engineering on the Hermes agent with MiniMax
- Topic 3: AI data governance, job impact/redesign and agent security

124-slide deck, ~120-page Learner Guide, 1-day Lesson Plan (480 min + 1h
assessment), and eight no-code activities on ready-made websites and chatbots
(role-play simulator, leaky vs guarded RAG chatbots) with OpenAI/MiniMax key
options. Assessment: 5 SAQ (K1-K5) + a reflection-based Practical (LO1-LO3).
Fix org UEN to 201200696W; live TOC fields; refresh landing-page README.

Co-Authored-By: Claude Opus 4.8 <noreply@anthropic.com>
</commit_message>
<xml_diff>
--- a/courseweare/Lesson Plan - TGS-2025060473 - AI Security for Autonomous AI Agents.docx
+++ b/courseweare/Lesson Plan - TGS-2025060473 - AI Security for Autonomous AI Agents.docx
@@ -67,7 +67,7 @@
           <w:color w:val="555B66"/>
           <w:sz w:val="20"/>
         </w:rPr>
-        <w:t>UEN: 20120096W</w:t>
+        <w:t>UEN: 201200696W</w:t>
       </w:r>
     </w:p>
     <w:p>
@@ -165,7 +165,7 @@
           <w:color w:val="555B66"/>
           <w:sz w:val="22"/>
         </w:rPr>
-        <w:t>UEN: 20120096W</w:t>
+        <w:t>UEN: 201200696W</w:t>
       </w:r>
     </w:p>
     <w:p>
@@ -179,7 +179,7 @@
           <w:color w:val="1F6FEB"/>
           <w:sz w:val="24"/>
         </w:rPr>
-        <w:t>Version 3.0</w:t>
+        <w:t>Version 4.0</w:t>
       </w:r>
     </w:p>
     <w:p>
@@ -523,6 +523,64 @@
           </w:p>
         </w:tc>
       </w:tr>
+      <w:tr>
+        <w:tc>
+          <w:tcPr>
+            <w:tcW w:type="dxa" w:w="2160"/>
+          </w:tcPr>
+          <w:p>
+            <w:r/>
+            <w:r>
+              <w:rPr>
+                <w:sz w:val="19"/>
+              </w:rPr>
+              <w:t>4.0</w:t>
+            </w:r>
+          </w:p>
+        </w:tc>
+        <w:tc>
+          <w:tcPr>
+            <w:tcW w:type="dxa" w:w="2160"/>
+          </w:tcPr>
+          <w:p>
+            <w:r/>
+            <w:r>
+              <w:rPr>
+                <w:sz w:val="19"/>
+              </w:rPr>
+              <w:t>25 August 2026</w:t>
+            </w:r>
+          </w:p>
+        </w:tc>
+        <w:tc>
+          <w:tcPr>
+            <w:tcW w:type="dxa" w:w="2160"/>
+          </w:tcPr>
+          <w:p>
+            <w:r/>
+            <w:r>
+              <w:rPr>
+                <w:sz w:val="19"/>
+              </w:rPr>
+              <w:t>Rebuilt as a 1-day (8-hour) course with three topics mapped to LO1/LO2/LO3: generative and agentic AI concepts, prompt engineering on the Hermes agent with MiniMax, and AI-agent governance and security. No-code activities on ready-made websites and chatbots; Practical assessment is reflection on the activities. TSC K/A text unchanged.</w:t>
+            </w:r>
+          </w:p>
+        </w:tc>
+        <w:tc>
+          <w:tcPr>
+            <w:tcW w:type="dxa" w:w="2160"/>
+          </w:tcPr>
+          <w:p>
+            <w:r/>
+            <w:r>
+              <w:rPr>
+                <w:sz w:val="19"/>
+              </w:rPr>
+              <w:t>Dr Alfred Ang</w:t>
+            </w:r>
+          </w:p>
+        </w:tc>
+      </w:tr>
     </w:tbl>
     <w:p>
       <w:r>
@@ -548,294 +606,36 @@
           <w:color w:val="555B66"/>
           <w:sz w:val="19"/>
         </w:rPr>
-        <w:t>Generated contents for the fixed v3.0 pagination.</w:t>
+        <w:t>Right-click and choose 'Update Field' to refresh page numbers.</w:t>
       </w:r>
     </w:p>
-    <w:tbl>
-      <w:tblPr>
-        <w:tblStyle w:val="TableGrid"/>
-        <w:tblW w:type="auto" w:w="0"/>
-        <w:tblLook w:firstColumn="1" w:firstRow="1" w:lastColumn="0" w:lastRow="0" w:noHBand="0" w:noVBand="1" w:val="04A0"/>
-      </w:tblPr>
-      <w:tblGrid>
-        <w:gridCol w:w="4320"/>
-        <w:gridCol w:w="4320"/>
-      </w:tblGrid>
-      <w:tr>
-        <w:trPr>
-          <w:cantSplit/>
-        </w:trPr>
-        <w:tc>
-          <w:tcPr>
-            <w:tcW w:type="dxa" w:w="8928"/>
-            <w:shd w:val="clear" w:color="auto" w:fill="1F6FEB"/>
-          </w:tcPr>
-          <w:p>
-            <w:pPr>
-              <w:keepNext/>
-              <w:keepLines/>
-            </w:pPr>
-            <w:r/>
-            <w:r>
-              <w:rPr>
-                <w:rFonts w:ascii="Arial" w:hAnsi="Arial"/>
-                <w:b/>
-                <w:color w:val="FFFFFF"/>
-                <w:sz w:val="20"/>
-              </w:rPr>
-              <w:t>Section</w:t>
-            </w:r>
-          </w:p>
-        </w:tc>
-        <w:tc>
-          <w:tcPr>
-            <w:tcW w:type="dxa" w:w="1368"/>
-            <w:shd w:val="clear" w:color="auto" w:fill="1F6FEB"/>
-          </w:tcPr>
-          <w:p>
-            <w:pPr>
-              <w:keepNext/>
-              <w:keepLines/>
-            </w:pPr>
-            <w:r/>
-            <w:r>
-              <w:rPr>
-                <w:rFonts w:ascii="Arial" w:hAnsi="Arial"/>
-                <w:b/>
-                <w:color w:val="FFFFFF"/>
-                <w:sz w:val="20"/>
-              </w:rPr>
-              <w:t>Page</w:t>
-            </w:r>
-          </w:p>
-        </w:tc>
-      </w:tr>
-      <w:tr>
-        <w:trPr>
-          <w:cantSplit/>
-        </w:trPr>
-        <w:tc>
-          <w:tcPr>
-            <w:tcW w:type="dxa" w:w="8928"/>
-          </w:tcPr>
-          <w:p>
-            <w:pPr>
-              <w:keepNext/>
-              <w:keepLines/>
-            </w:pPr>
-            <w:r/>
-            <w:r>
-              <w:rPr>
-                <w:rFonts w:ascii="Arial" w:hAnsi="Arial"/>
-                <w:b/>
-                <w:sz w:val="19"/>
-              </w:rPr>
-              <w:t>1. Course Overview</w:t>
-            </w:r>
-          </w:p>
-        </w:tc>
-        <w:tc>
-          <w:tcPr>
-            <w:tcW w:type="dxa" w:w="1368"/>
-          </w:tcPr>
-          <w:p>
-            <w:pPr>
-              <w:keepNext/>
-              <w:keepLines/>
-            </w:pPr>
-            <w:r/>
-            <w:r>
-              <w:rPr>
-                <w:rFonts w:ascii="Arial" w:hAnsi="Arial"/>
-                <w:b w:val="0"/>
-                <w:sz w:val="19"/>
-              </w:rPr>
-              <w:t>4</w:t>
-            </w:r>
-          </w:p>
-        </w:tc>
-      </w:tr>
-      <w:tr>
-        <w:trPr>
-          <w:cantSplit/>
-        </w:trPr>
-        <w:tc>
-          <w:tcPr>
-            <w:tcW w:type="dxa" w:w="8928"/>
-          </w:tcPr>
-          <w:p>
-            <w:pPr>
-              <w:keepNext/>
-              <w:keepLines/>
-            </w:pPr>
-            <w:r/>
-            <w:r>
-              <w:rPr>
-                <w:rFonts w:ascii="Arial" w:hAnsi="Arial"/>
-                <w:b/>
-                <w:sz w:val="19"/>
-              </w:rPr>
-              <w:t>2. Daily Schedule</w:t>
-            </w:r>
-          </w:p>
-        </w:tc>
-        <w:tc>
-          <w:tcPr>
-            <w:tcW w:type="dxa" w:w="1368"/>
-          </w:tcPr>
-          <w:p>
-            <w:pPr>
-              <w:keepNext/>
-              <w:keepLines/>
-            </w:pPr>
-            <w:r/>
-            <w:r>
-              <w:rPr>
-                <w:rFonts w:ascii="Arial" w:hAnsi="Arial"/>
-                <w:b w:val="0"/>
-                <w:sz w:val="19"/>
-              </w:rPr>
-              <w:t>6</w:t>
-            </w:r>
-          </w:p>
-        </w:tc>
-      </w:tr>
-      <w:tr>
-        <w:trPr>
-          <w:cantSplit/>
-        </w:trPr>
-        <w:tc>
-          <w:tcPr>
-            <w:tcW w:type="dxa" w:w="8928"/>
-          </w:tcPr>
-          <w:p>
-            <w:pPr>
-              <w:keepNext/>
-              <w:keepLines/>
-            </w:pPr>
-            <w:r/>
-            <w:r>
-              <w:rPr>
-                <w:rFonts w:ascii="Arial" w:hAnsi="Arial"/>
-                <w:b/>
-                <w:sz w:val="19"/>
-              </w:rPr>
-              <w:t>3. Activities</w:t>
-            </w:r>
-          </w:p>
-        </w:tc>
-        <w:tc>
-          <w:tcPr>
-            <w:tcW w:type="dxa" w:w="1368"/>
-          </w:tcPr>
-          <w:p>
-            <w:pPr>
-              <w:keepNext/>
-              <w:keepLines/>
-            </w:pPr>
-            <w:r/>
-            <w:r>
-              <w:rPr>
-                <w:rFonts w:ascii="Arial" w:hAnsi="Arial"/>
-                <w:b w:val="0"/>
-                <w:sz w:val="19"/>
-              </w:rPr>
-              <w:t>8</w:t>
-            </w:r>
-          </w:p>
-        </w:tc>
-      </w:tr>
-      <w:tr>
-        <w:trPr>
-          <w:cantSplit/>
-        </w:trPr>
-        <w:tc>
-          <w:tcPr>
-            <w:tcW w:type="dxa" w:w="8928"/>
-          </w:tcPr>
-          <w:p>
-            <w:pPr>
-              <w:keepNext/>
-              <w:keepLines/>
-            </w:pPr>
-            <w:r/>
-            <w:r>
-              <w:rPr>
-                <w:rFonts w:ascii="Arial" w:hAnsi="Arial"/>
-                <w:b/>
-                <w:sz w:val="19"/>
-              </w:rPr>
-              <w:t>4. Tools and Resources</w:t>
-            </w:r>
-          </w:p>
-        </w:tc>
-        <w:tc>
-          <w:tcPr>
-            <w:tcW w:type="dxa" w:w="1368"/>
-          </w:tcPr>
-          <w:p>
-            <w:pPr>
-              <w:keepNext/>
-              <w:keepLines/>
-            </w:pPr>
-            <w:r/>
-            <w:r>
-              <w:rPr>
-                <w:rFonts w:ascii="Arial" w:hAnsi="Arial"/>
-                <w:b w:val="0"/>
-                <w:sz w:val="19"/>
-              </w:rPr>
-              <w:t>8</w:t>
-            </w:r>
-          </w:p>
-        </w:tc>
-      </w:tr>
-      <w:tr>
-        <w:trPr>
-          <w:cantSplit/>
-        </w:trPr>
-        <w:tc>
-          <w:tcPr>
-            <w:tcW w:type="dxa" w:w="8928"/>
-          </w:tcPr>
-          <w:p>
-            <w:pPr>
-              <w:keepNext w:val="0"/>
-              <w:keepLines/>
-            </w:pPr>
-            <w:r/>
-            <w:r>
-              <w:rPr>
-                <w:rFonts w:ascii="Arial" w:hAnsi="Arial"/>
-                <w:b/>
-                <w:sz w:val="19"/>
-              </w:rPr>
-              <w:t>5. Assessment</w:t>
-            </w:r>
-          </w:p>
-        </w:tc>
-        <w:tc>
-          <w:tcPr>
-            <w:tcW w:type="dxa" w:w="1368"/>
-          </w:tcPr>
-          <w:p>
-            <w:pPr>
-              <w:keepNext w:val="0"/>
-              <w:keepLines/>
-            </w:pPr>
-            <w:r/>
-            <w:r>
-              <w:rPr>
-                <w:rFonts w:ascii="Arial" w:hAnsi="Arial"/>
-                <w:b w:val="0"/>
-                <w:sz w:val="19"/>
-              </w:rPr>
-              <w:t>9</w:t>
-            </w:r>
-          </w:p>
-        </w:tc>
-      </w:tr>
-    </w:tbl>
+    <w:p>
+      <w:pPr>
+        <w:spacing w:after="120"/>
+      </w:pPr>
+      <w:r>
+        <w:rPr>
+          <w:b/>
+          <w:color w:val="111827"/>
+          <w:sz w:val="24"/>
+        </w:rPr>
+        <w:t>TABLE OF CONTENTS</w:t>
+      </w:r>
+    </w:p>
+    <w:p>
+      <w:r>
+        <w:fldChar w:fldCharType="begin"/>
+        <w:instrText xml:space="preserve">TOC \o "1-3" \h \z \u</w:instrText>
+        <w:fldChar w:fldCharType="separate"/>
+        <w:t>Right-click and choose “Update Field”, or press F9, to build the table of contents.</w:t>
+        <w:fldChar w:fldCharType="end"/>
+      </w:r>
+    </w:p>
+    <w:p>
+      <w:r>
+        <w:br w:type="page"/>
+      </w:r>
+    </w:p>
     <w:p>
       <w:r>
         <w:br w:type="page"/>
@@ -860,7 +660,7 @@
           <w:color w:val="111827"/>
           <w:sz w:val="22"/>
         </w:rPr>
-        <w:t>AI Security for Autonomous AI Agents is a 2 Days · 16 Hours WSQ course that equips learners to identify, analyse and mitigate the security risks introduced by generative AI systems and by autonomous AI agents. The course uses documented cases and clearly labelled realistic simulations, grounded in current security and governance frameworks, including the OWASP Top 10 for LLM Applications (2026), the OWASP Top 10 for Agentic Applications (2026), the NIST AI Risk Management Framework, MITRE ATLAS, the IMDA Model AI Governance Framework for Agentic AI, and Singapore's PDPA and current PDPC guidance. Proposed consultation material is not presented as final law or guidance.</w:t>
+        <w:t>AI Security for Autonomous AI Agents is a 1 Day · 8 Hours WSQ course that introduces generative AI, agentic AI and autonomous AI agents, and the security, governance and ethical risks they bring to customer-service and hospitality settings. Learners work entirely on ready-made websites, chatbots and AI agents — no coding is required. The day is organised as three topics mapped one-to-one onto the three learning outcomes.</w:t>
       </w:r>
     </w:p>
     <w:p>
@@ -874,7 +674,7 @@
           <w:color w:val="111827"/>
           <w:sz w:val="22"/>
         </w:rPr>
-        <w:t>The course covers AI security for BOTH generative AI (prompt injection, data leakage, poisoning, PDPA exposure) and autonomous agents (uncontrolled and destructive execution, tool misuse, agent vulnerabilities and cyber-attack chains).</w:t>
+        <w:t>Topic 1 (LO1) explains how generative AI works and how it becomes agentic — the agentic loop, harness engineering, AI agents such as OpenClaw and Hermes, skills, tools and multi-agent systems. Topic 2 (LO2) covers prompt engineering and post-training, using the Hermes agent on a MiniMax model to analyse data and build presentations. Topic 3 (LO3) covers AI data governance, job impact and redesign, and the cybersecurity risks of autonomous agents, including a safe roll-out framework. Real, dated examples and clearly labelled simulations are grounded in current governance references such as the IMDA Model AI Governance Framework, Singapore's PDPA and PDPC guidance, and the OWASP Top 10 for LLM and Agentic Applications.</w:t>
       </w:r>
     </w:p>
     <w:p>
@@ -1164,7 +964,7 @@
                 <w:b w:val="0"/>
                 <w:sz w:val="19"/>
               </w:rPr>
-              <w:t>2 Days · 16 Hours</w:t>
+              <w:t>1 Day · 8 Hours</w:t>
             </w:r>
           </w:p>
         </w:tc>
@@ -1743,7 +1543,7 @@
         <w:pStyle w:val="Heading2"/>
       </w:pPr>
       <w:r>
-        <w:t>Ability Statements (assessed by the Case Study)</w:t>
+        <w:t>Ability Statements (assessed by the Practical Performance)</w:t>
       </w:r>
     </w:p>
     <w:tbl>
@@ -2041,7 +1841,7 @@
         <w:pStyle w:val="Heading1"/>
       </w:pPr>
       <w:r>
-        <w:t>2. Daily Schedule</w:t>
+        <w:t>2. Course Schedule</w:t>
       </w:r>
     </w:p>
     <w:p>
@@ -2055,7 +1855,7 @@
           <w:color w:val="555B66"/>
           <w:sz w:val="20"/>
         </w:rPr>
-        <w:t>Each training day runs 9:30am – 6:30pm and delivers 8 instructional hours. A 1-hour lunch break is excluded from instructional time; short tea breaks are counted within the day.</w:t>
+        <w:t>The training day runs 9:00am – 6:00pm and delivers 8 instructional hours. A 1-hour lunch break is excluded from instructional time; short tea breaks are counted within the day. The 1-hour assessment runs 6:00pm – 7:00pm.</w:t>
       </w:r>
     </w:p>
     <w:p>
@@ -2063,7 +1863,7 @@
         <w:pStyle w:val="Heading2"/>
       </w:pPr>
       <w:r>
-        <w:t>Day 1 — Generative AI Security</w:t>
+        <w:t>One-Day Schedule (Topics 1–3)</w:t>
       </w:r>
     </w:p>
     <w:p>
@@ -2077,7 +1877,7 @@
           <w:color w:val="555B66"/>
           <w:sz w:val="19"/>
         </w:rPr>
-        <w:t>Slides 1–98 of the trainer deck.</w:t>
+        <w:t>Slides 1–124 of the trainer deck.</w:t>
       </w:r>
     </w:p>
     <w:tbl>
@@ -2179,7 +1979,7 @@
                 <w:b w:val="0"/>
                 <w:sz w:val="19"/>
               </w:rPr>
-              <w:t>9:30 – 9:50</w:t>
+              <w:t>9:00 – 9:20</w:t>
             </w:r>
           </w:p>
         </w:tc>
@@ -2199,7 +1999,7 @@
                 <w:b w:val="0"/>
                 <w:sz w:val="19"/>
               </w:rPr>
-              <w:t>Welcome, digital attendance, introductions, learning outcomes and safe-lab boundaries</w:t>
+              <w:t>Welcome, digital attendance, introductions, learning outcomes and ground rules</w:t>
             </w:r>
           </w:p>
         </w:tc>
@@ -2244,7 +2044,7 @@
                 <w:b w:val="0"/>
                 <w:sz w:val="19"/>
               </w:rPr>
-              <w:t>9:50 – 10:35</w:t>
+              <w:t>9:20 – 10:05</w:t>
             </w:r>
           </w:p>
         </w:tc>
@@ -2264,7 +2064,7 @@
                 <w:b w:val="0"/>
                 <w:sz w:val="19"/>
               </w:rPr>
-              <w:t>AI history: symbolic systems, machine learning, deep learning, transformers and instruction following (K2)</w:t>
+              <w:t>Topic 1: Brief history of AI 2023-2026; how generative AI works — autoregressive LLM, training and inference (K2, K5)</w:t>
             </w:r>
           </w:p>
         </w:tc>
@@ -2296,6 +2096,71 @@
         <w:tc>
           <w:tcPr>
             <w:tcW w:type="dxa" w:w="1656"/>
+            <w:shd w:val="clear" w:color="auto" w:fill="E8F0FE"/>
+          </w:tcPr>
+          <w:p>
+            <w:pPr>
+              <w:keepLines/>
+            </w:pPr>
+            <w:r/>
+            <w:r>
+              <w:rPr>
+                <w:rFonts w:ascii="Arial" w:hAnsi="Arial"/>
+                <w:b w:val="0"/>
+                <w:sz w:val="19"/>
+              </w:rPr>
+              <w:t>10:05 – 10:45</w:t>
+            </w:r>
+          </w:p>
+        </w:tc>
+        <w:tc>
+          <w:tcPr>
+            <w:tcW w:type="dxa" w:w="7416"/>
+            <w:shd w:val="clear" w:color="auto" w:fill="E8F0FE"/>
+          </w:tcPr>
+          <w:p>
+            <w:pPr>
+              <w:keepLines/>
+            </w:pPr>
+            <w:r/>
+            <w:r>
+              <w:rPr>
+                <w:rFonts w:ascii="Arial" w:hAnsi="Arial"/>
+                <w:b w:val="0"/>
+                <w:sz w:val="19"/>
+              </w:rPr>
+              <w:t>Topic 1: Real generative-AI use cases (AI fashion models, AI video, Klarna); context engineering (K3, A3, A4)</w:t>
+            </w:r>
+          </w:p>
+        </w:tc>
+        <w:tc>
+          <w:tcPr>
+            <w:tcW w:type="dxa" w:w="1224"/>
+            <w:shd w:val="clear" w:color="auto" w:fill="E8F0FE"/>
+          </w:tcPr>
+          <w:p>
+            <w:pPr>
+              <w:keepLines/>
+            </w:pPr>
+            <w:r/>
+            <w:r>
+              <w:rPr>
+                <w:rFonts w:ascii="Arial" w:hAnsi="Arial"/>
+                <w:b w:val="0"/>
+                <w:sz w:val="19"/>
+              </w:rPr>
+              <w:t>40 min</w:t>
+            </w:r>
+          </w:p>
+        </w:tc>
+      </w:tr>
+      <w:tr>
+        <w:trPr>
+          <w:cantSplit/>
+        </w:trPr>
+        <w:tc>
+          <w:tcPr>
+            <w:tcW w:type="dxa" w:w="1656"/>
             <w:shd w:val="clear" w:color="auto" w:fill="FDF3E3"/>
           </w:tcPr>
           <w:p>
@@ -2309,7 +2174,7 @@
                 <w:b w:val="0"/>
                 <w:sz w:val="19"/>
               </w:rPr>
-              <w:t>10:35 – 10:50</w:t>
+              <w:t>10:45 – 11:00</w:t>
             </w:r>
           </w:p>
         </w:tc>
@@ -2374,7 +2239,7 @@
                 <w:b w:val="0"/>
                 <w:sz w:val="19"/>
               </w:rPr>
-              <w:t>10:50 – 11:35</w:t>
+              <w:t>11:00 – 11:45</w:t>
             </w:r>
           </w:p>
         </w:tc>
@@ -2394,7 +2259,7 @@
                 <w:b w:val="0"/>
                 <w:sz w:val="19"/>
               </w:rPr>
-              <w:t>Generative AI, agentic behaviour and deployed AI agents as overlapping operating layers (K2, K3)</w:t>
+              <w:t>Topic 1: Agentic loop and harness engineering; AI agents, OpenClaw and Hermes, skills, tools and multi-agent systems (K2, K3)</w:t>
             </w:r>
           </w:p>
         </w:tc>
@@ -2426,7 +2291,7 @@
         <w:tc>
           <w:tcPr>
             <w:tcW w:type="dxa" w:w="1656"/>
-            <w:shd w:val="clear" w:color="auto" w:fill="E8F0FE"/>
+            <w:shd w:val="clear" w:color="auto" w:fill="E6F7F1"/>
           </w:tcPr>
           <w:p>
             <w:pPr>
@@ -2439,14 +2304,14 @@
                 <w:b w:val="0"/>
                 <w:sz w:val="19"/>
               </w:rPr>
-              <w:t>11:35 – 12:30</w:t>
+              <w:t>11:45 – 12:30</w:t>
             </w:r>
           </w:p>
         </w:tc>
         <w:tc>
           <w:tcPr>
             <w:tcW w:type="dxa" w:w="7416"/>
-            <w:shd w:val="clear" w:color="auto" w:fill="E8F0FE"/>
+            <w:shd w:val="clear" w:color="auto" w:fill="E6F7F1"/>
           </w:tcPr>
           <w:p>
             <w:pPr>
@@ -2459,14 +2324,14 @@
                 <w:b w:val="0"/>
                 <w:sz w:val="19"/>
               </w:rPr>
-              <w:t>Strengths, weaknesses and examples: OpenClaw, Hermes, Claude Code, Codex, ChatGPT Work, DeepSeek model/harness and evidence gates</w:t>
+              <w:t>Activity 1: Talk to the TIA Support AI agent on WhatsApp and post reflections to the Pinboard; debrief (A2, A4)</w:t>
             </w:r>
           </w:p>
         </w:tc>
         <w:tc>
           <w:tcPr>
             <w:tcW w:type="dxa" w:w="1224"/>
-            <w:shd w:val="clear" w:color="auto" w:fill="E8F0FE"/>
+            <w:shd w:val="clear" w:color="auto" w:fill="E6F7F1"/>
           </w:tcPr>
           <w:p>
             <w:pPr>
@@ -2479,7 +2344,7 @@
                 <w:b w:val="0"/>
                 <w:sz w:val="19"/>
               </w:rPr>
-              <w:t>55 min</w:t>
+              <w:t>45 min</w:t>
             </w:r>
           </w:p>
         </w:tc>
@@ -2569,7 +2434,7 @@
                 <w:b w:val="0"/>
                 <w:sz w:val="19"/>
               </w:rPr>
-              <w:t>1:30 – 2:15</w:t>
+              <w:t>1:30 – 1:45</w:t>
             </w:r>
           </w:p>
         </w:tc>
@@ -2589,7 +2454,7 @@
                 <w:b w:val="0"/>
                 <w:sz w:val="19"/>
               </w:rPr>
-              <w:t>Capability, data, token, code-execution, skill/plugin/MCP, network and approval matrices</w:t>
+              <w:t>Topic 1 summary: generative AI vs agentic AI vs AI agents</w:t>
             </w:r>
           </w:p>
         </w:tc>
@@ -2609,7 +2474,7 @@
                 <w:b w:val="0"/>
                 <w:sz w:val="19"/>
               </w:rPr>
-              <w:t>45 min</w:t>
+              <w:t>15 min</w:t>
             </w:r>
           </w:p>
         </w:tc>
@@ -2634,7 +2499,7 @@
                 <w:b w:val="0"/>
                 <w:sz w:val="19"/>
               </w:rPr>
-              <w:t>2:15 – 3:00</w:t>
+              <w:t>1:45 – 2:20</w:t>
             </w:r>
           </w:p>
         </w:tc>
@@ -2654,7 +2519,7 @@
                 <w:b w:val="0"/>
                 <w:sz w:val="19"/>
               </w:rPr>
-              <w:t>Threat modelling: assets, actors, trust boundaries, authority paths and abuse cases (K1, K5)</w:t>
+              <w:t>Topic 2: Install the Hermes agent on MiniMax M2.7; principles of prompt engineering, good vs bad prompts (K4, A5)</w:t>
             </w:r>
           </w:p>
         </w:tc>
@@ -2674,7 +2539,7 @@
                 <w:b w:val="0"/>
                 <w:sz w:val="19"/>
               </w:rPr>
-              <w:t>45 min</w:t>
+              <w:t>35 min</w:t>
             </w:r>
           </w:p>
         </w:tc>
@@ -2699,7 +2564,7 @@
                 <w:b w:val="0"/>
                 <w:sz w:val="19"/>
               </w:rPr>
-              <w:t>3:00 – 3:45</w:t>
+              <w:t>2:20 – 3:10</w:t>
             </w:r>
           </w:p>
         </w:tc>
@@ -2719,7 +2584,7 @@
                 <w:b w:val="0"/>
                 <w:sz w:val="19"/>
               </w:rPr>
-              <w:t>Activity 1: Threat Modelling a Generative AI Concierge (K2, K3, A4)</w:t>
+              <w:t>Activity 2 &amp; 3: Send prompts to analyse mock Excel data and build an animated PPT; compare good vs bad prompts (K4, A5)</w:t>
             </w:r>
           </w:p>
         </w:tc>
@@ -2739,7 +2604,7 @@
                 <w:b w:val="0"/>
                 <w:sz w:val="19"/>
               </w:rPr>
-              <w:t>45 min</w:t>
+              <w:t>50 min</w:t>
             </w:r>
           </w:p>
         </w:tc>
@@ -2764,7 +2629,7 @@
                 <w:b w:val="0"/>
                 <w:sz w:val="19"/>
               </w:rPr>
-              <w:t>3:45 – 4:00</w:t>
+              <w:t>3:10 – 3:25</w:t>
             </w:r>
           </w:p>
         </w:tc>
@@ -2816,530 +2681,6 @@
         <w:tc>
           <w:tcPr>
             <w:tcW w:type="dxa" w:w="1656"/>
-            <w:shd w:val="clear" w:color="auto" w:fill="E8F0FE"/>
-          </w:tcPr>
-          <w:p>
-            <w:pPr>
-              <w:keepLines/>
-            </w:pPr>
-            <w:r/>
-            <w:r>
-              <w:rPr>
-                <w:rFonts w:ascii="Arial" w:hAnsi="Arial"/>
-                <w:b w:val="0"/>
-                <w:sz w:val="19"/>
-              </w:rPr>
-              <w:t>4:00 – 4:45</w:t>
-            </w:r>
-          </w:p>
-        </w:tc>
-        <w:tc>
-          <w:tcPr>
-            <w:tcW w:type="dxa" w:w="7416"/>
-            <w:shd w:val="clear" w:color="auto" w:fill="E8F0FE"/>
-          </w:tcPr>
-          <w:p>
-            <w:pPr>
-              <w:keepLines/>
-            </w:pPr>
-            <w:r/>
-            <w:r>
-              <w:rPr>
-                <w:rFonts w:ascii="Arial" w:hAnsi="Arial"/>
-                <w:b w:val="0"/>
-                <w:sz w:val="19"/>
-              </w:rPr>
-              <w:t>Attack surfaces by operating layer: content, state, identity, tools, runtime and network</w:t>
-            </w:r>
-          </w:p>
-        </w:tc>
-        <w:tc>
-          <w:tcPr>
-            <w:tcW w:type="dxa" w:w="1224"/>
-            <w:shd w:val="clear" w:color="auto" w:fill="E8F0FE"/>
-          </w:tcPr>
-          <w:p>
-            <w:pPr>
-              <w:keepLines/>
-            </w:pPr>
-            <w:r/>
-            <w:r>
-              <w:rPr>
-                <w:rFonts w:ascii="Arial" w:hAnsi="Arial"/>
-                <w:b w:val="0"/>
-                <w:sz w:val="19"/>
-              </w:rPr>
-              <w:t>45 min</w:t>
-            </w:r>
-          </w:p>
-        </w:tc>
-      </w:tr>
-      <w:tr>
-        <w:trPr>
-          <w:cantSplit/>
-        </w:trPr>
-        <w:tc>
-          <w:tcPr>
-            <w:tcW w:type="dxa" w:w="1656"/>
-            <w:shd w:val="clear" w:color="auto" w:fill="E8F0FE"/>
-          </w:tcPr>
-          <w:p>
-            <w:pPr>
-              <w:keepLines/>
-            </w:pPr>
-            <w:r/>
-            <w:r>
-              <w:rPr>
-                <w:rFonts w:ascii="Arial" w:hAnsi="Arial"/>
-                <w:b w:val="0"/>
-                <w:sz w:val="19"/>
-              </w:rPr>
-              <w:t>4:45 – 5:30</w:t>
-            </w:r>
-          </w:p>
-        </w:tc>
-        <w:tc>
-          <w:tcPr>
-            <w:tcW w:type="dxa" w:w="7416"/>
-            <w:shd w:val="clear" w:color="auto" w:fill="E8F0FE"/>
-          </w:tcPr>
-          <w:p>
-            <w:pPr>
-              <w:keepLines/>
-            </w:pPr>
-            <w:r/>
-            <w:r>
-              <w:rPr>
-                <w:rFonts w:ascii="Arial" w:hAnsi="Arial"/>
-                <w:b w:val="0"/>
-                <w:sz w:val="19"/>
-              </w:rPr>
-              <w:t>Complete attack chains, source-to-sink reasoning and evidence classification</w:t>
-            </w:r>
-          </w:p>
-        </w:tc>
-        <w:tc>
-          <w:tcPr>
-            <w:tcW w:type="dxa" w:w="1224"/>
-            <w:shd w:val="clear" w:color="auto" w:fill="E8F0FE"/>
-          </w:tcPr>
-          <w:p>
-            <w:pPr>
-              <w:keepLines/>
-            </w:pPr>
-            <w:r/>
-            <w:r>
-              <w:rPr>
-                <w:rFonts w:ascii="Arial" w:hAnsi="Arial"/>
-                <w:b w:val="0"/>
-                <w:sz w:val="19"/>
-              </w:rPr>
-              <w:t>45 min</w:t>
-            </w:r>
-          </w:p>
-        </w:tc>
-      </w:tr>
-      <w:tr>
-        <w:trPr>
-          <w:cantSplit/>
-        </w:trPr>
-        <w:tc>
-          <w:tcPr>
-            <w:tcW w:type="dxa" w:w="1656"/>
-            <w:shd w:val="clear" w:color="auto" w:fill="E8F0FE"/>
-          </w:tcPr>
-          <w:p>
-            <w:pPr>
-              <w:keepLines/>
-            </w:pPr>
-            <w:r/>
-            <w:r>
-              <w:rPr>
-                <w:rFonts w:ascii="Arial" w:hAnsi="Arial"/>
-                <w:b w:val="0"/>
-                <w:sz w:val="19"/>
-              </w:rPr>
-              <w:t>5:30 – 6:15</w:t>
-            </w:r>
-          </w:p>
-        </w:tc>
-        <w:tc>
-          <w:tcPr>
-            <w:tcW w:type="dxa" w:w="7416"/>
-            <w:shd w:val="clear" w:color="auto" w:fill="E8F0FE"/>
-          </w:tcPr>
-          <w:p>
-            <w:pPr>
-              <w:keepLines/>
-            </w:pPr>
-            <w:r/>
-            <w:r>
-              <w:rPr>
-                <w:rFonts w:ascii="Arial" w:hAnsi="Arial"/>
-                <w:b w:val="0"/>
-                <w:sz w:val="19"/>
-              </w:rPr>
-              <w:t>Integrated risk matrix and preview of structural controls, approvals and evidence</w:t>
-            </w:r>
-          </w:p>
-        </w:tc>
-        <w:tc>
-          <w:tcPr>
-            <w:tcW w:type="dxa" w:w="1224"/>
-            <w:shd w:val="clear" w:color="auto" w:fill="E8F0FE"/>
-          </w:tcPr>
-          <w:p>
-            <w:pPr>
-              <w:keepLines/>
-            </w:pPr>
-            <w:r/>
-            <w:r>
-              <w:rPr>
-                <w:rFonts w:ascii="Arial" w:hAnsi="Arial"/>
-                <w:b w:val="0"/>
-                <w:sz w:val="19"/>
-              </w:rPr>
-              <w:t>45 min</w:t>
-            </w:r>
-          </w:p>
-        </w:tc>
-      </w:tr>
-      <w:tr>
-        <w:trPr>
-          <w:cantSplit/>
-        </w:trPr>
-        <w:tc>
-          <w:tcPr>
-            <w:tcW w:type="dxa" w:w="1656"/>
-            <w:shd w:val="clear" w:color="auto" w:fill="F2F4F7"/>
-          </w:tcPr>
-          <w:p>
-            <w:pPr>
-              <w:keepLines/>
-            </w:pPr>
-            <w:r/>
-            <w:r>
-              <w:rPr>
-                <w:rFonts w:ascii="Arial" w:hAnsi="Arial"/>
-                <w:b w:val="0"/>
-                <w:sz w:val="19"/>
-              </w:rPr>
-              <w:t>6:15 – 6:30</w:t>
-            </w:r>
-          </w:p>
-        </w:tc>
-        <w:tc>
-          <w:tcPr>
-            <w:tcW w:type="dxa" w:w="7416"/>
-            <w:shd w:val="clear" w:color="auto" w:fill="F2F4F7"/>
-          </w:tcPr>
-          <w:p>
-            <w:pPr>
-              <w:keepLines/>
-            </w:pPr>
-            <w:r/>
-            <w:r>
-              <w:rPr>
-                <w:rFonts w:ascii="Arial" w:hAnsi="Arial"/>
-                <w:b w:val="0"/>
-                <w:sz w:val="19"/>
-              </w:rPr>
-              <w:t>Day 1 recap, Q&amp;A and PM digital attendance</w:t>
-            </w:r>
-          </w:p>
-        </w:tc>
-        <w:tc>
-          <w:tcPr>
-            <w:tcW w:type="dxa" w:w="1224"/>
-            <w:shd w:val="clear" w:color="auto" w:fill="F2F4F7"/>
-          </w:tcPr>
-          <w:p>
-            <w:pPr>
-              <w:keepLines/>
-            </w:pPr>
-            <w:r/>
-            <w:r>
-              <w:rPr>
-                <w:rFonts w:ascii="Arial" w:hAnsi="Arial"/>
-                <w:b w:val="0"/>
-                <w:sz w:val="19"/>
-              </w:rPr>
-              <w:t>15 min</w:t>
-            </w:r>
-          </w:p>
-        </w:tc>
-      </w:tr>
-    </w:tbl>
-    <w:p>
-      <w:pPr>
-        <w:spacing w:after="120"/>
-      </w:pPr>
-      <w:r>
-        <w:rPr>
-          <w:rFonts w:ascii="Arial" w:hAnsi="Arial"/>
-          <w:b w:val="0"/>
-          <w:color w:val="111827"/>
-          <w:sz w:val="22"/>
-        </w:rPr>
-      </w:r>
-    </w:p>
-    <w:p>
-      <w:pPr>
-        <w:spacing w:after="120"/>
-      </w:pPr>
-      <w:r>
-        <w:rPr>
-          <w:rFonts w:ascii="Arial" w:hAnsi="Arial"/>
-          <w:b/>
-          <w:color w:val="111827"/>
-          <w:sz w:val="20"/>
-        </w:rPr>
-        <w:t>Day 1 instructional total: 480 minutes (8 hours), excluding the 1-hour lunch break.</w:t>
-      </w:r>
-    </w:p>
-    <w:p>
-      <w:r>
-        <w:br w:type="page"/>
-      </w:r>
-    </w:p>
-    <w:p>
-      <w:pPr>
-        <w:pStyle w:val="Heading2"/>
-      </w:pPr>
-      <w:r>
-        <w:t>Day 2 — Autonomous Agent Security</w:t>
-      </w:r>
-    </w:p>
-    <w:p>
-      <w:pPr>
-        <w:spacing w:after="120"/>
-      </w:pPr>
-      <w:r>
-        <w:rPr>
-          <w:rFonts w:ascii="Arial" w:hAnsi="Arial"/>
-          <w:b w:val="0"/>
-          <w:color w:val="555B66"/>
-          <w:sz w:val="19"/>
-        </w:rPr>
-        <w:t>Slides 99–207 of the trainer deck.</w:t>
-      </w:r>
-    </w:p>
-    <w:tbl>
-      <w:tblPr>
-        <w:tblStyle w:val="TableGrid"/>
-        <w:tblW w:type="auto" w:w="0"/>
-        <w:tblLook w:firstColumn="1" w:firstRow="1" w:lastColumn="0" w:lastRow="0" w:noHBand="0" w:noVBand="1" w:val="04A0"/>
-      </w:tblPr>
-      <w:tblGrid>
-        <w:gridCol w:w="2880"/>
-        <w:gridCol w:w="2880"/>
-        <w:gridCol w:w="2880"/>
-      </w:tblGrid>
-      <w:tr>
-        <w:trPr>
-          <w:cantSplit/>
-        </w:trPr>
-        <w:tc>
-          <w:tcPr>
-            <w:tcW w:type="dxa" w:w="1656"/>
-            <w:shd w:val="clear" w:color="auto" w:fill="1F6FEB"/>
-          </w:tcPr>
-          <w:p>
-            <w:pPr>
-              <w:keepLines/>
-            </w:pPr>
-            <w:r/>
-            <w:r>
-              <w:rPr>
-                <w:rFonts w:ascii="Arial" w:hAnsi="Arial"/>
-                <w:b/>
-                <w:color w:val="FFFFFF"/>
-                <w:sz w:val="20"/>
-              </w:rPr>
-              <w:t>Time</w:t>
-            </w:r>
-          </w:p>
-        </w:tc>
-        <w:tc>
-          <w:tcPr>
-            <w:tcW w:type="dxa" w:w="7416"/>
-            <w:shd w:val="clear" w:color="auto" w:fill="1F6FEB"/>
-          </w:tcPr>
-          <w:p>
-            <w:pPr>
-              <w:keepLines/>
-            </w:pPr>
-            <w:r/>
-            <w:r>
-              <w:rPr>
-                <w:rFonts w:ascii="Arial" w:hAnsi="Arial"/>
-                <w:b/>
-                <w:color w:val="FFFFFF"/>
-                <w:sz w:val="20"/>
-              </w:rPr>
-              <w:t>Topic / Activity</w:t>
-            </w:r>
-          </w:p>
-        </w:tc>
-        <w:tc>
-          <w:tcPr>
-            <w:tcW w:type="dxa" w:w="1224"/>
-            <w:shd w:val="clear" w:color="auto" w:fill="1F6FEB"/>
-          </w:tcPr>
-          <w:p>
-            <w:pPr>
-              <w:keepLines/>
-            </w:pPr>
-            <w:r/>
-            <w:r>
-              <w:rPr>
-                <w:rFonts w:ascii="Arial" w:hAnsi="Arial"/>
-                <w:b/>
-                <w:color w:val="FFFFFF"/>
-                <w:sz w:val="20"/>
-              </w:rPr>
-              <w:t>Duration</w:t>
-            </w:r>
-          </w:p>
-        </w:tc>
-      </w:tr>
-      <w:tr>
-        <w:trPr>
-          <w:cantSplit/>
-        </w:trPr>
-        <w:tc>
-          <w:tcPr>
-            <w:tcW w:type="dxa" w:w="1656"/>
-            <w:shd w:val="clear" w:color="auto" w:fill="F2F4F7"/>
-          </w:tcPr>
-          <w:p>
-            <w:pPr>
-              <w:keepLines/>
-            </w:pPr>
-            <w:r/>
-            <w:r>
-              <w:rPr>
-                <w:rFonts w:ascii="Arial" w:hAnsi="Arial"/>
-                <w:b w:val="0"/>
-                <w:sz w:val="19"/>
-              </w:rPr>
-              <w:t>9:30 – 9:40</w:t>
-            </w:r>
-          </w:p>
-        </w:tc>
-        <w:tc>
-          <w:tcPr>
-            <w:tcW w:type="dxa" w:w="7416"/>
-            <w:shd w:val="clear" w:color="auto" w:fill="F2F4F7"/>
-          </w:tcPr>
-          <w:p>
-            <w:pPr>
-              <w:keepLines/>
-            </w:pPr>
-            <w:r/>
-            <w:r>
-              <w:rPr>
-                <w:rFonts w:ascii="Arial" w:hAnsi="Arial"/>
-                <w:b w:val="0"/>
-                <w:sz w:val="19"/>
-              </w:rPr>
-              <w:t>Day 1 recap and AM digital attendance</w:t>
-            </w:r>
-          </w:p>
-        </w:tc>
-        <w:tc>
-          <w:tcPr>
-            <w:tcW w:type="dxa" w:w="1224"/>
-            <w:shd w:val="clear" w:color="auto" w:fill="F2F4F7"/>
-          </w:tcPr>
-          <w:p>
-            <w:pPr>
-              <w:keepLines/>
-            </w:pPr>
-            <w:r/>
-            <w:r>
-              <w:rPr>
-                <w:rFonts w:ascii="Arial" w:hAnsi="Arial"/>
-                <w:b w:val="0"/>
-                <w:sz w:val="19"/>
-              </w:rPr>
-              <w:t>10 min</w:t>
-            </w:r>
-          </w:p>
-        </w:tc>
-      </w:tr>
-      <w:tr>
-        <w:trPr>
-          <w:cantSplit/>
-        </w:trPr>
-        <w:tc>
-          <w:tcPr>
-            <w:tcW w:type="dxa" w:w="1656"/>
-            <w:shd w:val="clear" w:color="auto" w:fill="E8F0FE"/>
-          </w:tcPr>
-          <w:p>
-            <w:pPr>
-              <w:keepLines/>
-            </w:pPr>
-            <w:r/>
-            <w:r>
-              <w:rPr>
-                <w:rFonts w:ascii="Arial" w:hAnsi="Arial"/>
-                <w:b w:val="0"/>
-                <w:sz w:val="19"/>
-              </w:rPr>
-              <w:t>9:40 – 10:00</w:t>
-            </w:r>
-          </w:p>
-        </w:tc>
-        <w:tc>
-          <w:tcPr>
-            <w:tcW w:type="dxa" w:w="7416"/>
-            <w:shd w:val="clear" w:color="auto" w:fill="E8F0FE"/>
-          </w:tcPr>
-          <w:p>
-            <w:pPr>
-              <w:keepLines/>
-            </w:pPr>
-            <w:r/>
-            <w:r>
-              <w:rPr>
-                <w:rFonts w:ascii="Arial" w:hAnsi="Arial"/>
-                <w:b w:val="0"/>
-                <w:sz w:val="19"/>
-              </w:rPr>
-              <w:t>Prompt injection, jailbreaks, injection carriers and structural control principles (K4)</w:t>
-            </w:r>
-          </w:p>
-        </w:tc>
-        <w:tc>
-          <w:tcPr>
-            <w:tcW w:type="dxa" w:w="1224"/>
-            <w:shd w:val="clear" w:color="auto" w:fill="E8F0FE"/>
-          </w:tcPr>
-          <w:p>
-            <w:pPr>
-              <w:keepLines/>
-            </w:pPr>
-            <w:r/>
-            <w:r>
-              <w:rPr>
-                <w:rFonts w:ascii="Arial" w:hAnsi="Arial"/>
-                <w:b w:val="0"/>
-                <w:sz w:val="19"/>
-              </w:rPr>
-              <w:t>20 min</w:t>
-            </w:r>
-          </w:p>
-        </w:tc>
-      </w:tr>
-      <w:tr>
-        <w:trPr>
-          <w:cantSplit/>
-        </w:trPr>
-        <w:tc>
-          <w:tcPr>
-            <w:tcW w:type="dxa" w:w="1656"/>
             <w:shd w:val="clear" w:color="auto" w:fill="E6F7F1"/>
           </w:tcPr>
           <w:p>
@@ -3353,7 +2694,7 @@
                 <w:b w:val="0"/>
                 <w:sz w:val="19"/>
               </w:rPr>
-              <w:t>10:00 – 11:00</w:t>
+              <w:t>3:25 – 3:50</w:t>
             </w:r>
           </w:p>
         </w:tc>
@@ -3373,7 +2714,7 @@
                 <w:b w:val="0"/>
                 <w:sz w:val="19"/>
               </w:rPr>
-              <w:t>Activity 2: Prompt Injection and the PDPA Breach Decision (K4, K1)</w:t>
+              <w:t>Activity 4: Install tools and skills, re-run the Excel and PPT tasks; Topic 2 reflection and debrief (A1, A5)</w:t>
             </w:r>
           </w:p>
         </w:tc>
@@ -3381,591 +2722,6 @@
           <w:tcPr>
             <w:tcW w:type="dxa" w:w="1224"/>
             <w:shd w:val="clear" w:color="auto" w:fill="E6F7F1"/>
-          </w:tcPr>
-          <w:p>
-            <w:pPr>
-              <w:keepLines/>
-            </w:pPr>
-            <w:r/>
-            <w:r>
-              <w:rPr>
-                <w:rFonts w:ascii="Arial" w:hAnsi="Arial"/>
-                <w:b w:val="0"/>
-                <w:sz w:val="19"/>
-              </w:rPr>
-              <w:t>60 min</w:t>
-            </w:r>
-          </w:p>
-        </w:tc>
-      </w:tr>
-      <w:tr>
-        <w:trPr>
-          <w:cantSplit/>
-        </w:trPr>
-        <w:tc>
-          <w:tcPr>
-            <w:tcW w:type="dxa" w:w="1656"/>
-            <w:shd w:val="clear" w:color="auto" w:fill="FDF3E3"/>
-          </w:tcPr>
-          <w:p>
-            <w:pPr>
-              <w:keepLines/>
-            </w:pPr>
-            <w:r/>
-            <w:r>
-              <w:rPr>
-                <w:rFonts w:ascii="Arial" w:hAnsi="Arial"/>
-                <w:b w:val="0"/>
-                <w:sz w:val="19"/>
-              </w:rPr>
-              <w:t>11:00 – 11:15</w:t>
-            </w:r>
-          </w:p>
-        </w:tc>
-        <w:tc>
-          <w:tcPr>
-            <w:tcW w:type="dxa" w:w="7416"/>
-            <w:shd w:val="clear" w:color="auto" w:fill="FDF3E3"/>
-          </w:tcPr>
-          <w:p>
-            <w:pPr>
-              <w:keepLines/>
-            </w:pPr>
-            <w:r/>
-            <w:r>
-              <w:rPr>
-                <w:rFonts w:ascii="Arial" w:hAnsi="Arial"/>
-                <w:b w:val="0"/>
-                <w:sz w:val="19"/>
-              </w:rPr>
-              <w:t>Tea break</w:t>
-            </w:r>
-          </w:p>
-        </w:tc>
-        <w:tc>
-          <w:tcPr>
-            <w:tcW w:type="dxa" w:w="1224"/>
-            <w:shd w:val="clear" w:color="auto" w:fill="FDF3E3"/>
-          </w:tcPr>
-          <w:p>
-            <w:pPr>
-              <w:keepLines/>
-            </w:pPr>
-            <w:r/>
-            <w:r>
-              <w:rPr>
-                <w:rFonts w:ascii="Arial" w:hAnsi="Arial"/>
-                <w:b w:val="0"/>
-                <w:sz w:val="19"/>
-              </w:rPr>
-              <w:t>15 min</w:t>
-            </w:r>
-          </w:p>
-        </w:tc>
-      </w:tr>
-      <w:tr>
-        <w:trPr>
-          <w:cantSplit/>
-        </w:trPr>
-        <w:tc>
-          <w:tcPr>
-            <w:tcW w:type="dxa" w:w="1656"/>
-            <w:shd w:val="clear" w:color="auto" w:fill="E8F0FE"/>
-          </w:tcPr>
-          <w:p>
-            <w:pPr>
-              <w:keepLines/>
-            </w:pPr>
-            <w:r/>
-            <w:r>
-              <w:rPr>
-                <w:rFonts w:ascii="Arial" w:hAnsi="Arial"/>
-                <w:b w:val="0"/>
-                <w:sz w:val="19"/>
-              </w:rPr>
-              <w:t>11:15 – 11:40</w:t>
-            </w:r>
-          </w:p>
-        </w:tc>
-        <w:tc>
-          <w:tcPr>
-            <w:tcW w:type="dxa" w:w="7416"/>
-            <w:shd w:val="clear" w:color="auto" w:fill="E8F0FE"/>
-          </w:tcPr>
-          <w:p>
-            <w:pPr>
-              <w:keepLines/>
-            </w:pPr>
-            <w:r/>
-            <w:r>
-              <w:rPr>
-                <w:rFonts w:ascii="Arial" w:hAnsi="Arial"/>
-                <w:b w:val="0"/>
-                <w:sz w:val="19"/>
-              </w:rPr>
-              <w:t>Personal data, secrets, tokens, retention, transfers and the PDPA breach decision</w:t>
-            </w:r>
-          </w:p>
-        </w:tc>
-        <w:tc>
-          <w:tcPr>
-            <w:tcW w:type="dxa" w:w="1224"/>
-            <w:shd w:val="clear" w:color="auto" w:fill="E8F0FE"/>
-          </w:tcPr>
-          <w:p>
-            <w:pPr>
-              <w:keepLines/>
-            </w:pPr>
-            <w:r/>
-            <w:r>
-              <w:rPr>
-                <w:rFonts w:ascii="Arial" w:hAnsi="Arial"/>
-                <w:b w:val="0"/>
-                <w:sz w:val="19"/>
-              </w:rPr>
-              <w:t>25 min</w:t>
-            </w:r>
-          </w:p>
-        </w:tc>
-      </w:tr>
-      <w:tr>
-        <w:trPr>
-          <w:cantSplit/>
-        </w:trPr>
-        <w:tc>
-          <w:tcPr>
-            <w:tcW w:type="dxa" w:w="1656"/>
-            <w:shd w:val="clear" w:color="auto" w:fill="E8F0FE"/>
-          </w:tcPr>
-          <w:p>
-            <w:pPr>
-              <w:keepLines/>
-            </w:pPr>
-            <w:r/>
-            <w:r>
-              <w:rPr>
-                <w:rFonts w:ascii="Arial" w:hAnsi="Arial"/>
-                <w:b w:val="0"/>
-                <w:sz w:val="19"/>
-              </w:rPr>
-              <w:t>11:40 – 12:00</w:t>
-            </w:r>
-          </w:p>
-        </w:tc>
-        <w:tc>
-          <w:tcPr>
-            <w:tcW w:type="dxa" w:w="7416"/>
-            <w:shd w:val="clear" w:color="auto" w:fill="E8F0FE"/>
-          </w:tcPr>
-          <w:p>
-            <w:pPr>
-              <w:keepLines/>
-            </w:pPr>
-            <w:r/>
-            <w:r>
-              <w:rPr>
-                <w:rFonts w:ascii="Arial" w:hAnsi="Arial"/>
-                <w:b w:val="0"/>
-                <w:sz w:val="19"/>
-              </w:rPr>
-              <w:t>Framework stack followed by detailed agentic-threat and documented-case instruction (A3, K5)</w:t>
-            </w:r>
-          </w:p>
-        </w:tc>
-        <w:tc>
-          <w:tcPr>
-            <w:tcW w:type="dxa" w:w="1224"/>
-            <w:shd w:val="clear" w:color="auto" w:fill="E8F0FE"/>
-          </w:tcPr>
-          <w:p>
-            <w:pPr>
-              <w:keepLines/>
-            </w:pPr>
-            <w:r/>
-            <w:r>
-              <w:rPr>
-                <w:rFonts w:ascii="Arial" w:hAnsi="Arial"/>
-                <w:b w:val="0"/>
-                <w:sz w:val="19"/>
-              </w:rPr>
-              <w:t>20 min</w:t>
-            </w:r>
-          </w:p>
-        </w:tc>
-      </w:tr>
-      <w:tr>
-        <w:trPr>
-          <w:cantSplit/>
-        </w:trPr>
-        <w:tc>
-          <w:tcPr>
-            <w:tcW w:type="dxa" w:w="1656"/>
-            <w:shd w:val="clear" w:color="auto" w:fill="E6F7F1"/>
-          </w:tcPr>
-          <w:p>
-            <w:pPr>
-              <w:keepLines/>
-            </w:pPr>
-            <w:r/>
-            <w:r>
-              <w:rPr>
-                <w:rFonts w:ascii="Arial" w:hAnsi="Arial"/>
-                <w:b w:val="0"/>
-                <w:sz w:val="19"/>
-              </w:rPr>
-              <w:t>12:00 – 1:00</w:t>
-            </w:r>
-          </w:p>
-        </w:tc>
-        <w:tc>
-          <w:tcPr>
-            <w:tcW w:type="dxa" w:w="7416"/>
-            <w:shd w:val="clear" w:color="auto" w:fill="E6F7F1"/>
-          </w:tcPr>
-          <w:p>
-            <w:pPr>
-              <w:keepLines/>
-            </w:pPr>
-            <w:r/>
-            <w:r>
-              <w:rPr>
-                <w:rFonts w:ascii="Arial" w:hAnsi="Arial"/>
-                <w:b w:val="0"/>
-                <w:sz w:val="19"/>
-              </w:rPr>
-              <w:t>Activity 3: Selecting a Security Framework for GenAI and Agents (A3, A5)</w:t>
-            </w:r>
-          </w:p>
-        </w:tc>
-        <w:tc>
-          <w:tcPr>
-            <w:tcW w:type="dxa" w:w="1224"/>
-            <w:shd w:val="clear" w:color="auto" w:fill="E6F7F1"/>
-          </w:tcPr>
-          <w:p>
-            <w:pPr>
-              <w:keepLines/>
-            </w:pPr>
-            <w:r/>
-            <w:r>
-              <w:rPr>
-                <w:rFonts w:ascii="Arial" w:hAnsi="Arial"/>
-                <w:b w:val="0"/>
-                <w:sz w:val="19"/>
-              </w:rPr>
-              <w:t>60 min</w:t>
-            </w:r>
-          </w:p>
-        </w:tc>
-      </w:tr>
-      <w:tr>
-        <w:trPr>
-          <w:cantSplit/>
-        </w:trPr>
-        <w:tc>
-          <w:tcPr>
-            <w:tcW w:type="dxa" w:w="1656"/>
-            <w:shd w:val="clear" w:color="auto" w:fill="FDF3E3"/>
-          </w:tcPr>
-          <w:p>
-            <w:pPr>
-              <w:keepLines/>
-            </w:pPr>
-            <w:r/>
-            <w:r>
-              <w:rPr>
-                <w:rFonts w:ascii="Arial" w:hAnsi="Arial"/>
-                <w:b w:val="0"/>
-                <w:sz w:val="19"/>
-              </w:rPr>
-              <w:t>1:00 – 2:00</w:t>
-            </w:r>
-          </w:p>
-        </w:tc>
-        <w:tc>
-          <w:tcPr>
-            <w:tcW w:type="dxa" w:w="7416"/>
-            <w:shd w:val="clear" w:color="auto" w:fill="FDF3E3"/>
-          </w:tcPr>
-          <w:p>
-            <w:pPr>
-              <w:keepLines/>
-            </w:pPr>
-            <w:r/>
-            <w:r>
-              <w:rPr>
-                <w:rFonts w:ascii="Arial" w:hAnsi="Arial"/>
-                <w:b w:val="0"/>
-                <w:sz w:val="19"/>
-              </w:rPr>
-              <w:t>Lunch break</w:t>
-            </w:r>
-          </w:p>
-        </w:tc>
-        <w:tc>
-          <w:tcPr>
-            <w:tcW w:type="dxa" w:w="1224"/>
-            <w:shd w:val="clear" w:color="auto" w:fill="FDF3E3"/>
-          </w:tcPr>
-          <w:p>
-            <w:pPr>
-              <w:keepLines/>
-            </w:pPr>
-            <w:r/>
-            <w:r>
-              <w:rPr>
-                <w:rFonts w:ascii="Arial" w:hAnsi="Arial"/>
-                <w:b w:val="0"/>
-                <w:sz w:val="19"/>
-              </w:rPr>
-              <w:t>60 min</w:t>
-            </w:r>
-          </w:p>
-        </w:tc>
-      </w:tr>
-      <w:tr>
-        <w:trPr>
-          <w:cantSplit/>
-        </w:trPr>
-        <w:tc>
-          <w:tcPr>
-            <w:tcW w:type="dxa" w:w="1656"/>
-            <w:shd w:val="clear" w:color="auto" w:fill="E8F0FE"/>
-          </w:tcPr>
-          <w:p>
-            <w:pPr>
-              <w:keepLines/>
-            </w:pPr>
-            <w:r/>
-            <w:r>
-              <w:rPr>
-                <w:rFonts w:ascii="Arial" w:hAnsi="Arial"/>
-                <w:b w:val="0"/>
-                <w:sz w:val="19"/>
-              </w:rPr>
-              <w:t>2:00 – 2:30</w:t>
-            </w:r>
-          </w:p>
-        </w:tc>
-        <w:tc>
-          <w:tcPr>
-            <w:tcW w:type="dxa" w:w="7416"/>
-            <w:shd w:val="clear" w:color="auto" w:fill="E8F0FE"/>
-          </w:tcPr>
-          <w:p>
-            <w:pPr>
-              <w:keepLines/>
-            </w:pPr>
-            <w:r/>
-            <w:r>
-              <w:rPr>
-                <w:rFonts w:ascii="Arial" w:hAnsi="Arial"/>
-                <w:b w:val="0"/>
-                <w:sz w:val="19"/>
-              </w:rPr>
-              <w:t>Activity 3 debrief and evidence bridge into the documented incident review</w:t>
-            </w:r>
-          </w:p>
-        </w:tc>
-        <w:tc>
-          <w:tcPr>
-            <w:tcW w:type="dxa" w:w="1224"/>
-            <w:shd w:val="clear" w:color="auto" w:fill="E8F0FE"/>
-          </w:tcPr>
-          <w:p>
-            <w:pPr>
-              <w:keepLines/>
-            </w:pPr>
-            <w:r/>
-            <w:r>
-              <w:rPr>
-                <w:rFonts w:ascii="Arial" w:hAnsi="Arial"/>
-                <w:b w:val="0"/>
-                <w:sz w:val="19"/>
-              </w:rPr>
-              <w:t>30 min</w:t>
-            </w:r>
-          </w:p>
-        </w:tc>
-      </w:tr>
-      <w:tr>
-        <w:trPr>
-          <w:cantSplit/>
-        </w:trPr>
-        <w:tc>
-          <w:tcPr>
-            <w:tcW w:type="dxa" w:w="1656"/>
-            <w:shd w:val="clear" w:color="auto" w:fill="E6F7F1"/>
-          </w:tcPr>
-          <w:p>
-            <w:pPr>
-              <w:keepLines/>
-            </w:pPr>
-            <w:r/>
-            <w:r>
-              <w:rPr>
-                <w:rFonts w:ascii="Arial" w:hAnsi="Arial"/>
-                <w:b w:val="0"/>
-                <w:sz w:val="19"/>
-              </w:rPr>
-              <w:t>2:30 – 3:30</w:t>
-            </w:r>
-          </w:p>
-        </w:tc>
-        <w:tc>
-          <w:tcPr>
-            <w:tcW w:type="dxa" w:w="7416"/>
-            <w:shd w:val="clear" w:color="auto" w:fill="E6F7F1"/>
-          </w:tcPr>
-          <w:p>
-            <w:pPr>
-              <w:keepLines/>
-            </w:pPr>
-            <w:r/>
-            <w:r>
-              <w:rPr>
-                <w:rFonts w:ascii="Arial" w:hAnsi="Arial"/>
-                <w:b w:val="0"/>
-                <w:sz w:val="19"/>
-              </w:rPr>
-              <w:t>Activity 4: Evidence-Based Rogue Agent Incident Review (K5)</w:t>
-            </w:r>
-          </w:p>
-        </w:tc>
-        <w:tc>
-          <w:tcPr>
-            <w:tcW w:type="dxa" w:w="1224"/>
-            <w:shd w:val="clear" w:color="auto" w:fill="E6F7F1"/>
-          </w:tcPr>
-          <w:p>
-            <w:pPr>
-              <w:keepLines/>
-            </w:pPr>
-            <w:r/>
-            <w:r>
-              <w:rPr>
-                <w:rFonts w:ascii="Arial" w:hAnsi="Arial"/>
-                <w:b w:val="0"/>
-                <w:sz w:val="19"/>
-              </w:rPr>
-              <w:t>60 min</w:t>
-            </w:r>
-          </w:p>
-        </w:tc>
-      </w:tr>
-      <w:tr>
-        <w:trPr>
-          <w:cantSplit/>
-        </w:trPr>
-        <w:tc>
-          <w:tcPr>
-            <w:tcW w:type="dxa" w:w="1656"/>
-            <w:shd w:val="clear" w:color="auto" w:fill="FDF3E3"/>
-          </w:tcPr>
-          <w:p>
-            <w:pPr>
-              <w:keepLines/>
-            </w:pPr>
-            <w:r/>
-            <w:r>
-              <w:rPr>
-                <w:rFonts w:ascii="Arial" w:hAnsi="Arial"/>
-                <w:b w:val="0"/>
-                <w:sz w:val="19"/>
-              </w:rPr>
-              <w:t>3:30 – 3:45</w:t>
-            </w:r>
-          </w:p>
-        </w:tc>
-        <w:tc>
-          <w:tcPr>
-            <w:tcW w:type="dxa" w:w="7416"/>
-            <w:shd w:val="clear" w:color="auto" w:fill="FDF3E3"/>
-          </w:tcPr>
-          <w:p>
-            <w:pPr>
-              <w:keepLines/>
-            </w:pPr>
-            <w:r/>
-            <w:r>
-              <w:rPr>
-                <w:rFonts w:ascii="Arial" w:hAnsi="Arial"/>
-                <w:b w:val="0"/>
-                <w:sz w:val="19"/>
-              </w:rPr>
-              <w:t>Tea break</w:t>
-            </w:r>
-          </w:p>
-        </w:tc>
-        <w:tc>
-          <w:tcPr>
-            <w:tcW w:type="dxa" w:w="1224"/>
-            <w:shd w:val="clear" w:color="auto" w:fill="FDF3E3"/>
-          </w:tcPr>
-          <w:p>
-            <w:pPr>
-              <w:keepLines/>
-            </w:pPr>
-            <w:r/>
-            <w:r>
-              <w:rPr>
-                <w:rFonts w:ascii="Arial" w:hAnsi="Arial"/>
-                <w:b w:val="0"/>
-                <w:sz w:val="19"/>
-              </w:rPr>
-              <w:t>15 min</w:t>
-            </w:r>
-          </w:p>
-        </w:tc>
-      </w:tr>
-      <w:tr>
-        <w:trPr>
-          <w:cantSplit/>
-        </w:trPr>
-        <w:tc>
-          <w:tcPr>
-            <w:tcW w:type="dxa" w:w="1656"/>
-            <w:shd w:val="clear" w:color="auto" w:fill="E8F0FE"/>
-          </w:tcPr>
-          <w:p>
-            <w:pPr>
-              <w:keepLines/>
-            </w:pPr>
-            <w:r/>
-            <w:r>
-              <w:rPr>
-                <w:rFonts w:ascii="Arial" w:hAnsi="Arial"/>
-                <w:b w:val="0"/>
-                <w:sz w:val="19"/>
-              </w:rPr>
-              <w:t>3:45 – 4:10</w:t>
-            </w:r>
-          </w:p>
-        </w:tc>
-        <w:tc>
-          <w:tcPr>
-            <w:tcW w:type="dxa" w:w="7416"/>
-            <w:shd w:val="clear" w:color="auto" w:fill="E8F0FE"/>
-          </w:tcPr>
-          <w:p>
-            <w:pPr>
-              <w:keepLines/>
-            </w:pPr>
-            <w:r/>
-            <w:r>
-              <w:rPr>
-                <w:rFonts w:ascii="Arial" w:hAnsi="Arial"/>
-                <w:b w:val="0"/>
-                <w:sz w:val="19"/>
-              </w:rPr>
-              <w:t>Organisational controls: guardrails, HITL, sandbox, egress, monitoring, deployment and incident gates (A1, A2)</w:t>
-            </w:r>
-          </w:p>
-        </w:tc>
-        <w:tc>
-          <w:tcPr>
-            <w:tcW w:type="dxa" w:w="1224"/>
-            <w:shd w:val="clear" w:color="auto" w:fill="E8F0FE"/>
           </w:tcPr>
           <w:p>
             <w:pPr>
@@ -4003,7 +2759,7 @@
                 <w:b w:val="0"/>
                 <w:sz w:val="19"/>
               </w:rPr>
-              <w:t>4:10 – 4:35</w:t>
+              <w:t>3:50 – 4:35</w:t>
             </w:r>
           </w:p>
         </w:tc>
@@ -4023,7 +2779,7 @@
                 <w:b w:val="0"/>
                 <w:sz w:val="19"/>
               </w:rPr>
-              <w:t>Activity 5: Agent Governance and the Deployment Gate (A1, A2)</w:t>
+              <w:t>Topic 3: AI data governance and accountability (Moffatt v Air Canada); Activity 5 — draft an AI data governance policy (A1, A2)</w:t>
             </w:r>
           </w:p>
         </w:tc>
@@ -4043,7 +2799,7 @@
                 <w:b w:val="0"/>
                 <w:sz w:val="19"/>
               </w:rPr>
-              <w:t>25 min</w:t>
+              <w:t>45 min</w:t>
             </w:r>
           </w:p>
         </w:tc>
@@ -4055,7 +2811,7 @@
         <w:tc>
           <w:tcPr>
             <w:tcW w:type="dxa" w:w="1656"/>
-            <w:shd w:val="clear" w:color="auto" w:fill="F2F4F7"/>
+            <w:shd w:val="clear" w:color="auto" w:fill="E6F7F1"/>
           </w:tcPr>
           <w:p>
             <w:pPr>
@@ -4068,14 +2824,14 @@
                 <w:b w:val="0"/>
                 <w:sz w:val="19"/>
               </w:rPr>
-              <w:t>4:35 – 4:50</w:t>
+              <w:t>4:35 – 5:15</w:t>
             </w:r>
           </w:p>
         </w:tc>
         <w:tc>
           <w:tcPr>
             <w:tcW w:type="dxa" w:w="7416"/>
-            <w:shd w:val="clear" w:color="auto" w:fill="F2F4F7"/>
+            <w:shd w:val="clear" w:color="auto" w:fill="E6F7F1"/>
           </w:tcPr>
           <w:p>
             <w:pPr>
@@ -4088,14 +2844,14 @@
                 <w:b w:val="0"/>
                 <w:sz w:val="19"/>
               </w:rPr>
-              <w:t>Course synthesis, assessment briefing and PM digital attendance</w:t>
+              <w:t>Topic 3: Job impact and redesign; Activity 6 — coaching role-play simulator (A2)</w:t>
             </w:r>
           </w:p>
         </w:tc>
         <w:tc>
           <w:tcPr>
             <w:tcW w:type="dxa" w:w="1224"/>
-            <w:shd w:val="clear" w:color="auto" w:fill="F2F4F7"/>
+            <w:shd w:val="clear" w:color="auto" w:fill="E6F7F1"/>
           </w:tcPr>
           <w:p>
             <w:pPr>
@@ -4108,7 +2864,72 @@
                 <w:b w:val="0"/>
                 <w:sz w:val="19"/>
               </w:rPr>
-              <w:t>15 min</w:t>
+              <w:t>40 min</w:t>
+            </w:r>
+          </w:p>
+        </w:tc>
+      </w:tr>
+      <w:tr>
+        <w:trPr>
+          <w:cantSplit/>
+        </w:trPr>
+        <w:tc>
+          <w:tcPr>
+            <w:tcW w:type="dxa" w:w="1656"/>
+            <w:shd w:val="clear" w:color="auto" w:fill="E6F7F1"/>
+          </w:tcPr>
+          <w:p>
+            <w:pPr>
+              <w:keepLines/>
+            </w:pPr>
+            <w:r/>
+            <w:r>
+              <w:rPr>
+                <w:rFonts w:ascii="Arial" w:hAnsi="Arial"/>
+                <w:b w:val="0"/>
+                <w:sz w:val="19"/>
+              </w:rPr>
+              <w:t>5:15 – 6:00</w:t>
+            </w:r>
+          </w:p>
+        </w:tc>
+        <w:tc>
+          <w:tcPr>
+            <w:tcW w:type="dxa" w:w="7416"/>
+            <w:shd w:val="clear" w:color="auto" w:fill="E6F7F1"/>
+          </w:tcPr>
+          <w:p>
+            <w:pPr>
+              <w:keepLines/>
+            </w:pPr>
+            <w:r/>
+            <w:r>
+              <w:rPr>
+                <w:rFonts w:ascii="Arial" w:hAnsi="Arial"/>
+                <w:b w:val="0"/>
+                <w:sz w:val="19"/>
+              </w:rPr>
+              <w:t>Topic 3: AI-agent cybersecurity risks and safe rollout; Activities 7 &amp; 8 — leaky vs guarded chatbots and security reflection (A1, A2)</w:t>
+            </w:r>
+          </w:p>
+        </w:tc>
+        <w:tc>
+          <w:tcPr>
+            <w:tcW w:type="dxa" w:w="1224"/>
+            <w:shd w:val="clear" w:color="auto" w:fill="E6F7F1"/>
+          </w:tcPr>
+          <w:p>
+            <w:pPr>
+              <w:keepLines/>
+            </w:pPr>
+            <w:r/>
+            <w:r>
+              <w:rPr>
+                <w:rFonts w:ascii="Arial" w:hAnsi="Arial"/>
+                <w:b w:val="0"/>
+                <w:sz w:val="19"/>
+              </w:rPr>
+              <w:t>45 min</w:t>
             </w:r>
           </w:p>
         </w:tc>
@@ -4133,7 +2954,7 @@
                 <w:b w:val="0"/>
                 <w:sz w:val="19"/>
               </w:rPr>
-              <w:t>4:50 – 5:50</w:t>
+              <w:t>6:00 – 6:35</w:t>
             </w:r>
           </w:p>
         </w:tc>
@@ -4153,7 +2974,7 @@
                 <w:b w:val="0"/>
                 <w:sz w:val="19"/>
               </w:rPr>
-              <w:t>Assessment 1: Written Assessment (SAQ) — 5 questions · 40 marks · 60 min</w:t>
+              <w:t>Briefing for assessment; Written Assessment (SAQ) — 5 questions, one per K statement (K1-K5)</w:t>
             </w:r>
           </w:p>
         </w:tc>
@@ -4173,7 +2994,7 @@
                 <w:b w:val="0"/>
                 <w:sz w:val="19"/>
               </w:rPr>
-              <w:t>60 min</w:t>
+              <w:t>35 min</w:t>
             </w:r>
           </w:p>
         </w:tc>
@@ -4198,7 +3019,7 @@
                 <w:b w:val="0"/>
                 <w:sz w:val="19"/>
               </w:rPr>
-              <w:t>5:50 – 6:30</w:t>
+              <w:t>6:35 – 7:00</w:t>
             </w:r>
           </w:p>
         </w:tc>
@@ -4218,7 +3039,7 @@
                 <w:b w:val="0"/>
                 <w:sz w:val="19"/>
               </w:rPr>
-              <w:t>Assessment 2: Case Study — 3 questions · 70 marks · 40 min; TRAQOM close</w:t>
+              <w:t>Practical Performance — 3 reflection tasks on the activities completed; TRAQOM close</w:t>
             </w:r>
           </w:p>
         </w:tc>
@@ -4238,7 +3059,7 @@
                 <w:b w:val="0"/>
                 <w:sz w:val="19"/>
               </w:rPr>
-              <w:t>40 min</w:t>
+              <w:t>25 min</w:t>
             </w:r>
           </w:p>
         </w:tc>
@@ -4268,7 +3089,7 @@
           <w:color w:val="111827"/>
           <w:sz w:val="20"/>
         </w:rPr>
-        <w:t>Day 2 instructional total: 480 minutes (8 hours), excluding the 1-hour lunch break.</w:t>
+        <w:t>Instructional total: 480 minutes (8 hours), excluding the 1-hour lunch break and the 1-hour assessment.</w:t>
       </w:r>
     </w:p>
     <w:p>
@@ -4295,7 +3116,7 @@
           <w:color w:val="111827"/>
           <w:sz w:val="22"/>
         </w:rPr>
-        <w:t>Every activity is either a clearly labelled realistic simulation or an evidence-based documented-case review. Each has its own folder under activities/ containing learner instructions, scenarios, discussion questions, checklists and printable PDFs. Full step-by-step facilitation detail is in the Learner Guide.</w:t>
+        <w:t>Every activity uses a ready-made website, chatbot or AI agent — learners do not write any code. Each has its own folder under activities/ containing learner instructions, prompt cards, mock data and printable PDFs. All data is fictional. Full step-by-step facilitation detail is in the Learner Guide.</w:t>
       </w:r>
     </w:p>
     <w:tbl>
@@ -4317,7 +3138,7 @@
         </w:trPr>
         <w:tc>
           <w:tcPr>
-            <w:tcW w:type="dxa" w:w="576"/>
+            <w:tcW w:type="dxa" w:w="504"/>
             <w:shd w:val="clear" w:color="auto" w:fill="1F6FEB"/>
           </w:tcPr>
           <w:p>
@@ -4339,7 +3160,7 @@
         </w:tc>
         <w:tc>
           <w:tcPr>
-            <w:tcW w:type="dxa" w:w="5184"/>
+            <w:tcW w:type="dxa" w:w="5256"/>
             <w:shd w:val="clear" w:color="auto" w:fill="1F6FEB"/>
           </w:tcPr>
           <w:p>
@@ -4361,7 +3182,7 @@
         </w:tc>
         <w:tc>
           <w:tcPr>
-            <w:tcW w:type="dxa" w:w="720"/>
+            <w:tcW w:type="dxa" w:w="864"/>
             <w:shd w:val="clear" w:color="auto" w:fill="1F6FEB"/>
           </w:tcPr>
           <w:p>
@@ -4377,13 +3198,13 @@
                 <w:color w:val="FFFFFF"/>
                 <w:sz w:val="20"/>
               </w:rPr>
-              <w:t>Day</w:t>
+              <w:t>Topic</w:t>
             </w:r>
           </w:p>
         </w:tc>
         <w:tc>
           <w:tcPr>
-            <w:tcW w:type="dxa" w:w="1296"/>
+            <w:tcW w:type="dxa" w:w="1224"/>
             <w:shd w:val="clear" w:color="auto" w:fill="1F6FEB"/>
           </w:tcPr>
           <w:p>
@@ -4405,7 +3226,7 @@
         </w:tc>
         <w:tc>
           <w:tcPr>
-            <w:tcW w:type="dxa" w:w="2520"/>
+            <w:tcW w:type="dxa" w:w="2016"/>
             <w:shd w:val="clear" w:color="auto" w:fill="1F6FEB"/>
           </w:tcPr>
           <w:p>
@@ -4421,7 +3242,7 @@
                 <w:color w:val="FFFFFF"/>
                 <w:sz w:val="20"/>
               </w:rPr>
-              <w:t>K/A assessed</w:t>
+              <w:t>LO / A</w:t>
             </w:r>
           </w:p>
         </w:tc>
@@ -4432,7 +3253,7 @@
         </w:trPr>
         <w:tc>
           <w:tcPr>
-            <w:tcW w:type="dxa" w:w="576"/>
+            <w:tcW w:type="dxa" w:w="504"/>
           </w:tcPr>
           <w:p>
             <w:pPr>
@@ -4452,7 +3273,7 @@
         </w:tc>
         <w:tc>
           <w:tcPr>
-            <w:tcW w:type="dxa" w:w="5184"/>
+            <w:tcW w:type="dxa" w:w="5256"/>
           </w:tcPr>
           <w:p>
             <w:pPr>
@@ -4466,13 +3287,13 @@
                 <w:b w:val="0"/>
                 <w:sz w:val="19"/>
               </w:rPr>
-              <w:t>Threat Modelling a Generative AI Concierge</w:t>
+              <w:t>Talk to an AI Agent (TIA Support WhatsApp) and reflect on the Pinboard</w:t>
             </w:r>
           </w:p>
         </w:tc>
         <w:tc>
           <w:tcPr>
-            <w:tcW w:type="dxa" w:w="720"/>
+            <w:tcW w:type="dxa" w:w="864"/>
           </w:tcPr>
           <w:p>
             <w:pPr>
@@ -4492,7 +3313,7 @@
         </w:tc>
         <w:tc>
           <w:tcPr>
-            <w:tcW w:type="dxa" w:w="1296"/>
+            <w:tcW w:type="dxa" w:w="1224"/>
           </w:tcPr>
           <w:p>
             <w:pPr>
@@ -4512,7 +3333,7 @@
         </w:tc>
         <w:tc>
           <w:tcPr>
-            <w:tcW w:type="dxa" w:w="2520"/>
+            <w:tcW w:type="dxa" w:w="2016"/>
           </w:tcPr>
           <w:p>
             <w:pPr>
@@ -4526,7 +3347,7 @@
                 <w:b w:val="0"/>
                 <w:sz w:val="19"/>
               </w:rPr>
-              <w:t>K2, K3, A4</w:t>
+              <w:t>LO1 · A2, A4</w:t>
             </w:r>
           </w:p>
         </w:tc>
@@ -4537,7 +3358,7 @@
         </w:trPr>
         <w:tc>
           <w:tcPr>
-            <w:tcW w:type="dxa" w:w="576"/>
+            <w:tcW w:type="dxa" w:w="504"/>
           </w:tcPr>
           <w:p>
             <w:pPr>
@@ -4557,7 +3378,7 @@
         </w:tc>
         <w:tc>
           <w:tcPr>
-            <w:tcW w:type="dxa" w:w="5184"/>
+            <w:tcW w:type="dxa" w:w="5256"/>
           </w:tcPr>
           <w:p>
             <w:pPr>
@@ -4571,13 +3392,13 @@
                 <w:b w:val="0"/>
                 <w:sz w:val="19"/>
               </w:rPr>
-              <w:t>Prompt Injection and the PDPA Breach Decision</w:t>
+              <w:t>Analyse mock Excel marketing data with the Hermes + MiniMax agent</w:t>
             </w:r>
           </w:p>
         </w:tc>
         <w:tc>
           <w:tcPr>
-            <w:tcW w:type="dxa" w:w="720"/>
+            <w:tcW w:type="dxa" w:w="864"/>
           </w:tcPr>
           <w:p>
             <w:pPr>
@@ -4597,7 +3418,7 @@
         </w:tc>
         <w:tc>
           <w:tcPr>
-            <w:tcW w:type="dxa" w:w="1296"/>
+            <w:tcW w:type="dxa" w:w="1224"/>
           </w:tcPr>
           <w:p>
             <w:pPr>
@@ -4611,13 +3432,13 @@
                 <w:b w:val="0"/>
                 <w:sz w:val="19"/>
               </w:rPr>
-              <w:t>60 min</w:t>
+              <w:t>25 min</w:t>
             </w:r>
           </w:p>
         </w:tc>
         <w:tc>
           <w:tcPr>
-            <w:tcW w:type="dxa" w:w="2520"/>
+            <w:tcW w:type="dxa" w:w="2016"/>
           </w:tcPr>
           <w:p>
             <w:pPr>
@@ -4631,7 +3452,7 @@
                 <w:b w:val="0"/>
                 <w:sz w:val="19"/>
               </w:rPr>
-              <w:t>K4, K1</w:t>
+              <w:t>LO2 · A5</w:t>
             </w:r>
           </w:p>
         </w:tc>
@@ -4642,7 +3463,7 @@
         </w:trPr>
         <w:tc>
           <w:tcPr>
-            <w:tcW w:type="dxa" w:w="576"/>
+            <w:tcW w:type="dxa" w:w="504"/>
           </w:tcPr>
           <w:p>
             <w:pPr>
@@ -4662,7 +3483,7 @@
         </w:tc>
         <w:tc>
           <w:tcPr>
-            <w:tcW w:type="dxa" w:w="5184"/>
+            <w:tcW w:type="dxa" w:w="5256"/>
           </w:tcPr>
           <w:p>
             <w:pPr>
@@ -4676,13 +3497,13 @@
                 <w:b w:val="0"/>
                 <w:sz w:val="19"/>
               </w:rPr>
-              <w:t>Selecting a Security Framework for GenAI and Agents</w:t>
+              <w:t>Build an animated PPT from an Envato template with the agent</w:t>
             </w:r>
           </w:p>
         </w:tc>
         <w:tc>
           <w:tcPr>
-            <w:tcW w:type="dxa" w:w="720"/>
+            <w:tcW w:type="dxa" w:w="864"/>
           </w:tcPr>
           <w:p>
             <w:pPr>
@@ -4702,7 +3523,7 @@
         </w:tc>
         <w:tc>
           <w:tcPr>
-            <w:tcW w:type="dxa" w:w="1296"/>
+            <w:tcW w:type="dxa" w:w="1224"/>
           </w:tcPr>
           <w:p>
             <w:pPr>
@@ -4716,13 +3537,13 @@
                 <w:b w:val="0"/>
                 <w:sz w:val="19"/>
               </w:rPr>
-              <w:t>60 min</w:t>
+              <w:t>25 min</w:t>
             </w:r>
           </w:p>
         </w:tc>
         <w:tc>
           <w:tcPr>
-            <w:tcW w:type="dxa" w:w="2520"/>
+            <w:tcW w:type="dxa" w:w="2016"/>
           </w:tcPr>
           <w:p>
             <w:pPr>
@@ -4736,7 +3557,7 @@
                 <w:b w:val="0"/>
                 <w:sz w:val="19"/>
               </w:rPr>
-              <w:t>A3, A5</w:t>
+              <w:t>LO2 · A5</w:t>
             </w:r>
           </w:p>
         </w:tc>
@@ -4747,7 +3568,7 @@
         </w:trPr>
         <w:tc>
           <w:tcPr>
-            <w:tcW w:type="dxa" w:w="576"/>
+            <w:tcW w:type="dxa" w:w="504"/>
           </w:tcPr>
           <w:p>
             <w:pPr>
@@ -4767,7 +3588,7 @@
         </w:tc>
         <w:tc>
           <w:tcPr>
-            <w:tcW w:type="dxa" w:w="5184"/>
+            <w:tcW w:type="dxa" w:w="5256"/>
           </w:tcPr>
           <w:p>
             <w:pPr>
@@ -4781,13 +3602,13 @@
                 <w:b w:val="0"/>
                 <w:sz w:val="19"/>
               </w:rPr>
-              <w:t>Evidence-Based Rogue Agent Incident Review</w:t>
+              <w:t>Install tools and skills, then re-run the Excel and PPT tasks</w:t>
             </w:r>
           </w:p>
         </w:tc>
         <w:tc>
           <w:tcPr>
-            <w:tcW w:type="dxa" w:w="720"/>
+            <w:tcW w:type="dxa" w:w="864"/>
           </w:tcPr>
           <w:p>
             <w:pPr>
@@ -4807,7 +3628,7 @@
         </w:tc>
         <w:tc>
           <w:tcPr>
-            <w:tcW w:type="dxa" w:w="1296"/>
+            <w:tcW w:type="dxa" w:w="1224"/>
           </w:tcPr>
           <w:p>
             <w:pPr>
@@ -4821,13 +3642,13 @@
                 <w:b w:val="0"/>
                 <w:sz w:val="19"/>
               </w:rPr>
-              <w:t>60 min</w:t>
+              <w:t>25 min</w:t>
             </w:r>
           </w:p>
         </w:tc>
         <w:tc>
           <w:tcPr>
-            <w:tcW w:type="dxa" w:w="2520"/>
+            <w:tcW w:type="dxa" w:w="2016"/>
           </w:tcPr>
           <w:p>
             <w:pPr>
@@ -4841,7 +3662,7 @@
                 <w:b w:val="0"/>
                 <w:sz w:val="19"/>
               </w:rPr>
-              <w:t>K5</w:t>
+              <w:t>LO2 · A1, A5</w:t>
             </w:r>
           </w:p>
         </w:tc>
@@ -4852,11 +3673,11 @@
         </w:trPr>
         <w:tc>
           <w:tcPr>
-            <w:tcW w:type="dxa" w:w="576"/>
+            <w:tcW w:type="dxa" w:w="504"/>
           </w:tcPr>
           <w:p>
             <w:pPr>
-              <w:keepNext w:val="0"/>
+              <w:keepNext/>
               <w:keepLines/>
             </w:pPr>
             <w:r/>
@@ -4872,7 +3693,322 @@
         </w:tc>
         <w:tc>
           <w:tcPr>
-            <w:tcW w:type="dxa" w:w="5184"/>
+            <w:tcW w:type="dxa" w:w="5256"/>
+          </w:tcPr>
+          <w:p>
+            <w:pPr>
+              <w:keepNext/>
+              <w:keepLines/>
+            </w:pPr>
+            <w:r/>
+            <w:r>
+              <w:rPr>
+                <w:rFonts w:ascii="Arial" w:hAnsi="Arial"/>
+                <w:b w:val="0"/>
+                <w:sz w:val="19"/>
+              </w:rPr>
+              <w:t>Draft an AI Data Governance Policy from a sample using prompts</w:t>
+            </w:r>
+          </w:p>
+        </w:tc>
+        <w:tc>
+          <w:tcPr>
+            <w:tcW w:type="dxa" w:w="864"/>
+          </w:tcPr>
+          <w:p>
+            <w:pPr>
+              <w:keepNext/>
+              <w:keepLines/>
+            </w:pPr>
+            <w:r/>
+            <w:r>
+              <w:rPr>
+                <w:rFonts w:ascii="Arial" w:hAnsi="Arial"/>
+                <w:b w:val="0"/>
+                <w:sz w:val="19"/>
+              </w:rPr>
+              <w:t>3</w:t>
+            </w:r>
+          </w:p>
+        </w:tc>
+        <w:tc>
+          <w:tcPr>
+            <w:tcW w:type="dxa" w:w="1224"/>
+          </w:tcPr>
+          <w:p>
+            <w:pPr>
+              <w:keepNext/>
+              <w:keepLines/>
+            </w:pPr>
+            <w:r/>
+            <w:r>
+              <w:rPr>
+                <w:rFonts w:ascii="Arial" w:hAnsi="Arial"/>
+                <w:b w:val="0"/>
+                <w:sz w:val="19"/>
+              </w:rPr>
+              <w:t>30 min</w:t>
+            </w:r>
+          </w:p>
+        </w:tc>
+        <w:tc>
+          <w:tcPr>
+            <w:tcW w:type="dxa" w:w="2016"/>
+          </w:tcPr>
+          <w:p>
+            <w:pPr>
+              <w:keepNext/>
+              <w:keepLines/>
+            </w:pPr>
+            <w:r/>
+            <w:r>
+              <w:rPr>
+                <w:rFonts w:ascii="Arial" w:hAnsi="Arial"/>
+                <w:b w:val="0"/>
+                <w:sz w:val="19"/>
+              </w:rPr>
+              <w:t>LO3 · A1, A2</w:t>
+            </w:r>
+          </w:p>
+        </w:tc>
+      </w:tr>
+      <w:tr>
+        <w:trPr>
+          <w:cantSplit/>
+        </w:trPr>
+        <w:tc>
+          <w:tcPr>
+            <w:tcW w:type="dxa" w:w="504"/>
+          </w:tcPr>
+          <w:p>
+            <w:pPr>
+              <w:keepNext/>
+              <w:keepLines/>
+            </w:pPr>
+            <w:r/>
+            <w:r>
+              <w:rPr>
+                <w:rFonts w:ascii="Arial" w:hAnsi="Arial"/>
+                <w:b/>
+                <w:sz w:val="19"/>
+              </w:rPr>
+              <w:t>6</w:t>
+            </w:r>
+          </w:p>
+        </w:tc>
+        <w:tc>
+          <w:tcPr>
+            <w:tcW w:type="dxa" w:w="5256"/>
+          </w:tcPr>
+          <w:p>
+            <w:pPr>
+              <w:keepNext/>
+              <w:keepLines/>
+            </w:pPr>
+            <w:r/>
+            <w:r>
+              <w:rPr>
+                <w:rFonts w:ascii="Arial" w:hAnsi="Arial"/>
+                <w:b w:val="0"/>
+                <w:sz w:val="19"/>
+              </w:rPr>
+              <w:t>Coach a worried team member (AI role-play simulator)</w:t>
+            </w:r>
+          </w:p>
+        </w:tc>
+        <w:tc>
+          <w:tcPr>
+            <w:tcW w:type="dxa" w:w="864"/>
+          </w:tcPr>
+          <w:p>
+            <w:pPr>
+              <w:keepNext/>
+              <w:keepLines/>
+            </w:pPr>
+            <w:r/>
+            <w:r>
+              <w:rPr>
+                <w:rFonts w:ascii="Arial" w:hAnsi="Arial"/>
+                <w:b w:val="0"/>
+                <w:sz w:val="19"/>
+              </w:rPr>
+              <w:t>3</w:t>
+            </w:r>
+          </w:p>
+        </w:tc>
+        <w:tc>
+          <w:tcPr>
+            <w:tcW w:type="dxa" w:w="1224"/>
+          </w:tcPr>
+          <w:p>
+            <w:pPr>
+              <w:keepNext/>
+              <w:keepLines/>
+            </w:pPr>
+            <w:r/>
+            <w:r>
+              <w:rPr>
+                <w:rFonts w:ascii="Arial" w:hAnsi="Arial"/>
+                <w:b w:val="0"/>
+                <w:sz w:val="19"/>
+              </w:rPr>
+              <w:t>30 min</w:t>
+            </w:r>
+          </w:p>
+        </w:tc>
+        <w:tc>
+          <w:tcPr>
+            <w:tcW w:type="dxa" w:w="2016"/>
+          </w:tcPr>
+          <w:p>
+            <w:pPr>
+              <w:keepNext/>
+              <w:keepLines/>
+            </w:pPr>
+            <w:r/>
+            <w:r>
+              <w:rPr>
+                <w:rFonts w:ascii="Arial" w:hAnsi="Arial"/>
+                <w:b w:val="0"/>
+                <w:sz w:val="19"/>
+              </w:rPr>
+              <w:t>LO3 · A2</w:t>
+            </w:r>
+          </w:p>
+        </w:tc>
+      </w:tr>
+      <w:tr>
+        <w:trPr>
+          <w:cantSplit/>
+        </w:trPr>
+        <w:tc>
+          <w:tcPr>
+            <w:tcW w:type="dxa" w:w="504"/>
+          </w:tcPr>
+          <w:p>
+            <w:pPr>
+              <w:keepNext/>
+              <w:keepLines/>
+            </w:pPr>
+            <w:r/>
+            <w:r>
+              <w:rPr>
+                <w:rFonts w:ascii="Arial" w:hAnsi="Arial"/>
+                <w:b/>
+                <w:sz w:val="19"/>
+              </w:rPr>
+              <w:t>7</w:t>
+            </w:r>
+          </w:p>
+        </w:tc>
+        <w:tc>
+          <w:tcPr>
+            <w:tcW w:type="dxa" w:w="5256"/>
+          </w:tcPr>
+          <w:p>
+            <w:pPr>
+              <w:keepNext/>
+              <w:keepLines/>
+            </w:pPr>
+            <w:r/>
+            <w:r>
+              <w:rPr>
+                <w:rFonts w:ascii="Arial" w:hAnsi="Arial"/>
+                <w:b w:val="0"/>
+                <w:sz w:val="19"/>
+              </w:rPr>
+              <w:t>Leaky vs guarded chatbot — see and stop a PII leak</w:t>
+            </w:r>
+          </w:p>
+        </w:tc>
+        <w:tc>
+          <w:tcPr>
+            <w:tcW w:type="dxa" w:w="864"/>
+          </w:tcPr>
+          <w:p>
+            <w:pPr>
+              <w:keepNext/>
+              <w:keepLines/>
+            </w:pPr>
+            <w:r/>
+            <w:r>
+              <w:rPr>
+                <w:rFonts w:ascii="Arial" w:hAnsi="Arial"/>
+                <w:b w:val="0"/>
+                <w:sz w:val="19"/>
+              </w:rPr>
+              <w:t>3</w:t>
+            </w:r>
+          </w:p>
+        </w:tc>
+        <w:tc>
+          <w:tcPr>
+            <w:tcW w:type="dxa" w:w="1224"/>
+          </w:tcPr>
+          <w:p>
+            <w:pPr>
+              <w:keepNext/>
+              <w:keepLines/>
+            </w:pPr>
+            <w:r/>
+            <w:r>
+              <w:rPr>
+                <w:rFonts w:ascii="Arial" w:hAnsi="Arial"/>
+                <w:b w:val="0"/>
+                <w:sz w:val="19"/>
+              </w:rPr>
+              <w:t>30 min</w:t>
+            </w:r>
+          </w:p>
+        </w:tc>
+        <w:tc>
+          <w:tcPr>
+            <w:tcW w:type="dxa" w:w="2016"/>
+          </w:tcPr>
+          <w:p>
+            <w:pPr>
+              <w:keepNext/>
+              <w:keepLines/>
+            </w:pPr>
+            <w:r/>
+            <w:r>
+              <w:rPr>
+                <w:rFonts w:ascii="Arial" w:hAnsi="Arial"/>
+                <w:b w:val="0"/>
+                <w:sz w:val="19"/>
+              </w:rPr>
+              <w:t>LO3 · A1, A2</w:t>
+            </w:r>
+          </w:p>
+        </w:tc>
+      </w:tr>
+      <w:tr>
+        <w:trPr>
+          <w:cantSplit/>
+        </w:trPr>
+        <w:tc>
+          <w:tcPr>
+            <w:tcW w:type="dxa" w:w="504"/>
+          </w:tcPr>
+          <w:p>
+            <w:pPr>
+              <w:keepNext w:val="0"/>
+              <w:keepLines/>
+            </w:pPr>
+            <w:r/>
+            <w:r>
+              <w:rPr>
+                <w:rFonts w:ascii="Arial" w:hAnsi="Arial"/>
+                <w:b/>
+                <w:sz w:val="19"/>
+              </w:rPr>
+              <w:t>8</w:t>
+            </w:r>
+          </w:p>
+        </w:tc>
+        <w:tc>
+          <w:tcPr>
+            <w:tcW w:type="dxa" w:w="5256"/>
           </w:tcPr>
           <w:p>
             <w:pPr>
@@ -4886,13 +4022,13 @@
                 <w:b w:val="0"/>
                 <w:sz w:val="19"/>
               </w:rPr>
-              <w:t>Agent Governance and the Deployment Gate (capstone)</w:t>
+              <w:t>Reflect on agent security and decide go / no-go</w:t>
             </w:r>
           </w:p>
         </w:tc>
         <w:tc>
           <w:tcPr>
-            <w:tcW w:type="dxa" w:w="720"/>
+            <w:tcW w:type="dxa" w:w="864"/>
           </w:tcPr>
           <w:p>
             <w:pPr>
@@ -4906,13 +4042,13 @@
                 <w:b w:val="0"/>
                 <w:sz w:val="19"/>
               </w:rPr>
-              <w:t>2</w:t>
+              <w:t>3</w:t>
             </w:r>
           </w:p>
         </w:tc>
         <w:tc>
           <w:tcPr>
-            <w:tcW w:type="dxa" w:w="1296"/>
+            <w:tcW w:type="dxa" w:w="1224"/>
           </w:tcPr>
           <w:p>
             <w:pPr>
@@ -4926,13 +4062,13 @@
                 <w:b w:val="0"/>
                 <w:sz w:val="19"/>
               </w:rPr>
-              <w:t>25 min</w:t>
+              <w:t>15 min</w:t>
             </w:r>
           </w:p>
         </w:tc>
         <w:tc>
           <w:tcPr>
-            <w:tcW w:type="dxa" w:w="2520"/>
+            <w:tcW w:type="dxa" w:w="2016"/>
           </w:tcPr>
           <w:p>
             <w:pPr>
@@ -4946,12 +4082,26 @@
                 <w:b w:val="0"/>
                 <w:sz w:val="19"/>
               </w:rPr>
-              <w:t>A1, A2</w:t>
+              <w:t>LO3 · A1, A2</w:t>
             </w:r>
           </w:p>
         </w:tc>
       </w:tr>
     </w:tbl>
+    <w:p>
+      <w:pPr>
+        <w:spacing w:after="120"/>
+      </w:pPr>
+      <w:r>
+        <w:rPr>
+          <w:rFonts w:ascii="Arial" w:hAnsi="Arial"/>
+          <w:b w:val="0"/>
+          <w:color w:val="555B66"/>
+          <w:sz w:val="19"/>
+        </w:rPr>
+        <w:t>Times overlap with the topic teaching blocks in the schedule above; activity folders and the reflection Pinboard (alfredang.github.io/pinboard) are used throughout the day.</w:t>
+      </w:r>
+    </w:p>
     <w:p>
       <w:pPr>
         <w:pStyle w:val="Heading1"/>
@@ -4976,7 +4126,7 @@
         </w:trPr>
         <w:tc>
           <w:tcPr>
-            <w:tcW w:type="dxa" w:w="3600"/>
+            <w:tcW w:type="dxa" w:w="4176"/>
             <w:shd w:val="clear" w:color="auto" w:fill="1F6FEB"/>
           </w:tcPr>
           <w:p>
@@ -4998,7 +4148,7 @@
         </w:tc>
         <w:tc>
           <w:tcPr>
-            <w:tcW w:type="dxa" w:w="6696"/>
+            <w:tcW w:type="dxa" w:w="6120"/>
             <w:shd w:val="clear" w:color="auto" w:fill="1F6FEB"/>
           </w:tcPr>
           <w:p>
@@ -5025,7 +4175,7 @@
         </w:trPr>
         <w:tc>
           <w:tcPr>
-            <w:tcW w:type="dxa" w:w="3600"/>
+            <w:tcW w:type="dxa" w:w="4176"/>
           </w:tcPr>
           <w:p>
             <w:pPr>
@@ -5045,7 +4195,7 @@
         </w:tc>
         <w:tc>
           <w:tcPr>
-            <w:tcW w:type="dxa" w:w="6696"/>
+            <w:tcW w:type="dxa" w:w="6120"/>
           </w:tcPr>
           <w:p>
             <w:pPr>
@@ -5059,7 +4209,7 @@
                 <w:b w:val="0"/>
                 <w:sz w:val="19"/>
               </w:rPr>
-              <w:t>Facilitation, diagrams and case-study prompts</w:t>
+              <w:t>Facilitation, diagrams and concept walkthroughs</w:t>
             </w:r>
           </w:p>
         </w:tc>
@@ -5070,7 +4220,7 @@
         </w:trPr>
         <w:tc>
           <w:tcPr>
-            <w:tcW w:type="dxa" w:w="3600"/>
+            <w:tcW w:type="dxa" w:w="4176"/>
           </w:tcPr>
           <w:p>
             <w:pPr>
@@ -5090,7 +4240,7 @@
         </w:tc>
         <w:tc>
           <w:tcPr>
-            <w:tcW w:type="dxa" w:w="6696"/>
+            <w:tcW w:type="dxa" w:w="6120"/>
           </w:tcPr>
           <w:p>
             <w:pPr>
@@ -5104,7 +4254,7 @@
                 <w:b w:val="0"/>
                 <w:sz w:val="19"/>
               </w:rPr>
-              <w:t>Detailed step-by-step notes and activity walkthroughs</w:t>
+              <w:t>Detailed notes and step-by-step activity walkthroughs</w:t>
             </w:r>
           </w:p>
         </w:tc>
@@ -5115,7 +4265,7 @@
         </w:trPr>
         <w:tc>
           <w:tcPr>
-            <w:tcW w:type="dxa" w:w="3600"/>
+            <w:tcW w:type="dxa" w:w="4176"/>
           </w:tcPr>
           <w:p>
             <w:pPr>
@@ -5135,7 +4285,7 @@
         </w:tc>
         <w:tc>
           <w:tcPr>
-            <w:tcW w:type="dxa" w:w="6696"/>
+            <w:tcW w:type="dxa" w:w="6120"/>
           </w:tcPr>
           <w:p>
             <w:pPr>
@@ -5149,7 +4299,7 @@
                 <w:b w:val="0"/>
                 <w:sz w:val="19"/>
               </w:rPr>
-              <w:t>Learner scenarios, discussion questions, checklists and evidence worksheets</w:t>
+              <w:t>Ready-made websites/chatbots, prompt cards and mock data</w:t>
             </w:r>
           </w:p>
         </w:tc>
@@ -5160,7 +4310,142 @@
         </w:trPr>
         <w:tc>
           <w:tcPr>
-            <w:tcW w:type="dxa" w:w="3600"/>
+            <w:tcW w:type="dxa" w:w="4176"/>
+          </w:tcPr>
+          <w:p>
+            <w:pPr>
+              <w:keepNext/>
+              <w:keepLines/>
+            </w:pPr>
+            <w:r/>
+            <w:r>
+              <w:rPr>
+                <w:rFonts w:ascii="Arial" w:hAnsi="Arial"/>
+                <w:b/>
+                <w:sz w:val="19"/>
+              </w:rPr>
+              <w:t>TIA Support on WhatsApp (+65 8866 6375)</w:t>
+            </w:r>
+          </w:p>
+        </w:tc>
+        <w:tc>
+          <w:tcPr>
+            <w:tcW w:type="dxa" w:w="6120"/>
+          </w:tcPr>
+          <w:p>
+            <w:pPr>
+              <w:keepNext/>
+              <w:keepLines/>
+            </w:pPr>
+            <w:r/>
+            <w:r>
+              <w:rPr>
+                <w:rFonts w:ascii="Arial" w:hAnsi="Arial"/>
+                <w:b w:val="0"/>
+                <w:sz w:val="19"/>
+              </w:rPr>
+              <w:t>Live OpenClaw-powered AI agent for Activity 1</w:t>
+            </w:r>
+          </w:p>
+        </w:tc>
+      </w:tr>
+      <w:tr>
+        <w:trPr>
+          <w:cantSplit/>
+        </w:trPr>
+        <w:tc>
+          <w:tcPr>
+            <w:tcW w:type="dxa" w:w="4176"/>
+          </w:tcPr>
+          <w:p>
+            <w:pPr>
+              <w:keepNext/>
+              <w:keepLines/>
+            </w:pPr>
+            <w:r/>
+            <w:r>
+              <w:rPr>
+                <w:rFonts w:ascii="Arial" w:hAnsi="Arial"/>
+                <w:b/>
+                <w:sz w:val="19"/>
+              </w:rPr>
+              <w:t>Reflection Pinboard</w:t>
+            </w:r>
+          </w:p>
+        </w:tc>
+        <w:tc>
+          <w:tcPr>
+            <w:tcW w:type="dxa" w:w="6120"/>
+          </w:tcPr>
+          <w:p>
+            <w:pPr>
+              <w:keepNext/>
+              <w:keepLines/>
+            </w:pPr>
+            <w:r/>
+            <w:r>
+              <w:rPr>
+                <w:rFonts w:ascii="Arial" w:hAnsi="Arial"/>
+                <w:b w:val="0"/>
+                <w:sz w:val="19"/>
+              </w:rPr>
+              <w:t>alfredang.github.io/pinboard — group reflections by risk theme</w:t>
+            </w:r>
+          </w:p>
+        </w:tc>
+      </w:tr>
+      <w:tr>
+        <w:trPr>
+          <w:cantSplit/>
+        </w:trPr>
+        <w:tc>
+          <w:tcPr>
+            <w:tcW w:type="dxa" w:w="4176"/>
+          </w:tcPr>
+          <w:p>
+            <w:pPr>
+              <w:keepNext/>
+              <w:keepLines/>
+            </w:pPr>
+            <w:r/>
+            <w:r>
+              <w:rPr>
+                <w:rFonts w:ascii="Arial" w:hAnsi="Arial"/>
+                <w:b/>
+                <w:sz w:val="19"/>
+              </w:rPr>
+              <w:t>Hermes Agent + MiniMax</w:t>
+            </w:r>
+          </w:p>
+        </w:tc>
+        <w:tc>
+          <w:tcPr>
+            <w:tcW w:type="dxa" w:w="6120"/>
+          </w:tcPr>
+          <w:p>
+            <w:pPr>
+              <w:keepNext/>
+              <w:keepLines/>
+            </w:pPr>
+            <w:r/>
+            <w:r>
+              <w:rPr>
+                <w:rFonts w:ascii="Arial" w:hAnsi="Arial"/>
+                <w:b w:val="0"/>
+                <w:sz w:val="19"/>
+              </w:rPr>
+              <w:t>hermes-agent.nousresearch.com and minimax.io for Topic 2</w:t>
+            </w:r>
+          </w:p>
+        </w:tc>
+      </w:tr>
+      <w:tr>
+        <w:trPr>
+          <w:cantSplit/>
+        </w:trPr>
+        <w:tc>
+          <w:tcPr>
+            <w:tcW w:type="dxa" w:w="4176"/>
           </w:tcPr>
           <w:p>
             <w:pPr>
@@ -5180,7 +4465,7 @@
         </w:tc>
         <w:tc>
           <w:tcPr>
-            <w:tcW w:type="dxa" w:w="6696"/>
+            <w:tcW w:type="dxa" w:w="6120"/>
           </w:tcPr>
           <w:p>
             <w:pPr>
@@ -5205,97 +4490,7 @@
         </w:trPr>
         <w:tc>
           <w:tcPr>
-            <w:tcW w:type="dxa" w:w="3600"/>
-          </w:tcPr>
-          <w:p>
-            <w:pPr>
-              <w:keepNext/>
-              <w:keepLines/>
-            </w:pPr>
-            <w:r/>
-            <w:r>
-              <w:rPr>
-                <w:rFonts w:ascii="Arial" w:hAnsi="Arial"/>
-                <w:b/>
-                <w:sz w:val="19"/>
-              </w:rPr>
-              <w:t>Whiteboard / flip chart</w:t>
-            </w:r>
-          </w:p>
-        </w:tc>
-        <w:tc>
-          <w:tcPr>
-            <w:tcW w:type="dxa" w:w="6696"/>
-          </w:tcPr>
-          <w:p>
-            <w:pPr>
-              <w:keepNext/>
-              <w:keepLines/>
-            </w:pPr>
-            <w:r/>
-            <w:r>
-              <w:rPr>
-                <w:rFonts w:ascii="Arial" w:hAnsi="Arial"/>
-                <w:b w:val="0"/>
-                <w:sz w:val="19"/>
-              </w:rPr>
-              <w:t>Group threat modelling and kill-chain reconstruction</w:t>
-            </w:r>
-          </w:p>
-        </w:tc>
-      </w:tr>
-      <w:tr>
-        <w:trPr>
-          <w:cantSplit/>
-        </w:trPr>
-        <w:tc>
-          <w:tcPr>
-            <w:tcW w:type="dxa" w:w="3600"/>
-          </w:tcPr>
-          <w:p>
-            <w:pPr>
-              <w:keepNext/>
-              <w:keepLines/>
-            </w:pPr>
-            <w:r/>
-            <w:r>
-              <w:rPr>
-                <w:rFonts w:ascii="Arial" w:hAnsi="Arial"/>
-                <w:b/>
-                <w:sz w:val="19"/>
-              </w:rPr>
-              <w:t>OWASP LLM &amp; ASI Top 10 (2026)</w:t>
-            </w:r>
-          </w:p>
-        </w:tc>
-        <w:tc>
-          <w:tcPr>
-            <w:tcW w:type="dxa" w:w="6696"/>
-          </w:tcPr>
-          <w:p>
-            <w:pPr>
-              <w:keepNext/>
-              <w:keepLines/>
-            </w:pPr>
-            <w:r/>
-            <w:r>
-              <w:rPr>
-                <w:rFonts w:ascii="Arial" w:hAnsi="Arial"/>
-                <w:b w:val="0"/>
-                <w:sz w:val="19"/>
-              </w:rPr>
-              <w:t>Reference taxonomies used throughout</w:t>
-            </w:r>
-          </w:p>
-        </w:tc>
-      </w:tr>
-      <w:tr>
-        <w:trPr>
-          <w:cantSplit/>
-        </w:trPr>
-        <w:tc>
-          <w:tcPr>
-            <w:tcW w:type="dxa" w:w="3600"/>
+            <w:tcW w:type="dxa" w:w="4176"/>
           </w:tcPr>
           <w:p>
             <w:pPr>
@@ -5309,13 +4504,13 @@
                 <w:b/>
                 <w:sz w:val="19"/>
               </w:rPr>
-              <w:t>IMDA / PDPC publications</w:t>
+              <w:t>IMDA / PDPC / OWASP references</w:t>
             </w:r>
           </w:p>
         </w:tc>
         <w:tc>
           <w:tcPr>
-            <w:tcW w:type="dxa" w:w="6696"/>
+            <w:tcW w:type="dxa" w:w="6120"/>
           </w:tcPr>
           <w:p>
             <w:pPr>
@@ -5329,7 +4524,7 @@
                 <w:b w:val="0"/>
                 <w:sz w:val="19"/>
               </w:rPr>
-              <w:t>Singapore governance and data-protection reference</w:t>
+              <w:t>Governance and security reference material</w:t>
             </w:r>
           </w:p>
         </w:tc>
@@ -5359,7 +4554,7 @@
           <w:color w:val="111827"/>
           <w:sz w:val="22"/>
         </w:rPr>
-        <w:t>Assessment is conducted at the end of Day 2. The briefing for assessment is delivered before the assessment begins.</w:t>
+        <w:t>Assessment is conducted at the end of the day (6:00pm – 7:00pm). The briefing for assessment is delivered before the assessment begins.</w:t>
       </w:r>
     </w:p>
     <w:tbl>
@@ -5401,7 +4596,7 @@
         </w:tc>
         <w:tc>
           <w:tcPr>
-            <w:tcW w:type="dxa" w:w="1944"/>
+            <w:tcW w:type="dxa" w:w="2160"/>
             <w:shd w:val="clear" w:color="auto" w:fill="1F6FEB"/>
           </w:tcPr>
           <w:p>
@@ -5423,7 +4618,7 @@
         </w:tc>
         <w:tc>
           <w:tcPr>
-            <w:tcW w:type="dxa" w:w="5832"/>
+            <w:tcW w:type="dxa" w:w="5616"/>
             <w:shd w:val="clear" w:color="auto" w:fill="1F6FEB"/>
           </w:tcPr>
           <w:p>
@@ -5470,7 +4665,7 @@
         </w:tc>
         <w:tc>
           <w:tcPr>
-            <w:tcW w:type="dxa" w:w="1944"/>
+            <w:tcW w:type="dxa" w:w="2160"/>
           </w:tcPr>
           <w:p>
             <w:pPr>
@@ -5490,7 +4685,7 @@
         </w:tc>
         <w:tc>
           <w:tcPr>
-            <w:tcW w:type="dxa" w:w="5832"/>
+            <w:tcW w:type="dxa" w:w="5616"/>
           </w:tcPr>
           <w:p>
             <w:pPr>
@@ -5504,7 +4699,7 @@
                 <w:b w:val="0"/>
                 <w:sz w:val="19"/>
               </w:rPr>
-              <w:t>Written Assessment (SAQ) — 5 short-answer questions, one per K statement</w:t>
+              <w:t>Written Assessment (SAQ) — 5 short-answer questions, one per K statement (K1–K5)</w:t>
             </w:r>
           </w:p>
         </w:tc>
@@ -5529,13 +4724,13 @@
                 <w:b/>
                 <w:sz w:val="19"/>
               </w:rPr>
-              <w:t>Case Study</w:t>
+              <w:t>Practical Performance</w:t>
             </w:r>
           </w:p>
         </w:tc>
         <w:tc>
           <w:tcPr>
-            <w:tcW w:type="dxa" w:w="1944"/>
+            <w:tcW w:type="dxa" w:w="2160"/>
           </w:tcPr>
           <w:p>
             <w:pPr>
@@ -5549,13 +4744,13 @@
                 <w:b w:val="0"/>
                 <w:sz w:val="19"/>
               </w:rPr>
-              <w:t>A1 – A5 via LO1 – LO3</w:t>
+              <w:t>LO1 – LO3 (A1 – A5)</w:t>
             </w:r>
           </w:p>
         </w:tc>
         <w:tc>
           <w:tcPr>
-            <w:tcW w:type="dxa" w:w="5832"/>
+            <w:tcW w:type="dxa" w:w="5616"/>
           </w:tcPr>
           <w:p>
             <w:pPr>
@@ -5569,7 +4764,7 @@
                 <w:b w:val="0"/>
                 <w:sz w:val="19"/>
               </w:rPr>
-              <w:t>Case Study — 3 questions, one per Learning Outcome, mapped to the A statements</w:t>
+              <w:t>Practical Performance — 3 reflective tasks in which learners document their own observations from the in-class activities, mapped to LO1–LO3 and the A statements</w:t>
             </w:r>
           </w:p>
         </w:tc>
@@ -5600,7 +4795,7 @@
         </w:tc>
         <w:tc>
           <w:tcPr>
-            <w:tcW w:type="dxa" w:w="1944"/>
+            <w:tcW w:type="dxa" w:w="2160"/>
           </w:tcPr>
           <w:p>
             <w:pPr>
@@ -5620,7 +4815,7 @@
         </w:tc>
         <w:tc>
           <w:tcPr>
-            <w:tcW w:type="dxa" w:w="5832"/>
+            <w:tcW w:type="dxa" w:w="5616"/>
           </w:tcPr>
           <w:p>
             <w:pPr>
@@ -5665,7 +4860,7 @@
         </w:tc>
         <w:tc>
           <w:tcPr>
-            <w:tcW w:type="dxa" w:w="1944"/>
+            <w:tcW w:type="dxa" w:w="2160"/>
           </w:tcPr>
           <w:p>
             <w:pPr>
@@ -5685,7 +4880,7 @@
         </w:tc>
         <w:tc>
           <w:tcPr>
-            <w:tcW w:type="dxa" w:w="5832"/>
+            <w:tcW w:type="dxa" w:w="5616"/>
           </w:tcPr>
           <w:p>
             <w:pPr>
@@ -5730,7 +4925,7 @@
         </w:tc>
         <w:tc>
           <w:tcPr>
-            <w:tcW w:type="dxa" w:w="1944"/>
+            <w:tcW w:type="dxa" w:w="2160"/>
           </w:tcPr>
           <w:p>
             <w:pPr>
@@ -5750,7 +4945,7 @@
         </w:tc>
         <w:tc>
           <w:tcPr>
-            <w:tcW w:type="dxa" w:w="5832"/>
+            <w:tcW w:type="dxa" w:w="5616"/>
           </w:tcPr>
           <w:p>
             <w:pPr>
@@ -5794,6 +4989,20 @@
           <w:color w:val="111827"/>
           <w:sz w:val="20"/>
         </w:rPr>
+        <w:t>The Practical Performance asks learners to document their own observations and reflections from the activities they completed during the day, so it is grounded in what each learner actually did in class and aligned to the slides and labs.</w:t>
+      </w:r>
+    </w:p>
+    <w:p>
+      <w:pPr>
+        <w:spacing w:after="120"/>
+      </w:pPr>
+      <w:r>
+        <w:rPr>
+          <w:rFonts w:ascii="Arial" w:hAnsi="Arial"/>
+          <w:b w:val="0"/>
+          <w:color w:val="111827"/>
+          <w:sz w:val="20"/>
+        </w:rPr>
         <w:t>Funding eligibility requires a minimum 75% attendance recorded through SSG digital attendance, an assessment outcome of Competent, and completion of the TRAQOM survey.</w:t>
       </w:r>
     </w:p>
@@ -5860,7 +5069,7 @@
         <w:color w:val="555B66"/>
         <w:sz w:val="15"/>
       </w:rPr>
-      <w:t>This material belongs to Tertiary Infotech Pte Ltd (UEN: 20120096W). All Rights Reserved.  ·  www.tertiarycourses.com.sg</w:t>
+      <w:t>This material belongs to Tertiary Infotech Pte Ltd (UEN: 201200696W). All Rights Reserved.  ·  www.tertiarycourses.com.sg</w:t>
     </w:r>
   </w:p>
 </w:ftr>

</xml_diff>

<commit_message>
feat: v4.1 deck visuals — real 2026 Steinberger photo, per-type transitions
- Replace the Steinberger GitHub avatar with his official 2026 AI Engineer
  World's Fair stage photo; retitle slide to 'Peter Steinberger in 2026'.
- Add generated teaching visuals (fashion, context/harness/prompt engineering,
  Hermes, multi-agent).
- Vary slide transitions by slide type (fast fade for content, push for
  section/break dividers) across all 124 slides; keep the slide-28 YouTube
  online-video embed.
- Bump LG/LP/assessment to v4.1 with a version-control row; refresh cover
  screenshot.

Co-Authored-By: Claude Opus 4.8 <noreply@anthropic.com>
</commit_message>
<xml_diff>
--- a/courseweare/Lesson Plan - TGS-2025060473 - AI Security for Autonomous AI Agents.docx
+++ b/courseweare/Lesson Plan - TGS-2025060473 - AI Security for Autonomous AI Agents.docx
@@ -179,20 +179,12 @@
           <w:color w:val="1F6FEB"/>
           <w:sz w:val="24"/>
         </w:rPr>
-        <w:t>Version 4.0</w:t>
+        <w:t>Version 4.1</w:t>
       </w:r>
     </w:p>
     <w:p>
       <w:r>
         <w:br w:type="page"/>
-      </w:r>
-    </w:p>
-    <w:p>
-      <w:pPr>
-        <w:pStyle w:val="Heading1"/>
-      </w:pPr>
-      <w:r>
-        <w:t>Document Version Control Record</w:t>
       </w:r>
     </w:p>
     <w:p>
@@ -330,7 +322,7 @@
               <w:rPr>
                 <w:sz w:val="19"/>
               </w:rPr>
-              <w:t>Initial release — Core Principles and Ethical Challenges in Generative AI.</w:t>
+              <w:t>Initial release.</w:t>
             </w:r>
           </w:p>
         </w:tc>
@@ -388,7 +380,7 @@
               <w:rPr>
                 <w:sz w:val="19"/>
               </w:rPr>
-              <w:t>Retitled and rebuilt for generative-AI and autonomous-agent security; five activities and revised assessments added. TSC K/A text unchanged.</w:t>
+              <w:t>Retitled and rebuilt for autonomous-agent security; five activities added. TSC K/A text unchanged.</w:t>
             </w:r>
           </w:p>
         </w:tc>
@@ -446,7 +438,7 @@
               <w:rPr>
                 <w:sz w:val="19"/>
               </w:rPr>
-              <w:t>Added prompt-injection practice, PDPA and organisational checklists, human approval, skill/plugin controls and enhanced visuals. TSC K/A text unchanged.</w:t>
+              <w:t>Added prompt-injection, PDPA, guardrail, approval, skill/plugin and visual coverage. TSC K/A text unchanged.</w:t>
             </w:r>
           </w:p>
         </w:tc>
@@ -504,7 +496,7 @@
               <w:rPr>
                 <w:sz w:val="19"/>
               </w:rPr>
-              <w:t>Rebuilt as a 207-slide evidence-grounded progression from AI history to product boundaries, cases, controls and governance. Activities reordered; unverified claims removed. TSC K/A text unchanged.</w:t>
+              <w:t>Evidence-grounded 207-slide rebuild with product boundaries, cases, controls, activities and source register. TSC K/A text unchanged.</w:t>
             </w:r>
           </w:p>
         </w:tc>
@@ -562,7 +554,65 @@
               <w:rPr>
                 <w:sz w:val="19"/>
               </w:rPr>
-              <w:t>Rebuilt as a 1-day (8-hour) course with three topics mapped to LO1/LO2/LO3: generative and agentic AI concepts, prompt engineering on the Hermes agent with MiniMax, and AI-agent governance and security. No-code activities on ready-made websites and chatbots; Practical assessment is reflection on the activities. TSC K/A text unchanged.</w:t>
+              <w:t>Rebuilt as a 1-day course with three LO-aligned topics, eight no-code activities and a reflection-based practical assessment. TSC K/A text unchanged.</w:t>
+            </w:r>
+          </w:p>
+        </w:tc>
+        <w:tc>
+          <w:tcPr>
+            <w:tcW w:type="dxa" w:w="2160"/>
+          </w:tcPr>
+          <w:p>
+            <w:r/>
+            <w:r>
+              <w:rPr>
+                <w:sz w:val="19"/>
+              </w:rPr>
+              <w:t>Dr Alfred Ang</w:t>
+            </w:r>
+          </w:p>
+        </w:tc>
+      </w:tr>
+      <w:tr>
+        <w:tc>
+          <w:tcPr>
+            <w:tcW w:type="dxa" w:w="2160"/>
+          </w:tcPr>
+          <w:p>
+            <w:r/>
+            <w:r>
+              <w:rPr>
+                <w:sz w:val="19"/>
+              </w:rPr>
+              <w:t>4.1</w:t>
+            </w:r>
+          </w:p>
+        </w:tc>
+        <w:tc>
+          <w:tcPr>
+            <w:tcW w:type="dxa" w:w="2160"/>
+          </w:tcPr>
+          <w:p>
+            <w:r/>
+            <w:r>
+              <w:rPr>
+                <w:sz w:val="19"/>
+              </w:rPr>
+              <w:t>25 August 2026</w:t>
+            </w:r>
+          </w:p>
+        </w:tc>
+        <w:tc>
+          <w:tcPr>
+            <w:tcW w:type="dxa" w:w="2160"/>
+          </w:tcPr>
+          <w:p>
+            <w:r/>
+            <w:r>
+              <w:rPr>
+                <w:sz w:val="19"/>
+              </w:rPr>
+              <w:t>Refreshed trainer visuals and embedded the YouTube Online Video; scope, timing and TSC K/A text unchanged.</w:t>
             </w:r>
           </w:p>
         </w:tc>
@@ -589,28 +639,6 @@
     </w:p>
     <w:p>
       <w:pPr>
-        <w:pStyle w:val="Heading1"/>
-      </w:pPr>
-      <w:r>
-        <w:t>Table of Contents</w:t>
-      </w:r>
-    </w:p>
-    <w:p>
-      <w:pPr>
-        <w:spacing w:after="120"/>
-      </w:pPr>
-      <w:r>
-        <w:rPr>
-          <w:rFonts w:ascii="Arial" w:hAnsi="Arial"/>
-          <w:b w:val="0"/>
-          <w:color w:val="555B66"/>
-          <w:sz w:val="19"/>
-        </w:rPr>
-        <w:t>Right-click and choose 'Update Field' to refresh page numbers.</w:t>
-      </w:r>
-    </w:p>
-    <w:p>
-      <w:pPr>
         <w:spacing w:after="120"/>
       </w:pPr>
       <w:r>
@@ -623,17 +651,198 @@
       </w:r>
     </w:p>
     <w:p>
+      <w:pPr>
+        <w:tabs>
+          <w:tab w:pos="9072" w:val="right" w:leader="dot"/>
+        </w:tabs>
+        <w:spacing w:after="60"/>
+      </w:pPr>
       <w:r>
-        <w:fldChar w:fldCharType="begin"/>
-        <w:instrText xml:space="preserve">TOC \o "1-3" \h \z \u</w:instrText>
-        <w:fldChar w:fldCharType="separate"/>
-        <w:t>Right-click and choose “Update Field”, or press F9, to build the table of contents.</w:t>
-        <w:fldChar w:fldCharType="end"/>
+        <w:rPr>
+          <w:rFonts w:ascii="Arial" w:hAnsi="Arial"/>
+          <w:b/>
+          <w:color w:val="333333"/>
+          <w:sz w:val="22"/>
+        </w:rPr>
+        <w:t>1. Course Overview</w:t>
+        <w:tab/>
+        <w:t>4</w:t>
       </w:r>
     </w:p>
     <w:p>
+      <w:pPr>
+        <w:tabs>
+          <w:tab w:pos="9072" w:val="right" w:leader="dot"/>
+        </w:tabs>
+        <w:spacing w:after="60"/>
+        <w:ind w:left="432"/>
+      </w:pPr>
       <w:r>
-        <w:br w:type="page"/>
+        <w:rPr>
+          <w:rFonts w:ascii="Arial" w:hAnsi="Arial"/>
+          <w:b w:val="0"/>
+          <w:color w:val="333333"/>
+          <w:sz w:val="21"/>
+        </w:rPr>
+        <w:t>Skills Framework Alignment</w:t>
+        <w:tab/>
+        <w:t>4</w:t>
+      </w:r>
+    </w:p>
+    <w:p>
+      <w:pPr>
+        <w:tabs>
+          <w:tab w:pos="9072" w:val="right" w:leader="dot"/>
+        </w:tabs>
+        <w:spacing w:after="60"/>
+        <w:ind w:left="432"/>
+      </w:pPr>
+      <w:r>
+        <w:rPr>
+          <w:rFonts w:ascii="Arial" w:hAnsi="Arial"/>
+          <w:b w:val="0"/>
+          <w:color w:val="333333"/>
+          <w:sz w:val="21"/>
+        </w:rPr>
+        <w:t>Learning Outcomes</w:t>
+        <w:tab/>
+        <w:t>4</w:t>
+      </w:r>
+    </w:p>
+    <w:p>
+      <w:pPr>
+        <w:tabs>
+          <w:tab w:pos="9072" w:val="right" w:leader="dot"/>
+        </w:tabs>
+        <w:spacing w:after="60"/>
+        <w:ind w:left="432"/>
+      </w:pPr>
+      <w:r>
+        <w:rPr>
+          <w:rFonts w:ascii="Arial" w:hAnsi="Arial"/>
+          <w:b w:val="0"/>
+          <w:color w:val="333333"/>
+          <w:sz w:val="21"/>
+        </w:rPr>
+        <w:t>Knowledge Statements (assessed by the Written Assessment)</w:t>
+        <w:tab/>
+        <w:t>5</w:t>
+      </w:r>
+    </w:p>
+    <w:p>
+      <w:pPr>
+        <w:tabs>
+          <w:tab w:pos="9072" w:val="right" w:leader="dot"/>
+        </w:tabs>
+        <w:spacing w:after="60"/>
+        <w:ind w:left="432"/>
+      </w:pPr>
+      <w:r>
+        <w:rPr>
+          <w:rFonts w:ascii="Arial" w:hAnsi="Arial"/>
+          <w:b w:val="0"/>
+          <w:color w:val="333333"/>
+          <w:sz w:val="21"/>
+        </w:rPr>
+        <w:t>Ability Statements (assessed by the Practical Performance)</w:t>
+        <w:tab/>
+        <w:t>5</w:t>
+      </w:r>
+    </w:p>
+    <w:p>
+      <w:pPr>
+        <w:tabs>
+          <w:tab w:pos="9072" w:val="right" w:leader="dot"/>
+        </w:tabs>
+        <w:spacing w:after="60"/>
+      </w:pPr>
+      <w:r>
+        <w:rPr>
+          <w:rFonts w:ascii="Arial" w:hAnsi="Arial"/>
+          <w:b/>
+          <w:color w:val="333333"/>
+          <w:sz w:val="22"/>
+        </w:rPr>
+        <w:t>2. Course Schedule</w:t>
+        <w:tab/>
+        <w:t>6</w:t>
+      </w:r>
+    </w:p>
+    <w:p>
+      <w:pPr>
+        <w:tabs>
+          <w:tab w:pos="9072" w:val="right" w:leader="dot"/>
+        </w:tabs>
+        <w:spacing w:after="60"/>
+        <w:ind w:left="432"/>
+      </w:pPr>
+      <w:r>
+        <w:rPr>
+          <w:rFonts w:ascii="Arial" w:hAnsi="Arial"/>
+          <w:b w:val="0"/>
+          <w:color w:val="333333"/>
+          <w:sz w:val="21"/>
+        </w:rPr>
+        <w:t>One-Day Schedule (Topics 1–3)</w:t>
+        <w:tab/>
+        <w:t>6</w:t>
+      </w:r>
+    </w:p>
+    <w:p>
+      <w:pPr>
+        <w:tabs>
+          <w:tab w:pos="9072" w:val="right" w:leader="dot"/>
+        </w:tabs>
+        <w:spacing w:after="60"/>
+      </w:pPr>
+      <w:r>
+        <w:rPr>
+          <w:rFonts w:ascii="Arial" w:hAnsi="Arial"/>
+          <w:b/>
+          <w:color w:val="333333"/>
+          <w:sz w:val="22"/>
+        </w:rPr>
+        <w:t>3. Activities</w:t>
+        <w:tab/>
+        <w:t>8</w:t>
+      </w:r>
+    </w:p>
+    <w:p>
+      <w:pPr>
+        <w:tabs>
+          <w:tab w:pos="9072" w:val="right" w:leader="dot"/>
+        </w:tabs>
+        <w:spacing w:after="60"/>
+      </w:pPr>
+      <w:r>
+        <w:rPr>
+          <w:rFonts w:ascii="Arial" w:hAnsi="Arial"/>
+          <w:b/>
+          <w:color w:val="333333"/>
+          <w:sz w:val="22"/>
+        </w:rPr>
+        <w:t>4. Tools and Resources</w:t>
+        <w:tab/>
+        <w:t>9</w:t>
+      </w:r>
+    </w:p>
+    <w:p>
+      <w:pPr>
+        <w:tabs>
+          <w:tab w:pos="9072" w:val="right" w:leader="dot"/>
+        </w:tabs>
+        <w:spacing w:after="60"/>
+      </w:pPr>
+      <w:r>
+        <w:rPr>
+          <w:rFonts w:ascii="Arial" w:hAnsi="Arial"/>
+          <w:b/>
+          <w:color w:val="333333"/>
+          <w:sz w:val="22"/>
+        </w:rPr>
+        <w:t>5. Assessment</w:t>
+        <w:tab/>
+        <w:t>10</w:t>
       </w:r>
     </w:p>
     <w:p>

</xml_diff>

<commit_message>
feat: add coding-harness and latest-AI-agents reference slides (v4.2)
- New slide 'The Coding Harnesses' — Claude Code, Codex and DeepSeek Harness
  with what each is and its official repo link.
- New slide 'The Latest AI Agents (2025-2026)' — OpenClaw, Hermes, Prime Agent,
  OpenWorker and QM (Quartermaster), each with a one-line description and link
  (all links web-verified).
- Broaden the AI-agents section title; deck now 126 slides.
- Bump deck/LG/LP/assessment to v4.2 with version-control rows.

Co-Authored-By: Claude Opus 4.8 <noreply@anthropic.com>
</commit_message>
<xml_diff>
--- a/courseweare/Lesson Plan - TGS-2025060473 - AI Security for Autonomous AI Agents.docx
+++ b/courseweare/Lesson Plan - TGS-2025060473 - AI Security for Autonomous AI Agents.docx
@@ -179,7 +179,7 @@
           <w:color w:val="1F6FEB"/>
           <w:sz w:val="24"/>
         </w:rPr>
-        <w:t>Version 4.1</w:t>
+        <w:t>Version 4.2</w:t>
       </w:r>
     </w:p>
     <w:p>
@@ -631,6 +631,64 @@
           </w:p>
         </w:tc>
       </w:tr>
+      <w:tr>
+        <w:tc>
+          <w:tcPr>
+            <w:tcW w:type="dxa" w:w="2160"/>
+          </w:tcPr>
+          <w:p>
+            <w:r/>
+            <w:r>
+              <w:rPr>
+                <w:sz w:val="19"/>
+              </w:rPr>
+              <w:t>4.2</w:t>
+            </w:r>
+          </w:p>
+        </w:tc>
+        <w:tc>
+          <w:tcPr>
+            <w:tcW w:type="dxa" w:w="2160"/>
+          </w:tcPr>
+          <w:p>
+            <w:r/>
+            <w:r>
+              <w:rPr>
+                <w:sz w:val="19"/>
+              </w:rPr>
+              <w:t>25 August 2026</w:t>
+            </w:r>
+          </w:p>
+        </w:tc>
+        <w:tc>
+          <w:tcPr>
+            <w:tcW w:type="dxa" w:w="2160"/>
+          </w:tcPr>
+          <w:p>
+            <w:r/>
+            <w:r>
+              <w:rPr>
+                <w:sz w:val="19"/>
+              </w:rPr>
+              <w:t>Added coding-harness and latest-AI-agents reference slides to the deck (Claude Code, Codex, DeepSeek Harness; OpenClaw, Hermes, Prime Agent, OpenWorker, QM). Schedule and TSC K/A text unchanged.</w:t>
+            </w:r>
+          </w:p>
+        </w:tc>
+        <w:tc>
+          <w:tcPr>
+            <w:tcW w:type="dxa" w:w="2160"/>
+          </w:tcPr>
+          <w:p>
+            <w:r/>
+            <w:r>
+              <w:rPr>
+                <w:sz w:val="19"/>
+              </w:rPr>
+              <w:t>Dr Alfred Ang</w:t>
+            </w:r>
+          </w:p>
+        </w:tc>
+      </w:tr>
     </w:tbl>
     <w:p>
       <w:r>
@@ -651,198 +709,12 @@
       </w:r>
     </w:p>
     <w:p>
-      <w:pPr>
-        <w:tabs>
-          <w:tab w:pos="9072" w:val="right" w:leader="dot"/>
-        </w:tabs>
-        <w:spacing w:after="60"/>
-      </w:pPr>
       <w:r>
-        <w:rPr>
-          <w:rFonts w:ascii="Arial" w:hAnsi="Arial"/>
-          <w:b/>
-          <w:color w:val="333333"/>
-          <w:sz w:val="22"/>
-        </w:rPr>
-        <w:t>1. Course Overview</w:t>
-        <w:tab/>
-        <w:t>4</w:t>
-      </w:r>
-    </w:p>
-    <w:p>
-      <w:pPr>
-        <w:tabs>
-          <w:tab w:pos="9072" w:val="right" w:leader="dot"/>
-        </w:tabs>
-        <w:spacing w:after="60"/>
-        <w:ind w:left="432"/>
-      </w:pPr>
-      <w:r>
-        <w:rPr>
-          <w:rFonts w:ascii="Arial" w:hAnsi="Arial"/>
-          <w:b w:val="0"/>
-          <w:color w:val="333333"/>
-          <w:sz w:val="21"/>
-        </w:rPr>
-        <w:t>Skills Framework Alignment</w:t>
-        <w:tab/>
-        <w:t>4</w:t>
-      </w:r>
-    </w:p>
-    <w:p>
-      <w:pPr>
-        <w:tabs>
-          <w:tab w:pos="9072" w:val="right" w:leader="dot"/>
-        </w:tabs>
-        <w:spacing w:after="60"/>
-        <w:ind w:left="432"/>
-      </w:pPr>
-      <w:r>
-        <w:rPr>
-          <w:rFonts w:ascii="Arial" w:hAnsi="Arial"/>
-          <w:b w:val="0"/>
-          <w:color w:val="333333"/>
-          <w:sz w:val="21"/>
-        </w:rPr>
-        <w:t>Learning Outcomes</w:t>
-        <w:tab/>
-        <w:t>4</w:t>
-      </w:r>
-    </w:p>
-    <w:p>
-      <w:pPr>
-        <w:tabs>
-          <w:tab w:pos="9072" w:val="right" w:leader="dot"/>
-        </w:tabs>
-        <w:spacing w:after="60"/>
-        <w:ind w:left="432"/>
-      </w:pPr>
-      <w:r>
-        <w:rPr>
-          <w:rFonts w:ascii="Arial" w:hAnsi="Arial"/>
-          <w:b w:val="0"/>
-          <w:color w:val="333333"/>
-          <w:sz w:val="21"/>
-        </w:rPr>
-        <w:t>Knowledge Statements (assessed by the Written Assessment)</w:t>
-        <w:tab/>
-        <w:t>5</w:t>
-      </w:r>
-    </w:p>
-    <w:p>
-      <w:pPr>
-        <w:tabs>
-          <w:tab w:pos="9072" w:val="right" w:leader="dot"/>
-        </w:tabs>
-        <w:spacing w:after="60"/>
-        <w:ind w:left="432"/>
-      </w:pPr>
-      <w:r>
-        <w:rPr>
-          <w:rFonts w:ascii="Arial" w:hAnsi="Arial"/>
-          <w:b w:val="0"/>
-          <w:color w:val="333333"/>
-          <w:sz w:val="21"/>
-        </w:rPr>
-        <w:t>Ability Statements (assessed by the Practical Performance)</w:t>
-        <w:tab/>
-        <w:t>5</w:t>
-      </w:r>
-    </w:p>
-    <w:p>
-      <w:pPr>
-        <w:tabs>
-          <w:tab w:pos="9072" w:val="right" w:leader="dot"/>
-        </w:tabs>
-        <w:spacing w:after="60"/>
-      </w:pPr>
-      <w:r>
-        <w:rPr>
-          <w:rFonts w:ascii="Arial" w:hAnsi="Arial"/>
-          <w:b/>
-          <w:color w:val="333333"/>
-          <w:sz w:val="22"/>
-        </w:rPr>
-        <w:t>2. Course Schedule</w:t>
-        <w:tab/>
-        <w:t>6</w:t>
-      </w:r>
-    </w:p>
-    <w:p>
-      <w:pPr>
-        <w:tabs>
-          <w:tab w:pos="9072" w:val="right" w:leader="dot"/>
-        </w:tabs>
-        <w:spacing w:after="60"/>
-        <w:ind w:left="432"/>
-      </w:pPr>
-      <w:r>
-        <w:rPr>
-          <w:rFonts w:ascii="Arial" w:hAnsi="Arial"/>
-          <w:b w:val="0"/>
-          <w:color w:val="333333"/>
-          <w:sz w:val="21"/>
-        </w:rPr>
-        <w:t>One-Day Schedule (Topics 1–3)</w:t>
-        <w:tab/>
-        <w:t>6</w:t>
-      </w:r>
-    </w:p>
-    <w:p>
-      <w:pPr>
-        <w:tabs>
-          <w:tab w:pos="9072" w:val="right" w:leader="dot"/>
-        </w:tabs>
-        <w:spacing w:after="60"/>
-      </w:pPr>
-      <w:r>
-        <w:rPr>
-          <w:rFonts w:ascii="Arial" w:hAnsi="Arial"/>
-          <w:b/>
-          <w:color w:val="333333"/>
-          <w:sz w:val="22"/>
-        </w:rPr>
-        <w:t>3. Activities</w:t>
-        <w:tab/>
-        <w:t>8</w:t>
-      </w:r>
-    </w:p>
-    <w:p>
-      <w:pPr>
-        <w:tabs>
-          <w:tab w:pos="9072" w:val="right" w:leader="dot"/>
-        </w:tabs>
-        <w:spacing w:after="60"/>
-      </w:pPr>
-      <w:r>
-        <w:rPr>
-          <w:rFonts w:ascii="Arial" w:hAnsi="Arial"/>
-          <w:b/>
-          <w:color w:val="333333"/>
-          <w:sz w:val="22"/>
-        </w:rPr>
-        <w:t>4. Tools and Resources</w:t>
-        <w:tab/>
-        <w:t>9</w:t>
-      </w:r>
-    </w:p>
-    <w:p>
-      <w:pPr>
-        <w:tabs>
-          <w:tab w:pos="9072" w:val="right" w:leader="dot"/>
-        </w:tabs>
-        <w:spacing w:after="60"/>
-      </w:pPr>
-      <w:r>
-        <w:rPr>
-          <w:rFonts w:ascii="Arial" w:hAnsi="Arial"/>
-          <w:b/>
-          <w:color w:val="333333"/>
-          <w:sz w:val="22"/>
-        </w:rPr>
-        <w:t>5. Assessment</w:t>
-        <w:tab/>
-        <w:t>10</w:t>
+        <w:fldChar w:fldCharType="begin"/>
+        <w:instrText xml:space="preserve">TOC \o "1-3" \h \z \u</w:instrText>
+        <w:fldChar w:fldCharType="separate"/>
+        <w:t>Right-click and choose “Update Field”, or press F9, to build the table of contents.</w:t>
+        <w:fldChar w:fldCharType="end"/>
       </w:r>
     </w:p>
     <w:p>

</xml_diff>